<commit_message>
fix(template): section 1.1 always starts on page 2
</commit_message>
<xml_diff>
--- a/templates/template-standard-v2.docx
+++ b/templates/template-standard-v2.docx
@@ -41,12 +41,12 @@
               <w:keepNext w:val="false"/>
               <w:keepLines w:val="false"/>
               <w:widowControl w:val="false"/>
-              <w:spacing w:after="57" w:before="0" w:line="384"/>
+              <w:spacing w:after="57" w:before="0" w:line="360"/>
               <w:jc w:val="left"/>
             </w:pPr>
             <w:r>
               <w:rPr>
-                <w:rFonts w:ascii="Georgia" w:cs="Georgia" w:eastAsia="Georgia" w:hAnsi="Georgia"/>
+                <w:rFonts w:ascii="Arial" w:cs="Arial" w:eastAsia="Arial" w:hAnsi="Arial"/>
                 <w:b w:val="false"/>
                 <w:bCs w:val="false"/>
                 <w:i w:val="false"/>
@@ -59,7 +59,7 @@
             </w:r>
             <w:r>
               <w:rPr>
-                <w:rFonts w:ascii="Georgia" w:cs="Georgia" w:eastAsia="Georgia" w:hAnsi="Georgia"/>
+                <w:rFonts w:ascii="Arial" w:cs="Arial" w:eastAsia="Arial" w:hAnsi="Arial"/>
                 <w:b/>
                 <w:bCs/>
                 <w:i w:val="false"/>
@@ -72,7 +72,7 @@
             </w:r>
             <w:r>
               <w:rPr>
-                <w:rFonts w:ascii="Georgia" w:cs="Georgia" w:eastAsia="Georgia" w:hAnsi="Georgia"/>
+                <w:rFonts w:ascii="Arial" w:cs="Arial" w:eastAsia="Arial" w:hAnsi="Arial"/>
                 <w:b w:val="false"/>
                 <w:bCs w:val="false"/>
                 <w:i w:val="false"/>
@@ -89,12 +89,12 @@
               <w:keepNext w:val="false"/>
               <w:keepLines w:val="false"/>
               <w:widowControl w:val="false"/>
-              <w:spacing w:after="57" w:before="0" w:line="384"/>
+              <w:spacing w:after="57" w:before="0" w:line="360"/>
               <w:jc w:val="left"/>
             </w:pPr>
             <w:r>
               <w:rPr>
-                <w:rFonts w:ascii="Georgia" w:cs="Georgia" w:eastAsia="Georgia" w:hAnsi="Georgia"/>
+                <w:rFonts w:ascii="Arial" w:cs="Arial" w:eastAsia="Arial" w:hAnsi="Arial"/>
                 <w:b w:val="false"/>
                 <w:bCs w:val="false"/>
                 <w:i w:val="false"/>
@@ -111,12 +111,12 @@
               <w:keepNext w:val="false"/>
               <w:keepLines w:val="false"/>
               <w:widowControl w:val="false"/>
-              <w:spacing w:after="57" w:before="0" w:line="384"/>
+              <w:spacing w:after="57" w:before="0" w:line="360"/>
               <w:jc w:val="left"/>
             </w:pPr>
             <w:r>
               <w:rPr>
-                <w:rFonts w:ascii="Georgia" w:cs="Georgia" w:eastAsia="Georgia" w:hAnsi="Georgia"/>
+                <w:rFonts w:ascii="Arial" w:cs="Arial" w:eastAsia="Arial" w:hAnsi="Arial"/>
                 <w:b w:val="false"/>
                 <w:bCs w:val="false"/>
                 <w:i w:val="false"/>
@@ -133,12 +133,12 @@
               <w:keepNext w:val="false"/>
               <w:keepLines w:val="false"/>
               <w:widowControl w:val="false"/>
-              <w:spacing w:after="0" w:before="0" w:line="384"/>
+              <w:spacing w:after="0" w:before="0" w:line="360"/>
               <w:jc w:val="left"/>
             </w:pPr>
             <w:r>
               <w:rPr>
-                <w:rFonts w:ascii="Georgia" w:cs="Georgia" w:eastAsia="Georgia" w:hAnsi="Georgia"/>
+                <w:rFonts w:ascii="Arial" w:cs="Arial" w:eastAsia="Arial" w:hAnsi="Arial"/>
                 <w:b w:val="false"/>
                 <w:bCs w:val="false"/>
                 <w:i w:val="false"/>
@@ -178,7 +178,7 @@
             </w:pPr>
             <w:r>
               <w:rPr>
-                <w:rFonts w:ascii="Calibri" w:cs="Calibri" w:eastAsia="Calibri" w:hAnsi="Calibri"/>
+                <w:rFonts w:ascii="Arial" w:cs="Arial" w:eastAsia="Arial" w:hAnsi="Arial"/>
                 <w:b w:val="false"/>
                 <w:bCs w:val="false"/>
                 <w:i w:val="false"/>
@@ -200,7 +200,7 @@
             </w:pPr>
             <w:r>
               <w:rPr>
-                <w:rFonts w:ascii="Calibri" w:cs="Calibri" w:eastAsia="Calibri" w:hAnsi="Calibri"/>
+                <w:rFonts w:ascii="Arial" w:cs="Arial" w:eastAsia="Arial" w:hAnsi="Arial"/>
                 <w:b/>
                 <w:bCs/>
                 <w:i w:val="false"/>
@@ -225,7 +225,7 @@
       </w:pPr>
       <w:r>
         <w:rPr>
-          <w:rFonts w:ascii="Georgia" w:cs="Georgia" w:eastAsia="Georgia" w:hAnsi="Georgia"/>
+          <w:rFonts w:ascii="Arial" w:cs="Arial" w:eastAsia="Arial" w:hAnsi="Arial"/>
           <w:b w:val="false"/>
           <w:bCs w:val="false"/>
           <w:i w:val="false"/>
@@ -247,7 +247,7 @@
       </w:pPr>
       <w:r>
         <w:rPr>
-          <w:rFonts w:ascii="Calibri" w:cs="Calibri" w:eastAsia="Calibri" w:hAnsi="Calibri"/>
+          <w:rFonts w:ascii="Arial" w:cs="Arial" w:eastAsia="Arial" w:hAnsi="Arial"/>
           <w:b/>
           <w:bCs/>
           <w:i w:val="false"/>
@@ -269,7 +269,7 @@
       </w:pPr>
       <w:r>
         <w:rPr>
-          <w:rFonts w:ascii="Book Antiqua" w:cs="Book Antiqua" w:eastAsia="Book Antiqua" w:hAnsi="Book Antiqua"/>
+          <w:rFonts w:ascii="Arial" w:cs="Arial" w:eastAsia="Arial" w:hAnsi="Arial"/>
           <w:b w:val="false"/>
           <w:bCs w:val="false"/>
           <w:i/>
@@ -291,7 +291,7 @@
       </w:pPr>
       <w:r>
         <w:rPr>
-          <w:rFonts w:ascii="Book Antiqua" w:cs="Book Antiqua" w:eastAsia="Book Antiqua" w:hAnsi="Book Antiqua"/>
+          <w:rFonts w:ascii="Arial" w:cs="Arial" w:eastAsia="Arial" w:hAnsi="Arial"/>
           <w:b w:val="false"/>
           <w:bCs w:val="false"/>
           <w:i/>
@@ -313,7 +313,7 @@
       </w:pPr>
       <w:r>
         <w:rPr>
-          <w:rFonts w:ascii="Georgia" w:cs="Georgia" w:eastAsia="Georgia" w:hAnsi="Georgia"/>
+          <w:rFonts w:ascii="Arial" w:cs="Arial" w:eastAsia="Arial" w:hAnsi="Arial"/>
           <w:b w:val="false"/>
           <w:bCs w:val="false"/>
           <w:i w:val="false"/>
@@ -369,7 +369,7 @@
             </w:pPr>
             <w:r>
               <w:rPr>
-                <w:rFonts w:ascii="Calibri" w:cs="Calibri" w:eastAsia="Calibri" w:hAnsi="Calibri"/>
+                <w:rFonts w:ascii="Arial" w:cs="Arial" w:eastAsia="Arial" w:hAnsi="Arial"/>
                 <w:b/>
                 <w:bCs/>
                 <w:i w:val="false"/>
@@ -391,7 +391,7 @@
             </w:pPr>
             <w:r>
               <w:rPr>
-                <w:rFonts w:ascii="Georgia" w:cs="Georgia" w:eastAsia="Georgia" w:hAnsi="Georgia"/>
+                <w:rFonts w:ascii="Arial" w:cs="Arial" w:eastAsia="Arial" w:hAnsi="Arial"/>
                 <w:b w:val="false"/>
                 <w:bCs w:val="false"/>
                 <w:i w:val="false"/>
@@ -426,12 +426,12 @@
               <w:keepNext w:val="false"/>
               <w:keepLines w:val="false"/>
               <w:widowControl w:val="false"/>
-              <w:spacing w:after="227" w:before="0" w:line="384"/>
+              <w:spacing w:after="227" w:before="0" w:line="360"/>
               <w:jc w:val="left"/>
             </w:pPr>
             <w:r>
               <w:rPr>
-                <w:rFonts w:ascii="Georgia" w:cs="Georgia" w:eastAsia="Georgia" w:hAnsi="Georgia"/>
+                <w:rFonts w:ascii="Arial" w:cs="Arial" w:eastAsia="Arial" w:hAnsi="Arial"/>
                 <w:b w:val="false"/>
                 <w:bCs w:val="false"/>
                 <w:i w:val="false"/>
@@ -445,15 +445,16 @@
           </w:p>
           <w:p>
             <w:pPr>
+              <w:pStyle w:val="CorpsBTH"/>
               <w:keepNext w:val="false"/>
               <w:keepLines w:val="false"/>
               <w:widowControl/>
-              <w:spacing w:after="227" w:before="0" w:line="408"/>
+              <w:spacing w:after="227" w:before="0" w:line="360"/>
               <w:jc w:val="both"/>
             </w:pPr>
             <w:r>
               <w:rPr>
-                <w:rFonts w:ascii="Georgia" w:cs="Georgia" w:eastAsia="Georgia" w:hAnsi="Georgia"/>
+                <w:rFonts w:ascii="Arial" w:cs="Arial" w:eastAsia="Arial" w:hAnsi="Arial"/>
                 <w:b w:val="false"/>
                 <w:bCs w:val="false"/>
                 <w:i w:val="false"/>
@@ -467,17 +468,18 @@
           </w:p>
           <w:p>
             <w:pPr>
+              <w:pStyle w:val="Titre1BTH"/>
               <w:keepNext/>
               <w:keepLines/>
               <w:widowControl w:val="false"/>
               <w:pBdr>
                 <w:bottom w:val="single" w:color="C9A96E" w:sz="6" w:space="6"/>
               </w:pBdr>
-              <w:spacing w:after="227" w:before="397" w:line="288"/>
-            </w:pPr>
-            <w:r>
-              <w:rPr>
-                <w:rFonts w:ascii="Calibri" w:cs="Calibri" w:eastAsia="Calibri" w:hAnsi="Calibri"/>
+              <w:spacing w:after="227" w:before="567" w:line="288"/>
+            </w:pPr>
+            <w:r>
+              <w:rPr>
+                <w:rFonts w:ascii="Arial" w:cs="Arial" w:eastAsia="Arial" w:hAnsi="Arial"/>
                 <w:b/>
                 <w:bCs/>
                 <w:i w:val="false"/>
@@ -490,7 +492,7 @@
             </w:r>
             <w:r>
               <w:rPr>
-                <w:rFonts w:ascii="Book Antiqua" w:cs="Book Antiqua" w:eastAsia="Book Antiqua" w:hAnsi="Book Antiqua"/>
+                <w:rFonts w:ascii="Arial" w:cs="Arial" w:eastAsia="Arial" w:hAnsi="Arial"/>
                 <w:b/>
                 <w:bCs/>
                 <w:i w:val="false"/>
@@ -504,13 +506,16 @@
           </w:p>
           <w:p>
             <w:pPr>
+              <w:pStyle w:val="CorpsBTH"/>
+              <w:keepNext w:val="false"/>
+              <w:keepLines w:val="false"/>
               <w:widowControl/>
-              <w:spacing w:after="227" w:before="0" w:line="408"/>
+              <w:spacing w:after="227" w:before="0" w:line="360"/>
               <w:jc w:val="both"/>
             </w:pPr>
             <w:r>
               <w:rPr>
-                <w:rFonts w:ascii="Georgia" w:cs="Georgia" w:eastAsia="Georgia" w:hAnsi="Georgia"/>
+                <w:rFonts w:ascii="Arial" w:cs="Arial" w:eastAsia="Arial" w:hAnsi="Arial"/>
                 <w:b w:val="false"/>
                 <w:bCs w:val="false"/>
                 <w:i w:val="false"/>
@@ -524,13 +529,16 @@
           </w:p>
           <w:p>
             <w:pPr>
+              <w:pStyle w:val="CorpsBTH"/>
+              <w:keepNext w:val="false"/>
+              <w:keepLines w:val="false"/>
               <w:widowControl/>
-              <w:spacing w:after="227" w:before="0" w:line="408"/>
+              <w:spacing w:after="227" w:before="0" w:line="360"/>
               <w:jc w:val="both"/>
             </w:pPr>
             <w:r>
               <w:rPr>
-                <w:rFonts w:ascii="Georgia" w:cs="Georgia" w:eastAsia="Georgia" w:hAnsi="Georgia"/>
+                <w:rFonts w:ascii="Arial" w:cs="Arial" w:eastAsia="Arial" w:hAnsi="Arial"/>
                 <w:b w:val="false"/>
                 <w:bCs w:val="false"/>
                 <w:i w:val="false"/>
@@ -577,13 +585,14 @@
                 </w:tcPr>
                 <w:p>
                   <w:pPr>
+                    <w:pStyle w:val="CalloutBTH"/>
                     <w:widowControl/>
-                    <w:spacing w:after="0" w:before="0" w:line="408"/>
+                    <w:spacing w:after="0" w:before="0" w:line="360"/>
                     <w:jc w:val="both"/>
                   </w:pPr>
                   <w:r>
                     <w:rPr>
-                      <w:rFonts w:ascii="Georgia" w:cs="Georgia" w:eastAsia="Georgia" w:hAnsi="Georgia"/>
+                      <w:rFonts w:ascii="Arial" w:cs="Arial" w:eastAsia="Arial" w:hAnsi="Arial"/>
                       <w:b w:val="false"/>
                       <w:bCs w:val="false"/>
                       <w:i w:val="false"/>
@@ -612,7 +621,7 @@
       </w:pPr>
       <w:r>
         <w:rPr>
-          <w:rFonts w:ascii="Georgia" w:cs="Georgia" w:eastAsia="Georgia" w:hAnsi="Georgia"/>
+          <w:rFonts w:ascii="Arial" w:cs="Arial" w:eastAsia="Arial" w:hAnsi="Arial"/>
           <w:b w:val="false"/>
           <w:bCs w:val="false"/>
           <w:i w:val="false"/>
@@ -626,27 +635,29 @@
     </w:p>
     <w:p>
       <w:pPr>
+        <w:pStyle w:val="Titre2BTH"/>
         <w:keepNext/>
         <w:keepLines/>
-        <w:widowControl w:val="false"/>
-        <w:spacing w:after="170" w:before="284" w:line="288"/>
-      </w:pPr>
-      <w:r>
-        <w:rPr>
-          <w:rFonts w:ascii="Calibri" w:cs="Calibri" w:eastAsia="Calibri" w:hAnsi="Calibri"/>
+        <w:pageBreakBefore/>
+        <w:widowControl w:val="false"/>
+        <w:spacing w:after="170" w:before="0" w:line="288"/>
+      </w:pPr>
+      <w:r>
+        <w:rPr>
+          <w:rFonts w:ascii="Arial" w:cs="Arial" w:eastAsia="Arial" w:hAnsi="Arial"/>
           <w:b w:val="false"/>
           <w:bCs w:val="false"/>
           <w:i w:val="false"/>
           <w:iCs w:val="false"/>
           <w:color w:val="C9A96E"/>
-          <w:sz w:val="20"/>
-          <w:szCs w:val="20"/>
+          <w:sz w:val="21"/>
+          <w:szCs w:val="21"/>
         </w:rPr>
         <w:t xml:space="preserve">1.1  </w:t>
       </w:r>
       <w:r>
         <w:rPr>
-          <w:rFonts w:ascii="Book Antiqua" w:cs="Book Antiqua" w:eastAsia="Book Antiqua" w:hAnsi="Book Antiqua"/>
+          <w:rFonts w:ascii="Arial" w:cs="Arial" w:eastAsia="Arial" w:hAnsi="Arial"/>
           <w:b w:val="false"/>
           <w:bCs w:val="false"/>
           <w:i w:val="false"/>
@@ -660,18 +671,37 @@
     </w:p>
     <w:p>
       <w:pPr>
-        <w:pStyle w:val="ListParagraph"/>
+        <w:widowControl w:val="false"/>
+        <w:spacing w:after="0" w:before="0" w:line="240"/>
+      </w:pPr>
+      <w:r>
+        <w:rPr>
+          <w:rFonts w:ascii="Arial" w:cs="Arial" w:eastAsia="Arial" w:hAnsi="Arial"/>
+          <w:b w:val="false"/>
+          <w:bCs w:val="false"/>
+          <w:i w:val="false"/>
+          <w:iCs w:val="false"/>
+          <w:color w:val="1C1C1C"/>
+          <w:sz w:val="20"/>
+          <w:szCs w:val="20"/>
+        </w:rPr>
+        <w:t xml:space="preserve">{#perimetre_items}</w:t>
+      </w:r>
+    </w:p>
+    <w:p>
+      <w:pPr>
+        <w:pStyle w:val="PuceBTH"/>
         <w:widowControl/>
         <w:numPr>
           <w:ilvl w:val="0"/>
           <w:numId w:val="2"/>
         </w:numPr>
-        <w:spacing w:after="80" w:before="80" w:line="384"/>
+        <w:spacing w:after="100" w:before="100" w:line="360"/>
         <w:jc w:val="both"/>
       </w:pPr>
       <w:r>
         <w:rPr>
-          <w:rFonts w:ascii="Georgia" w:cs="Georgia" w:eastAsia="Georgia" w:hAnsi="Georgia"/>
+          <w:rFonts w:ascii="Arial" w:cs="Arial" w:eastAsia="Arial" w:hAnsi="Arial"/>
           <w:b w:val="false"/>
           <w:bCs w:val="false"/>
           <w:i w:val="false"/>
@@ -680,7 +710,26 @@
           <w:sz w:val="19"/>
           <w:szCs w:val="19"/>
         </w:rPr>
-        <w:t xml:space="preserve">{#perimetre_items}{item}{/perimetre_items}</w:t>
+        <w:t xml:space="preserve">{item}</w:t>
+      </w:r>
+    </w:p>
+    <w:p>
+      <w:pPr>
+        <w:widowControl w:val="false"/>
+        <w:spacing w:after="0" w:before="0" w:line="240"/>
+      </w:pPr>
+      <w:r>
+        <w:rPr>
+          <w:rFonts w:ascii="Arial" w:cs="Arial" w:eastAsia="Arial" w:hAnsi="Arial"/>
+          <w:b w:val="false"/>
+          <w:bCs w:val="false"/>
+          <w:i w:val="false"/>
+          <w:iCs w:val="false"/>
+          <w:color w:val="1C1C1C"/>
+          <w:sz w:val="20"/>
+          <w:szCs w:val="20"/>
+        </w:rPr>
+        <w:t xml:space="preserve">{/perimetre_items}</w:t>
       </w:r>
     </w:p>
     <w:p>
@@ -693,7 +742,7 @@
       </w:pPr>
       <w:r>
         <w:rPr>
-          <w:rFonts w:ascii="Georgia" w:cs="Georgia" w:eastAsia="Georgia" w:hAnsi="Georgia"/>
+          <w:rFonts w:ascii="Arial" w:cs="Arial" w:eastAsia="Arial" w:hAnsi="Arial"/>
           <w:b w:val="false"/>
           <w:bCs w:val="false"/>
           <w:i w:val="false"/>
@@ -707,27 +756,28 @@
     </w:p>
     <w:p>
       <w:pPr>
+        <w:pStyle w:val="Titre2BTH"/>
         <w:keepNext/>
         <w:keepLines/>
         <w:widowControl w:val="false"/>
-        <w:spacing w:after="170" w:before="284" w:line="288"/>
-      </w:pPr>
-      <w:r>
-        <w:rPr>
-          <w:rFonts w:ascii="Calibri" w:cs="Calibri" w:eastAsia="Calibri" w:hAnsi="Calibri"/>
+        <w:spacing w:after="170" w:before="397" w:line="288"/>
+      </w:pPr>
+      <w:r>
+        <w:rPr>
+          <w:rFonts w:ascii="Arial" w:cs="Arial" w:eastAsia="Arial" w:hAnsi="Arial"/>
           <w:b w:val="false"/>
           <w:bCs w:val="false"/>
           <w:i w:val="false"/>
           <w:iCs w:val="false"/>
           <w:color w:val="C9A96E"/>
-          <w:sz w:val="20"/>
-          <w:szCs w:val="20"/>
+          <w:sz w:val="21"/>
+          <w:szCs w:val="21"/>
         </w:rPr>
         <w:t xml:space="preserve">1.2  </w:t>
       </w:r>
       <w:r>
         <w:rPr>
-          <w:rFonts w:ascii="Book Antiqua" w:cs="Book Antiqua" w:eastAsia="Book Antiqua" w:hAnsi="Book Antiqua"/>
+          <w:rFonts w:ascii="Arial" w:cs="Arial" w:eastAsia="Arial" w:hAnsi="Arial"/>
           <w:b w:val="false"/>
           <w:bCs w:val="false"/>
           <w:i w:val="false"/>
@@ -741,14 +791,15 @@
     </w:p>
     <w:p>
       <w:pPr>
+        <w:pStyle w:val="CorpsBTH"/>
         <w:keepNext/>
         <w:widowControl/>
-        <w:spacing w:after="113" w:before="0" w:line="408"/>
+        <w:spacing w:after="113" w:before="0" w:line="360"/>
         <w:jc w:val="both"/>
       </w:pPr>
       <w:r>
         <w:rPr>
-          <w:rFonts w:ascii="Georgia" w:cs="Georgia" w:eastAsia="Georgia" w:hAnsi="Georgia"/>
+          <w:rFonts w:ascii="Arial" w:cs="Arial" w:eastAsia="Arial" w:hAnsi="Arial"/>
           <w:b w:val="false"/>
           <w:bCs w:val="false"/>
           <w:i w:val="false"/>
@@ -762,18 +813,37 @@
     </w:p>
     <w:p>
       <w:pPr>
-        <w:pStyle w:val="ListParagraph"/>
+        <w:widowControl w:val="false"/>
+        <w:spacing w:after="0" w:before="0" w:line="240"/>
+      </w:pPr>
+      <w:r>
+        <w:rPr>
+          <w:rFonts w:ascii="Arial" w:cs="Arial" w:eastAsia="Arial" w:hAnsi="Arial"/>
+          <w:b w:val="false"/>
+          <w:bCs w:val="false"/>
+          <w:i w:val="false"/>
+          <w:iCs w:val="false"/>
+          <w:color w:val="1C1C1C"/>
+          <w:sz w:val="20"/>
+          <w:szCs w:val="20"/>
+        </w:rPr>
+        <w:t xml:space="preserve">{#objectifs_items}</w:t>
+      </w:r>
+    </w:p>
+    <w:p>
+      <w:pPr>
+        <w:pStyle w:val="PuceBTH"/>
         <w:widowControl/>
         <w:numPr>
           <w:ilvl w:val="0"/>
           <w:numId w:val="2"/>
         </w:numPr>
-        <w:spacing w:after="80" w:before="80" w:line="384"/>
+        <w:spacing w:after="100" w:before="100" w:line="360"/>
         <w:jc w:val="both"/>
       </w:pPr>
       <w:r>
         <w:rPr>
-          <w:rFonts w:ascii="Georgia" w:cs="Georgia" w:eastAsia="Georgia" w:hAnsi="Georgia"/>
+          <w:rFonts w:ascii="Arial" w:cs="Arial" w:eastAsia="Arial" w:hAnsi="Arial"/>
           <w:b w:val="false"/>
           <w:bCs w:val="false"/>
           <w:i w:val="false"/>
@@ -782,7 +852,26 @@
           <w:sz w:val="19"/>
           <w:szCs w:val="19"/>
         </w:rPr>
-        <w:t xml:space="preserve">{#objectifs_items}{item}{/objectifs_items}</w:t>
+        <w:t xml:space="preserve">{item}</w:t>
+      </w:r>
+    </w:p>
+    <w:p>
+      <w:pPr>
+        <w:widowControl w:val="false"/>
+        <w:spacing w:after="0" w:before="0" w:line="240"/>
+      </w:pPr>
+      <w:r>
+        <w:rPr>
+          <w:rFonts w:ascii="Arial" w:cs="Arial" w:eastAsia="Arial" w:hAnsi="Arial"/>
+          <w:b w:val="false"/>
+          <w:bCs w:val="false"/>
+          <w:i w:val="false"/>
+          <w:iCs w:val="false"/>
+          <w:color w:val="1C1C1C"/>
+          <w:sz w:val="20"/>
+          <w:szCs w:val="20"/>
+        </w:rPr>
+        <w:t xml:space="preserve">{/objectifs_items}</w:t>
       </w:r>
     </w:p>
     <w:p>
@@ -795,7 +884,7 @@
       </w:pPr>
       <w:r>
         <w:rPr>
-          <w:rFonts w:ascii="Georgia" w:cs="Georgia" w:eastAsia="Georgia" w:hAnsi="Georgia"/>
+          <w:rFonts w:ascii="Arial" w:cs="Arial" w:eastAsia="Arial" w:hAnsi="Arial"/>
           <w:b w:val="false"/>
           <w:bCs w:val="false"/>
           <w:i w:val="false"/>
@@ -809,27 +898,28 @@
     </w:p>
     <w:p>
       <w:pPr>
+        <w:pStyle w:val="Titre2BTH"/>
         <w:keepNext/>
         <w:keepLines/>
         <w:widowControl w:val="false"/>
-        <w:spacing w:after="170" w:before="284" w:line="288"/>
-      </w:pPr>
-      <w:r>
-        <w:rPr>
-          <w:rFonts w:ascii="Calibri" w:cs="Calibri" w:eastAsia="Calibri" w:hAnsi="Calibri"/>
+        <w:spacing w:after="170" w:before="397" w:line="288"/>
+      </w:pPr>
+      <w:r>
+        <w:rPr>
+          <w:rFonts w:ascii="Arial" w:cs="Arial" w:eastAsia="Arial" w:hAnsi="Arial"/>
           <w:b w:val="false"/>
           <w:bCs w:val="false"/>
           <w:i w:val="false"/>
           <w:iCs w:val="false"/>
           <w:color w:val="C9A96E"/>
-          <w:sz w:val="20"/>
-          <w:szCs w:val="20"/>
+          <w:sz w:val="21"/>
+          <w:szCs w:val="21"/>
         </w:rPr>
         <w:t xml:space="preserve">1.3  </w:t>
       </w:r>
       <w:r>
         <w:rPr>
-          <w:rFonts w:ascii="Book Antiqua" w:cs="Book Antiqua" w:eastAsia="Book Antiqua" w:hAnsi="Book Antiqua"/>
+          <w:rFonts w:ascii="Arial" w:cs="Arial" w:eastAsia="Arial" w:hAnsi="Arial"/>
           <w:b w:val="false"/>
           <w:bCs w:val="false"/>
           <w:i w:val="false"/>
@@ -843,14 +933,15 @@
     </w:p>
     <w:p>
       <w:pPr>
+        <w:pStyle w:val="CorpsBTH"/>
         <w:keepNext/>
         <w:widowControl/>
-        <w:spacing w:after="113" w:before="0" w:line="408"/>
+        <w:spacing w:after="113" w:before="0" w:line="360"/>
         <w:jc w:val="both"/>
       </w:pPr>
       <w:r>
         <w:rPr>
-          <w:rFonts w:ascii="Georgia" w:cs="Georgia" w:eastAsia="Georgia" w:hAnsi="Georgia"/>
+          <w:rFonts w:ascii="Arial" w:cs="Arial" w:eastAsia="Arial" w:hAnsi="Arial"/>
           <w:b w:val="false"/>
           <w:bCs w:val="false"/>
           <w:i w:val="false"/>
@@ -864,18 +955,37 @@
     </w:p>
     <w:p>
       <w:pPr>
-        <w:pStyle w:val="ListParagraph"/>
+        <w:widowControl w:val="false"/>
+        <w:spacing w:after="0" w:before="0" w:line="240"/>
+      </w:pPr>
+      <w:r>
+        <w:rPr>
+          <w:rFonts w:ascii="Arial" w:cs="Arial" w:eastAsia="Arial" w:hAnsi="Arial"/>
+          <w:b w:val="false"/>
+          <w:bCs w:val="false"/>
+          <w:i w:val="false"/>
+          <w:iCs w:val="false"/>
+          <w:color w:val="1C1C1C"/>
+          <w:sz w:val="20"/>
+          <w:szCs w:val="20"/>
+        </w:rPr>
+        <w:t xml:space="preserve">{#hypotheses_items}</w:t>
+      </w:r>
+    </w:p>
+    <w:p>
+      <w:pPr>
+        <w:pStyle w:val="PuceBTH"/>
         <w:widowControl/>
         <w:numPr>
           <w:ilvl w:val="0"/>
           <w:numId w:val="2"/>
         </w:numPr>
-        <w:spacing w:after="80" w:before="80" w:line="384"/>
+        <w:spacing w:after="100" w:before="100" w:line="360"/>
         <w:jc w:val="both"/>
       </w:pPr>
       <w:r>
         <w:rPr>
-          <w:rFonts w:ascii="Georgia" w:cs="Georgia" w:eastAsia="Georgia" w:hAnsi="Georgia"/>
+          <w:rFonts w:ascii="Arial" w:cs="Arial" w:eastAsia="Arial" w:hAnsi="Arial"/>
           <w:b w:val="false"/>
           <w:bCs w:val="false"/>
           <w:i w:val="false"/>
@@ -884,7 +994,26 @@
           <w:sz w:val="19"/>
           <w:szCs w:val="19"/>
         </w:rPr>
-        <w:t xml:space="preserve">{#hypotheses_items}{item}{/hypotheses_items}</w:t>
+        <w:t xml:space="preserve">{item}</w:t>
+      </w:r>
+    </w:p>
+    <w:p>
+      <w:pPr>
+        <w:widowControl w:val="false"/>
+        <w:spacing w:after="0" w:before="0" w:line="240"/>
+      </w:pPr>
+      <w:r>
+        <w:rPr>
+          <w:rFonts w:ascii="Arial" w:cs="Arial" w:eastAsia="Arial" w:hAnsi="Arial"/>
+          <w:b w:val="false"/>
+          <w:bCs w:val="false"/>
+          <w:i w:val="false"/>
+          <w:iCs w:val="false"/>
+          <w:color w:val="1C1C1C"/>
+          <w:sz w:val="20"/>
+          <w:szCs w:val="20"/>
+        </w:rPr>
+        <w:t xml:space="preserve">{/hypotheses_items}</w:t>
       </w:r>
     </w:p>
     <w:p>
@@ -897,7 +1026,7 @@
       </w:pPr>
       <w:r>
         <w:rPr>
-          <w:rFonts w:ascii="Georgia" w:cs="Georgia" w:eastAsia="Georgia" w:hAnsi="Georgia"/>
+          <w:rFonts w:ascii="Arial" w:cs="Arial" w:eastAsia="Arial" w:hAnsi="Arial"/>
           <w:b w:val="false"/>
           <w:bCs w:val="false"/>
           <w:i w:val="false"/>
@@ -911,17 +1040,18 @@
     </w:p>
     <w:p>
       <w:pPr>
+        <w:pStyle w:val="Titre1BTH"/>
         <w:keepNext/>
         <w:keepLines/>
         <w:widowControl w:val="false"/>
         <w:pBdr>
           <w:bottom w:val="single" w:color="C9A96E" w:sz="6" w:space="6"/>
         </w:pBdr>
-        <w:spacing w:after="227" w:before="397" w:line="288"/>
-      </w:pPr>
-      <w:r>
-        <w:rPr>
-          <w:rFonts w:ascii="Calibri" w:cs="Calibri" w:eastAsia="Calibri" w:hAnsi="Calibri"/>
+        <w:spacing w:after="227" w:before="567" w:line="288"/>
+      </w:pPr>
+      <w:r>
+        <w:rPr>
+          <w:rFonts w:ascii="Arial" w:cs="Arial" w:eastAsia="Arial" w:hAnsi="Arial"/>
           <w:b/>
           <w:bCs/>
           <w:i w:val="false"/>
@@ -934,7 +1064,7 @@
       </w:r>
       <w:r>
         <w:rPr>
-          <w:rFonts w:ascii="Book Antiqua" w:cs="Book Antiqua" w:eastAsia="Book Antiqua" w:hAnsi="Book Antiqua"/>
+          <w:rFonts w:ascii="Arial" w:cs="Arial" w:eastAsia="Arial" w:hAnsi="Arial"/>
           <w:b/>
           <w:bCs/>
           <w:i w:val="false"/>
@@ -948,14 +1078,15 @@
     </w:p>
     <w:p>
       <w:pPr>
+        <w:pStyle w:val="CorpsBTH"/>
         <w:keepNext/>
         <w:widowControl/>
-        <w:spacing w:after="113" w:before="0" w:line="408"/>
+        <w:spacing w:after="113" w:before="0" w:line="360"/>
         <w:jc w:val="both"/>
       </w:pPr>
       <w:r>
         <w:rPr>
-          <w:rFonts w:ascii="Georgia" w:cs="Georgia" w:eastAsia="Georgia" w:hAnsi="Georgia"/>
+          <w:rFonts w:ascii="Arial" w:cs="Arial" w:eastAsia="Arial" w:hAnsi="Arial"/>
           <w:b w:val="false"/>
           <w:bCs w:val="false"/>
           <w:i w:val="false"/>
@@ -969,18 +1100,37 @@
     </w:p>
     <w:p>
       <w:pPr>
-        <w:pStyle w:val="ListParagraph"/>
+        <w:widowControl w:val="false"/>
+        <w:spacing w:after="0" w:before="0" w:line="240"/>
+      </w:pPr>
+      <w:r>
+        <w:rPr>
+          <w:rFonts w:ascii="Arial" w:cs="Arial" w:eastAsia="Arial" w:hAnsi="Arial"/>
+          <w:b w:val="false"/>
+          <w:bCs w:val="false"/>
+          <w:i w:val="false"/>
+          <w:iCs w:val="false"/>
+          <w:color w:val="1C1C1C"/>
+          <w:sz w:val="20"/>
+          <w:szCs w:val="20"/>
+        </w:rPr>
+        <w:t xml:space="preserve">{#livrables_items}</w:t>
+      </w:r>
+    </w:p>
+    <w:p>
+      <w:pPr>
+        <w:pStyle w:val="PuceBTH"/>
         <w:widowControl/>
         <w:numPr>
           <w:ilvl w:val="0"/>
           <w:numId w:val="2"/>
         </w:numPr>
-        <w:spacing w:after="80" w:before="80" w:line="384"/>
+        <w:spacing w:after="100" w:before="100" w:line="360"/>
         <w:jc w:val="both"/>
       </w:pPr>
       <w:r>
         <w:rPr>
-          <w:rFonts w:ascii="Georgia" w:cs="Georgia" w:eastAsia="Georgia" w:hAnsi="Georgia"/>
+          <w:rFonts w:ascii="Arial" w:cs="Arial" w:eastAsia="Arial" w:hAnsi="Arial"/>
           <w:b w:val="false"/>
           <w:bCs w:val="false"/>
           <w:i w:val="false"/>
@@ -989,7 +1139,26 @@
           <w:sz w:val="19"/>
           <w:szCs w:val="19"/>
         </w:rPr>
-        <w:t xml:space="preserve">{#livrables_items}{item}{/livrables_items}</w:t>
+        <w:t xml:space="preserve">{item}</w:t>
+      </w:r>
+    </w:p>
+    <w:p>
+      <w:pPr>
+        <w:widowControl w:val="false"/>
+        <w:spacing w:after="0" w:before="0" w:line="240"/>
+      </w:pPr>
+      <w:r>
+        <w:rPr>
+          <w:rFonts w:ascii="Arial" w:cs="Arial" w:eastAsia="Arial" w:hAnsi="Arial"/>
+          <w:b w:val="false"/>
+          <w:bCs w:val="false"/>
+          <w:i w:val="false"/>
+          <w:iCs w:val="false"/>
+          <w:color w:val="1C1C1C"/>
+          <w:sz w:val="20"/>
+          <w:szCs w:val="20"/>
+        </w:rPr>
+        <w:t xml:space="preserve">{/livrables_items}</w:t>
       </w:r>
     </w:p>
     <w:p>
@@ -1002,7 +1171,7 @@
       </w:pPr>
       <w:r>
         <w:rPr>
-          <w:rFonts w:ascii="Georgia" w:cs="Georgia" w:eastAsia="Georgia" w:hAnsi="Georgia"/>
+          <w:rFonts w:ascii="Arial" w:cs="Arial" w:eastAsia="Arial" w:hAnsi="Arial"/>
           <w:b w:val="false"/>
           <w:bCs w:val="false"/>
           <w:i w:val="false"/>
@@ -1016,17 +1185,18 @@
     </w:p>
     <w:p>
       <w:pPr>
+        <w:pStyle w:val="Titre1BTH"/>
         <w:keepNext/>
         <w:keepLines/>
         <w:widowControl w:val="false"/>
         <w:pBdr>
           <w:bottom w:val="single" w:color="C9A96E" w:sz="6" w:space="6"/>
         </w:pBdr>
-        <w:spacing w:after="227" w:before="397" w:line="288"/>
-      </w:pPr>
-      <w:r>
-        <w:rPr>
-          <w:rFonts w:ascii="Calibri" w:cs="Calibri" w:eastAsia="Calibri" w:hAnsi="Calibri"/>
+        <w:spacing w:after="227" w:before="567" w:line="288"/>
+      </w:pPr>
+      <w:r>
+        <w:rPr>
+          <w:rFonts w:ascii="Arial" w:cs="Arial" w:eastAsia="Arial" w:hAnsi="Arial"/>
           <w:b/>
           <w:bCs/>
           <w:i w:val="false"/>
@@ -1039,7 +1209,7 @@
       </w:r>
       <w:r>
         <w:rPr>
-          <w:rFonts w:ascii="Book Antiqua" w:cs="Book Antiqua" w:eastAsia="Book Antiqua" w:hAnsi="Book Antiqua"/>
+          <w:rFonts w:ascii="Arial" w:cs="Arial" w:eastAsia="Arial" w:hAnsi="Arial"/>
           <w:b/>
           <w:bCs/>
           <w:i w:val="false"/>
@@ -1053,15 +1223,16 @@
     </w:p>
     <w:p>
       <w:pPr>
+        <w:pStyle w:val="CorpsBTH"/>
         <w:keepNext w:val="false"/>
         <w:keepLines w:val="false"/>
         <w:widowControl/>
-        <w:spacing w:after="227" w:before="0" w:line="408"/>
+        <w:spacing w:after="227" w:before="0" w:line="360"/>
         <w:jc w:val="both"/>
       </w:pPr>
       <w:r>
         <w:rPr>
-          <w:rFonts w:ascii="Georgia" w:cs="Georgia" w:eastAsia="Georgia" w:hAnsi="Georgia"/>
+          <w:rFonts w:ascii="Arial" w:cs="Arial" w:eastAsia="Arial" w:hAnsi="Arial"/>
           <w:b w:val="false"/>
           <w:bCs w:val="false"/>
           <w:i w:val="false"/>
@@ -1083,7 +1254,7 @@
       </w:pPr>
       <w:r>
         <w:rPr>
-          <w:rFonts w:ascii="Georgia" w:cs="Georgia" w:eastAsia="Georgia" w:hAnsi="Georgia"/>
+          <w:rFonts w:ascii="Arial" w:cs="Arial" w:eastAsia="Arial" w:hAnsi="Arial"/>
           <w:b w:val="false"/>
           <w:bCs w:val="false"/>
           <w:i w:val="false"/>
@@ -1097,6 +1268,7 @@
     </w:p>
     <w:p>
       <w:pPr>
+        <w:pStyle w:val="Titre1BTH"/>
         <w:keepNext/>
         <w:keepLines/>
         <w:pageBreakBefore/>
@@ -1104,11 +1276,11 @@
         <w:pBdr>
           <w:bottom w:val="single" w:color="C9A96E" w:sz="6" w:space="6"/>
         </w:pBdr>
-        <w:spacing w:after="227" w:before="397" w:line="288"/>
-      </w:pPr>
-      <w:r>
-        <w:rPr>
-          <w:rFonts w:ascii="Calibri" w:cs="Calibri" w:eastAsia="Calibri" w:hAnsi="Calibri"/>
+        <w:spacing w:after="227" w:before="0" w:line="288"/>
+      </w:pPr>
+      <w:r>
+        <w:rPr>
+          <w:rFonts w:ascii="Arial" w:cs="Arial" w:eastAsia="Arial" w:hAnsi="Arial"/>
           <w:b/>
           <w:bCs/>
           <w:i w:val="false"/>
@@ -1121,7 +1293,7 @@
       </w:r>
       <w:r>
         <w:rPr>
-          <w:rFonts w:ascii="Book Antiqua" w:cs="Book Antiqua" w:eastAsia="Book Antiqua" w:hAnsi="Book Antiqua"/>
+          <w:rFonts w:ascii="Arial" w:cs="Arial" w:eastAsia="Arial" w:hAnsi="Arial"/>
           <w:b/>
           <w:bCs/>
           <w:i w:val="false"/>
@@ -1135,15 +1307,16 @@
     </w:p>
     <w:p>
       <w:pPr>
+        <w:pStyle w:val="CorpsBTH"/>
         <w:keepNext/>
         <w:keepLines w:val="false"/>
         <w:widowControl/>
-        <w:spacing w:after="227" w:before="0" w:line="408"/>
+        <w:spacing w:after="227" w:before="0" w:line="360"/>
         <w:jc w:val="both"/>
       </w:pPr>
       <w:r>
         <w:rPr>
-          <w:rFonts w:ascii="Georgia" w:cs="Georgia" w:eastAsia="Georgia" w:hAnsi="Georgia"/>
+          <w:rFonts w:ascii="Arial" w:cs="Arial" w:eastAsia="Arial" w:hAnsi="Arial"/>
           <w:b w:val="false"/>
           <w:bCs w:val="false"/>
           <w:i w:val="false"/>
@@ -1164,7 +1337,7 @@
       </w:pPr>
       <w:r>
         <w:rPr>
-          <w:rFonts w:ascii="Book Antiqua" w:cs="Book Antiqua" w:eastAsia="Book Antiqua" w:hAnsi="Book Antiqua"/>
+          <w:rFonts w:ascii="Arial" w:cs="Arial" w:eastAsia="Arial" w:hAnsi="Arial"/>
           <w:b/>
           <w:bCs/>
           <w:i w:val="false"/>
@@ -1224,7 +1397,7 @@
             </w:pPr>
             <w:r>
               <w:rPr>
-                <w:rFonts w:ascii="Calibri" w:cs="Calibri" w:eastAsia="Calibri" w:hAnsi="Calibri"/>
+                <w:rFonts w:ascii="Arial" w:cs="Arial" w:eastAsia="Arial" w:hAnsi="Arial"/>
                 <w:b/>
                 <w:bCs/>
                 <w:i w:val="false"/>
@@ -1263,7 +1436,7 @@
             </w:pPr>
             <w:r>
               <w:rPr>
-                <w:rFonts w:ascii="Calibri" w:cs="Calibri" w:eastAsia="Calibri" w:hAnsi="Calibri"/>
+                <w:rFonts w:ascii="Arial" w:cs="Arial" w:eastAsia="Arial" w:hAnsi="Arial"/>
                 <w:b/>
                 <w:bCs/>
                 <w:i w:val="false"/>
@@ -1302,7 +1475,7 @@
             </w:pPr>
             <w:r>
               <w:rPr>
-                <w:rFonts w:ascii="Calibri" w:cs="Calibri" w:eastAsia="Calibri" w:hAnsi="Calibri"/>
+                <w:rFonts w:ascii="Arial" w:cs="Arial" w:eastAsia="Arial" w:hAnsi="Arial"/>
                 <w:b/>
                 <w:bCs/>
                 <w:i w:val="false"/>
@@ -1341,7 +1514,7 @@
             </w:pPr>
             <w:r>
               <w:rPr>
-                <w:rFonts w:ascii="Calibri" w:cs="Calibri" w:eastAsia="Calibri" w:hAnsi="Calibri"/>
+                <w:rFonts w:ascii="Arial" w:cs="Arial" w:eastAsia="Arial" w:hAnsi="Arial"/>
                 <w:b/>
                 <w:bCs/>
                 <w:i w:val="false"/>
@@ -1384,7 +1557,7 @@
             </w:pPr>
             <w:r>
               <w:rPr>
-                <w:rFonts w:ascii="Calibri" w:cs="Calibri" w:eastAsia="Calibri" w:hAnsi="Calibri"/>
+                <w:rFonts w:ascii="Arial" w:cs="Arial" w:eastAsia="Arial" w:hAnsi="Arial"/>
                 <w:b/>
                 <w:bCs/>
                 <w:i w:val="false"/>
@@ -1422,7 +1595,7 @@
             </w:pPr>
             <w:r>
               <w:rPr>
-                <w:rFonts w:ascii="Georgia" w:cs="Georgia" w:eastAsia="Georgia" w:hAnsi="Georgia"/>
+                <w:rFonts w:ascii="Arial" w:cs="Arial" w:eastAsia="Arial" w:hAnsi="Arial"/>
                 <w:b w:val="false"/>
                 <w:bCs w:val="false"/>
                 <w:i w:val="false"/>
@@ -1460,7 +1633,7 @@
             </w:pPr>
             <w:r>
               <w:rPr>
-                <w:rFonts w:ascii="Calibri" w:cs="Calibri" w:eastAsia="Calibri" w:hAnsi="Calibri"/>
+                <w:rFonts w:ascii="Arial" w:cs="Arial" w:eastAsia="Arial" w:hAnsi="Arial"/>
                 <w:b w:val="false"/>
                 <w:bCs w:val="false"/>
                 <w:i w:val="false"/>
@@ -1498,7 +1671,7 @@
             </w:pPr>
             <w:r>
               <w:rPr>
-                <w:rFonts w:ascii="Calibri" w:cs="Calibri" w:eastAsia="Calibri" w:hAnsi="Calibri"/>
+                <w:rFonts w:ascii="Arial" w:cs="Arial" w:eastAsia="Arial" w:hAnsi="Arial"/>
                 <w:b w:val="false"/>
                 <w:bCs w:val="false"/>
                 <w:i w:val="false"/>
@@ -1541,7 +1714,7 @@
             </w:pPr>
             <w:r>
               <w:rPr>
-                <w:rFonts w:ascii="Calibri" w:cs="Calibri" w:eastAsia="Calibri" w:hAnsi="Calibri"/>
+                <w:rFonts w:ascii="Arial" w:cs="Arial" w:eastAsia="Arial" w:hAnsi="Arial"/>
                 <w:b/>
                 <w:bCs/>
                 <w:i w:val="false"/>
@@ -1580,7 +1753,7 @@
             </w:pPr>
             <w:r>
               <w:rPr>
-                <w:rFonts w:ascii="Calibri" w:cs="Calibri" w:eastAsia="Calibri" w:hAnsi="Calibri"/>
+                <w:rFonts w:ascii="Arial" w:cs="Arial" w:eastAsia="Arial" w:hAnsi="Arial"/>
                 <w:b/>
                 <w:bCs/>
                 <w:i w:val="false"/>
@@ -1602,7 +1775,7 @@
       </w:pPr>
       <w:r>
         <w:rPr>
-          <w:rFonts w:ascii="Georgia" w:cs="Georgia" w:eastAsia="Georgia" w:hAnsi="Georgia"/>
+          <w:rFonts w:ascii="Arial" w:cs="Arial" w:eastAsia="Arial" w:hAnsi="Arial"/>
           <w:b w:val="false"/>
           <w:bCs w:val="false"/>
           <w:i w:val="false"/>
@@ -1616,6 +1789,7 @@
     </w:p>
     <w:p>
       <w:pPr>
+        <w:pStyle w:val="TitreTableauBTH"/>
         <w:keepNext/>
         <w:keepLines/>
         <w:widowControl w:val="false"/>
@@ -1623,7 +1797,7 @@
       </w:pPr>
       <w:r>
         <w:rPr>
-          <w:rFonts w:ascii="Book Antiqua" w:cs="Book Antiqua" w:eastAsia="Book Antiqua" w:hAnsi="Book Antiqua"/>
+          <w:rFonts w:ascii="Arial" w:cs="Arial" w:eastAsia="Arial" w:hAnsi="Arial"/>
           <w:b/>
           <w:bCs/>
           <w:i w:val="false"/>
@@ -1683,7 +1857,7 @@
             </w:pPr>
             <w:r>
               <w:rPr>
-                <w:rFonts w:ascii="Calibri" w:cs="Calibri" w:eastAsia="Calibri" w:hAnsi="Calibri"/>
+                <w:rFonts w:ascii="Arial" w:cs="Arial" w:eastAsia="Arial" w:hAnsi="Arial"/>
                 <w:b/>
                 <w:bCs/>
                 <w:i w:val="false"/>
@@ -1722,7 +1896,7 @@
             </w:pPr>
             <w:r>
               <w:rPr>
-                <w:rFonts w:ascii="Calibri" w:cs="Calibri" w:eastAsia="Calibri" w:hAnsi="Calibri"/>
+                <w:rFonts w:ascii="Arial" w:cs="Arial" w:eastAsia="Arial" w:hAnsi="Arial"/>
                 <w:b/>
                 <w:bCs/>
                 <w:i w:val="false"/>
@@ -1761,7 +1935,7 @@
             </w:pPr>
             <w:r>
               <w:rPr>
-                <w:rFonts w:ascii="Calibri" w:cs="Calibri" w:eastAsia="Calibri" w:hAnsi="Calibri"/>
+                <w:rFonts w:ascii="Arial" w:cs="Arial" w:eastAsia="Arial" w:hAnsi="Arial"/>
                 <w:b/>
                 <w:bCs/>
                 <w:i w:val="false"/>
@@ -1800,7 +1974,7 @@
             </w:pPr>
             <w:r>
               <w:rPr>
-                <w:rFonts w:ascii="Calibri" w:cs="Calibri" w:eastAsia="Calibri" w:hAnsi="Calibri"/>
+                <w:rFonts w:ascii="Arial" w:cs="Arial" w:eastAsia="Arial" w:hAnsi="Arial"/>
                 <w:b/>
                 <w:bCs/>
                 <w:i w:val="false"/>
@@ -1843,7 +2017,7 @@
             </w:pPr>
             <w:r>
               <w:rPr>
-                <w:rFonts w:ascii="Calibri" w:cs="Calibri" w:eastAsia="Calibri" w:hAnsi="Calibri"/>
+                <w:rFonts w:ascii="Arial" w:cs="Arial" w:eastAsia="Arial" w:hAnsi="Arial"/>
                 <w:b/>
                 <w:bCs/>
                 <w:i w:val="false"/>
@@ -1881,7 +2055,7 @@
             </w:pPr>
             <w:r>
               <w:rPr>
-                <w:rFonts w:ascii="Georgia" w:cs="Georgia" w:eastAsia="Georgia" w:hAnsi="Georgia"/>
+                <w:rFonts w:ascii="Arial" w:cs="Arial" w:eastAsia="Arial" w:hAnsi="Arial"/>
                 <w:b w:val="false"/>
                 <w:bCs w:val="false"/>
                 <w:i w:val="false"/>
@@ -1919,7 +2093,7 @@
             </w:pPr>
             <w:r>
               <w:rPr>
-                <w:rFonts w:ascii="Calibri" w:cs="Calibri" w:eastAsia="Calibri" w:hAnsi="Calibri"/>
+                <w:rFonts w:ascii="Arial" w:cs="Arial" w:eastAsia="Arial" w:hAnsi="Arial"/>
                 <w:b w:val="false"/>
                 <w:bCs w:val="false"/>
                 <w:i w:val="false"/>
@@ -1957,7 +2131,7 @@
             </w:pPr>
             <w:r>
               <w:rPr>
-                <w:rFonts w:ascii="Calibri" w:cs="Calibri" w:eastAsia="Calibri" w:hAnsi="Calibri"/>
+                <w:rFonts w:ascii="Arial" w:cs="Arial" w:eastAsia="Arial" w:hAnsi="Arial"/>
                 <w:b w:val="false"/>
                 <w:bCs w:val="false"/>
                 <w:i w:val="false"/>
@@ -2000,7 +2174,7 @@
             </w:pPr>
             <w:r>
               <w:rPr>
-                <w:rFonts w:ascii="Calibri" w:cs="Calibri" w:eastAsia="Calibri" w:hAnsi="Calibri"/>
+                <w:rFonts w:ascii="Arial" w:cs="Arial" w:eastAsia="Arial" w:hAnsi="Arial"/>
                 <w:b/>
                 <w:bCs/>
                 <w:i w:val="false"/>
@@ -2039,7 +2213,7 @@
             </w:pPr>
             <w:r>
               <w:rPr>
-                <w:rFonts w:ascii="Calibri" w:cs="Calibri" w:eastAsia="Calibri" w:hAnsi="Calibri"/>
+                <w:rFonts w:ascii="Arial" w:cs="Arial" w:eastAsia="Arial" w:hAnsi="Arial"/>
                 <w:b/>
                 <w:bCs/>
                 <w:i w:val="false"/>
@@ -2082,7 +2256,7 @@
             </w:pPr>
             <w:r>
               <w:rPr>
-                <w:rFonts w:ascii="Calibri" w:cs="Calibri" w:eastAsia="Calibri" w:hAnsi="Calibri"/>
+                <w:rFonts w:ascii="Arial" w:cs="Arial" w:eastAsia="Arial" w:hAnsi="Arial"/>
                 <w:b w:val="false"/>
                 <w:bCs w:val="false"/>
                 <w:i w:val="false"/>
@@ -2121,7 +2295,7 @@
             </w:pPr>
             <w:r>
               <w:rPr>
-                <w:rFonts w:ascii="Calibri" w:cs="Calibri" w:eastAsia="Calibri" w:hAnsi="Calibri"/>
+                <w:rFonts w:ascii="Arial" w:cs="Arial" w:eastAsia="Arial" w:hAnsi="Arial"/>
                 <w:b/>
                 <w:bCs/>
                 <w:i w:val="false"/>
@@ -2163,7 +2337,7 @@
             </w:pPr>
             <w:r>
               <w:rPr>
-                <w:rFonts w:ascii="Calibri" w:cs="Calibri" w:eastAsia="Calibri" w:hAnsi="Calibri"/>
+                <w:rFonts w:ascii="Arial" w:cs="Arial" w:eastAsia="Arial" w:hAnsi="Arial"/>
                 <w:b/>
                 <w:bCs/>
                 <w:i w:val="false"/>
@@ -2202,7 +2376,7 @@
             </w:pPr>
             <w:r>
               <w:rPr>
-                <w:rFonts w:ascii="Calibri" w:cs="Calibri" w:eastAsia="Calibri" w:hAnsi="Calibri"/>
+                <w:rFonts w:ascii="Arial" w:cs="Arial" w:eastAsia="Arial" w:hAnsi="Arial"/>
                 <w:b/>
                 <w:bCs/>
                 <w:i w:val="false"/>
@@ -2227,7 +2401,7 @@
       </w:pPr>
       <w:r>
         <w:rPr>
-          <w:rFonts w:ascii="Georgia" w:cs="Georgia" w:eastAsia="Georgia" w:hAnsi="Georgia"/>
+          <w:rFonts w:ascii="Arial" w:cs="Arial" w:eastAsia="Arial" w:hAnsi="Arial"/>
           <w:b w:val="false"/>
           <w:bCs w:val="false"/>
           <w:i w:val="false"/>
@@ -2274,13 +2448,14 @@
           </w:tcPr>
           <w:p>
             <w:pPr>
+              <w:pStyle w:val="CalloutBTH"/>
               <w:widowControl/>
-              <w:spacing w:after="0" w:before="0" w:line="408"/>
+              <w:spacing w:after="0" w:before="0" w:line="360"/>
               <w:jc w:val="both"/>
             </w:pPr>
             <w:r>
               <w:rPr>
-                <w:rFonts w:ascii="Georgia" w:cs="Georgia" w:eastAsia="Georgia" w:hAnsi="Georgia"/>
+                <w:rFonts w:ascii="Arial" w:cs="Arial" w:eastAsia="Arial" w:hAnsi="Arial"/>
                 <w:b w:val="false"/>
                 <w:bCs w:val="false"/>
                 <w:i w:val="false"/>
@@ -2305,7 +2480,7 @@
       </w:pPr>
       <w:r>
         <w:rPr>
-          <w:rFonts w:ascii="Georgia" w:cs="Georgia" w:eastAsia="Georgia" w:hAnsi="Georgia"/>
+          <w:rFonts w:ascii="Arial" w:cs="Arial" w:eastAsia="Arial" w:hAnsi="Arial"/>
           <w:b w:val="false"/>
           <w:bCs w:val="false"/>
           <w:i w:val="false"/>
@@ -2319,17 +2494,18 @@
     </w:p>
     <w:p>
       <w:pPr>
+        <w:pStyle w:val="Titre1BTH"/>
         <w:keepNext/>
         <w:keepLines/>
         <w:widowControl w:val="false"/>
         <w:pBdr>
           <w:bottom w:val="single" w:color="C9A96E" w:sz="6" w:space="6"/>
         </w:pBdr>
-        <w:spacing w:after="227" w:before="397" w:line="288"/>
-      </w:pPr>
-      <w:r>
-        <w:rPr>
-          <w:rFonts w:ascii="Calibri" w:cs="Calibri" w:eastAsia="Calibri" w:hAnsi="Calibri"/>
+        <w:spacing w:after="227" w:before="567" w:line="288"/>
+      </w:pPr>
+      <w:r>
+        <w:rPr>
+          <w:rFonts w:ascii="Arial" w:cs="Arial" w:eastAsia="Arial" w:hAnsi="Arial"/>
           <w:b/>
           <w:bCs/>
           <w:i w:val="false"/>
@@ -2342,7 +2518,7 @@
       </w:r>
       <w:r>
         <w:rPr>
-          <w:rFonts w:ascii="Book Antiqua" w:cs="Book Antiqua" w:eastAsia="Book Antiqua" w:hAnsi="Book Antiqua"/>
+          <w:rFonts w:ascii="Arial" w:cs="Arial" w:eastAsia="Arial" w:hAnsi="Arial"/>
           <w:b/>
           <w:bCs/>
           <w:i w:val="false"/>
@@ -2356,27 +2532,28 @@
     </w:p>
     <w:p>
       <w:pPr>
+        <w:pStyle w:val="Titre2BTH"/>
         <w:keepNext/>
         <w:keepLines/>
         <w:widowControl w:val="false"/>
-        <w:spacing w:after="170" w:before="284" w:line="288"/>
-      </w:pPr>
-      <w:r>
-        <w:rPr>
-          <w:rFonts w:ascii="Calibri" w:cs="Calibri" w:eastAsia="Calibri" w:hAnsi="Calibri"/>
+        <w:spacing w:after="170" w:before="397" w:line="288"/>
+      </w:pPr>
+      <w:r>
+        <w:rPr>
+          <w:rFonts w:ascii="Arial" w:cs="Arial" w:eastAsia="Arial" w:hAnsi="Arial"/>
           <w:b w:val="false"/>
           <w:bCs w:val="false"/>
           <w:i w:val="false"/>
           <w:iCs w:val="false"/>
           <w:color w:val="C9A96E"/>
-          <w:sz w:val="20"/>
-          <w:szCs w:val="20"/>
+          <w:sz w:val="21"/>
+          <w:szCs w:val="21"/>
         </w:rPr>
         <w:t xml:space="preserve">5.1  </w:t>
       </w:r>
       <w:r>
         <w:rPr>
-          <w:rFonts w:ascii="Book Antiqua" w:cs="Book Antiqua" w:eastAsia="Book Antiqua" w:hAnsi="Book Antiqua"/>
+          <w:rFonts w:ascii="Arial" w:cs="Arial" w:eastAsia="Arial" w:hAnsi="Arial"/>
           <w:b w:val="false"/>
           <w:bCs w:val="false"/>
           <w:i w:val="false"/>
@@ -2390,14 +2567,15 @@
     </w:p>
     <w:p>
       <w:pPr>
+        <w:pStyle w:val="CorpsBTH"/>
         <w:keepNext/>
         <w:widowControl/>
-        <w:spacing w:after="113" w:before="0" w:line="408"/>
+        <w:spacing w:after="113" w:before="0" w:line="360"/>
         <w:jc w:val="both"/>
       </w:pPr>
       <w:r>
         <w:rPr>
-          <w:rFonts w:ascii="Georgia" w:cs="Georgia" w:eastAsia="Georgia" w:hAnsi="Georgia"/>
+          <w:rFonts w:ascii="Arial" w:cs="Arial" w:eastAsia="Arial" w:hAnsi="Arial"/>
           <w:b w:val="false"/>
           <w:bCs w:val="false"/>
           <w:i w:val="false"/>
@@ -2411,18 +2589,37 @@
     </w:p>
     <w:p>
       <w:pPr>
-        <w:pStyle w:val="ListParagraph"/>
+        <w:widowControl w:val="false"/>
+        <w:spacing w:after="0" w:before="0" w:line="240"/>
+      </w:pPr>
+      <w:r>
+        <w:rPr>
+          <w:rFonts w:ascii="Arial" w:cs="Arial" w:eastAsia="Arial" w:hAnsi="Arial"/>
+          <w:b w:val="false"/>
+          <w:bCs w:val="false"/>
+          <w:i w:val="false"/>
+          <w:iCs w:val="false"/>
+          <w:color w:val="1C1C1C"/>
+          <w:sz w:val="20"/>
+          <w:szCs w:val="20"/>
+        </w:rPr>
+        <w:t xml:space="preserve">{#inclusions_items}</w:t>
+      </w:r>
+    </w:p>
+    <w:p>
+      <w:pPr>
+        <w:pStyle w:val="PuceBTH"/>
         <w:widowControl/>
         <w:numPr>
           <w:ilvl w:val="0"/>
           <w:numId w:val="2"/>
         </w:numPr>
-        <w:spacing w:after="80" w:before="80" w:line="384"/>
+        <w:spacing w:after="100" w:before="100" w:line="360"/>
         <w:jc w:val="both"/>
       </w:pPr>
       <w:r>
         <w:rPr>
-          <w:rFonts w:ascii="Georgia" w:cs="Georgia" w:eastAsia="Georgia" w:hAnsi="Georgia"/>
+          <w:rFonts w:ascii="Arial" w:cs="Arial" w:eastAsia="Arial" w:hAnsi="Arial"/>
           <w:b w:val="false"/>
           <w:bCs w:val="false"/>
           <w:i w:val="false"/>
@@ -2431,7 +2628,26 @@
           <w:sz w:val="19"/>
           <w:szCs w:val="19"/>
         </w:rPr>
-        <w:t xml:space="preserve">{#inclusions_items}{item}{/inclusions_items}</w:t>
+        <w:t xml:space="preserve">{item}</w:t>
+      </w:r>
+    </w:p>
+    <w:p>
+      <w:pPr>
+        <w:widowControl w:val="false"/>
+        <w:spacing w:after="0" w:before="0" w:line="240"/>
+      </w:pPr>
+      <w:r>
+        <w:rPr>
+          <w:rFonts w:ascii="Arial" w:cs="Arial" w:eastAsia="Arial" w:hAnsi="Arial"/>
+          <w:b w:val="false"/>
+          <w:bCs w:val="false"/>
+          <w:i w:val="false"/>
+          <w:iCs w:val="false"/>
+          <w:color w:val="1C1C1C"/>
+          <w:sz w:val="20"/>
+          <w:szCs w:val="20"/>
+        </w:rPr>
+        <w:t xml:space="preserve">{/inclusions_items}</w:t>
       </w:r>
     </w:p>
     <w:p>
@@ -2444,7 +2660,7 @@
       </w:pPr>
       <w:r>
         <w:rPr>
-          <w:rFonts w:ascii="Georgia" w:cs="Georgia" w:eastAsia="Georgia" w:hAnsi="Georgia"/>
+          <w:rFonts w:ascii="Arial" w:cs="Arial" w:eastAsia="Arial" w:hAnsi="Arial"/>
           <w:b w:val="false"/>
           <w:bCs w:val="false"/>
           <w:i w:val="false"/>
@@ -2458,27 +2674,28 @@
     </w:p>
     <w:p>
       <w:pPr>
+        <w:pStyle w:val="Titre2BTH"/>
         <w:keepNext/>
         <w:keepLines/>
         <w:widowControl w:val="false"/>
-        <w:spacing w:after="170" w:before="284" w:line="288"/>
-      </w:pPr>
-      <w:r>
-        <w:rPr>
-          <w:rFonts w:ascii="Calibri" w:cs="Calibri" w:eastAsia="Calibri" w:hAnsi="Calibri"/>
+        <w:spacing w:after="170" w:before="397" w:line="288"/>
+      </w:pPr>
+      <w:r>
+        <w:rPr>
+          <w:rFonts w:ascii="Arial" w:cs="Arial" w:eastAsia="Arial" w:hAnsi="Arial"/>
           <w:b w:val="false"/>
           <w:bCs w:val="false"/>
           <w:i w:val="false"/>
           <w:iCs w:val="false"/>
           <w:color w:val="C9A96E"/>
-          <w:sz w:val="20"/>
-          <w:szCs w:val="20"/>
+          <w:sz w:val="21"/>
+          <w:szCs w:val="21"/>
         </w:rPr>
         <w:t xml:space="preserve">5.2  </w:t>
       </w:r>
       <w:r>
         <w:rPr>
-          <w:rFonts w:ascii="Book Antiqua" w:cs="Book Antiqua" w:eastAsia="Book Antiqua" w:hAnsi="Book Antiqua"/>
+          <w:rFonts w:ascii="Arial" w:cs="Arial" w:eastAsia="Arial" w:hAnsi="Arial"/>
           <w:b w:val="false"/>
           <w:bCs w:val="false"/>
           <w:i w:val="false"/>
@@ -2492,14 +2709,15 @@
     </w:p>
     <w:p>
       <w:pPr>
+        <w:pStyle w:val="CorpsBTH"/>
         <w:keepNext/>
         <w:widowControl/>
-        <w:spacing w:after="113" w:before="0" w:line="408"/>
+        <w:spacing w:after="113" w:before="0" w:line="360"/>
         <w:jc w:val="both"/>
       </w:pPr>
       <w:r>
         <w:rPr>
-          <w:rFonts w:ascii="Georgia" w:cs="Georgia" w:eastAsia="Georgia" w:hAnsi="Georgia"/>
+          <w:rFonts w:ascii="Arial" w:cs="Arial" w:eastAsia="Arial" w:hAnsi="Arial"/>
           <w:b w:val="false"/>
           <w:bCs w:val="false"/>
           <w:i w:val="false"/>
@@ -2513,18 +2731,37 @@
     </w:p>
     <w:p>
       <w:pPr>
-        <w:pStyle w:val="ListParagraph"/>
+        <w:widowControl w:val="false"/>
+        <w:spacing w:after="0" w:before="0" w:line="240"/>
+      </w:pPr>
+      <w:r>
+        <w:rPr>
+          <w:rFonts w:ascii="Arial" w:cs="Arial" w:eastAsia="Arial" w:hAnsi="Arial"/>
+          <w:b w:val="false"/>
+          <w:bCs w:val="false"/>
+          <w:i w:val="false"/>
+          <w:iCs w:val="false"/>
+          <w:color w:val="1C1C1C"/>
+          <w:sz w:val="20"/>
+          <w:szCs w:val="20"/>
+        </w:rPr>
+        <w:t xml:space="preserve">{#exclusions_items}</w:t>
+      </w:r>
+    </w:p>
+    <w:p>
+      <w:pPr>
+        <w:pStyle w:val="PuceBTH"/>
         <w:widowControl/>
         <w:numPr>
           <w:ilvl w:val="0"/>
           <w:numId w:val="2"/>
         </w:numPr>
-        <w:spacing w:after="80" w:before="80" w:line="384"/>
+        <w:spacing w:after="100" w:before="100" w:line="360"/>
         <w:jc w:val="both"/>
       </w:pPr>
       <w:r>
         <w:rPr>
-          <w:rFonts w:ascii="Georgia" w:cs="Georgia" w:eastAsia="Georgia" w:hAnsi="Georgia"/>
+          <w:rFonts w:ascii="Arial" w:cs="Arial" w:eastAsia="Arial" w:hAnsi="Arial"/>
           <w:b w:val="false"/>
           <w:bCs w:val="false"/>
           <w:i w:val="false"/>
@@ -2533,7 +2770,26 @@
           <w:sz w:val="19"/>
           <w:szCs w:val="19"/>
         </w:rPr>
-        <w:t xml:space="preserve">{#exclusions_items}{item}{/exclusions_items}</w:t>
+        <w:t xml:space="preserve">{item}</w:t>
+      </w:r>
+    </w:p>
+    <w:p>
+      <w:pPr>
+        <w:widowControl w:val="false"/>
+        <w:spacing w:after="0" w:before="0" w:line="240"/>
+      </w:pPr>
+      <w:r>
+        <w:rPr>
+          <w:rFonts w:ascii="Arial" w:cs="Arial" w:eastAsia="Arial" w:hAnsi="Arial"/>
+          <w:b w:val="false"/>
+          <w:bCs w:val="false"/>
+          <w:i w:val="false"/>
+          <w:iCs w:val="false"/>
+          <w:color w:val="1C1C1C"/>
+          <w:sz w:val="20"/>
+          <w:szCs w:val="20"/>
+        </w:rPr>
+        <w:t xml:space="preserve">{/exclusions_items}</w:t>
       </w:r>
     </w:p>
     <w:p>
@@ -2546,7 +2802,7 @@
       </w:pPr>
       <w:r>
         <w:rPr>
-          <w:rFonts w:ascii="Georgia" w:cs="Georgia" w:eastAsia="Georgia" w:hAnsi="Georgia"/>
+          <w:rFonts w:ascii="Arial" w:cs="Arial" w:eastAsia="Arial" w:hAnsi="Arial"/>
           <w:b w:val="false"/>
           <w:bCs w:val="false"/>
           <w:i w:val="false"/>
@@ -2560,6 +2816,7 @@
     </w:p>
     <w:p>
       <w:pPr>
+        <w:pStyle w:val="Titre1BTH"/>
         <w:keepNext/>
         <w:keepLines/>
         <w:pageBreakBefore/>
@@ -2567,11 +2824,11 @@
         <w:pBdr>
           <w:bottom w:val="single" w:color="C9A96E" w:sz="6" w:space="6"/>
         </w:pBdr>
-        <w:spacing w:after="227" w:before="397" w:line="288"/>
-      </w:pPr>
-      <w:r>
-        <w:rPr>
-          <w:rFonts w:ascii="Calibri" w:cs="Calibri" w:eastAsia="Calibri" w:hAnsi="Calibri"/>
+        <w:spacing w:after="227" w:before="0" w:line="288"/>
+      </w:pPr>
+      <w:r>
+        <w:rPr>
+          <w:rFonts w:ascii="Arial" w:cs="Arial" w:eastAsia="Arial" w:hAnsi="Arial"/>
           <w:b/>
           <w:bCs/>
           <w:i w:val="false"/>
@@ -2584,7 +2841,7 @@
       </w:r>
       <w:r>
         <w:rPr>
-          <w:rFonts w:ascii="Book Antiqua" w:cs="Book Antiqua" w:eastAsia="Book Antiqua" w:hAnsi="Book Antiqua"/>
+          <w:rFonts w:ascii="Arial" w:cs="Arial" w:eastAsia="Arial" w:hAnsi="Arial"/>
           <w:b/>
           <w:bCs/>
           <w:i w:val="false"/>
@@ -2598,14 +2855,14 @@
     </w:p>
     <w:p>
       <w:pPr>
-        <w:keepLines w:val="false"/>
+        <w:pStyle w:val="CorpsBTH"/>
         <w:widowControl/>
-        <w:spacing w:after="170" w:before="0" w:line="408"/>
+        <w:spacing w:after="170" w:before="0" w:line="360"/>
         <w:jc w:val="both"/>
       </w:pPr>
       <w:r>
         <w:rPr>
-          <w:rFonts w:ascii="Calibri" w:cs="Calibri" w:eastAsia="Calibri" w:hAnsi="Calibri"/>
+          <w:rFonts w:ascii="Arial" w:cs="Arial" w:eastAsia="Arial" w:hAnsi="Arial"/>
           <w:b/>
           <w:bCs/>
           <w:i w:val="false"/>
@@ -2618,7 +2875,7 @@
       </w:r>
       <w:r>
         <w:rPr>
-          <w:rFonts w:ascii="Georgia" w:cs="Georgia" w:eastAsia="Georgia" w:hAnsi="Georgia"/>
+          <w:rFonts w:ascii="Arial" w:cs="Arial" w:eastAsia="Arial" w:hAnsi="Arial"/>
           <w:b w:val="false"/>
           <w:bCs w:val="false"/>
           <w:i w:val="false"/>
@@ -2631,7 +2888,7 @@
       </w:r>
       <w:r>
         <w:rPr>
-          <w:rFonts w:ascii="Georgia" w:cs="Georgia" w:eastAsia="Georgia" w:hAnsi="Georgia"/>
+          <w:rFonts w:ascii="Arial" w:cs="Arial" w:eastAsia="Arial" w:hAnsi="Arial"/>
           <w:b w:val="false"/>
           <w:bCs w:val="false"/>
           <w:i w:val="false"/>
@@ -2645,14 +2902,14 @@
     </w:p>
     <w:p>
       <w:pPr>
-        <w:keepLines w:val="false"/>
+        <w:pStyle w:val="CorpsBTH"/>
         <w:widowControl/>
-        <w:spacing w:after="170" w:before="0" w:line="408"/>
+        <w:spacing w:after="170" w:before="0" w:line="360"/>
         <w:jc w:val="both"/>
       </w:pPr>
       <w:r>
         <w:rPr>
-          <w:rFonts w:ascii="Calibri" w:cs="Calibri" w:eastAsia="Calibri" w:hAnsi="Calibri"/>
+          <w:rFonts w:ascii="Arial" w:cs="Arial" w:eastAsia="Arial" w:hAnsi="Arial"/>
           <w:b/>
           <w:bCs/>
           <w:i w:val="false"/>
@@ -2665,7 +2922,7 @@
       </w:r>
       <w:r>
         <w:rPr>
-          <w:rFonts w:ascii="Georgia" w:cs="Georgia" w:eastAsia="Georgia" w:hAnsi="Georgia"/>
+          <w:rFonts w:ascii="Arial" w:cs="Arial" w:eastAsia="Arial" w:hAnsi="Arial"/>
           <w:b w:val="false"/>
           <w:bCs w:val="false"/>
           <w:i w:val="false"/>
@@ -2678,7 +2935,7 @@
       </w:r>
       <w:r>
         <w:rPr>
-          <w:rFonts w:ascii="Georgia" w:cs="Georgia" w:eastAsia="Georgia" w:hAnsi="Georgia"/>
+          <w:rFonts w:ascii="Arial" w:cs="Arial" w:eastAsia="Arial" w:hAnsi="Arial"/>
           <w:b w:val="false"/>
           <w:bCs w:val="false"/>
           <w:i w:val="false"/>
@@ -2692,14 +2949,14 @@
     </w:p>
     <w:p>
       <w:pPr>
-        <w:keepLines w:val="false"/>
+        <w:pStyle w:val="CorpsBTH"/>
         <w:widowControl/>
-        <w:spacing w:after="170" w:before="0" w:line="408"/>
+        <w:spacing w:after="170" w:before="0" w:line="360"/>
         <w:jc w:val="both"/>
       </w:pPr>
       <w:r>
         <w:rPr>
-          <w:rFonts w:ascii="Calibri" w:cs="Calibri" w:eastAsia="Calibri" w:hAnsi="Calibri"/>
+          <w:rFonts w:ascii="Arial" w:cs="Arial" w:eastAsia="Arial" w:hAnsi="Arial"/>
           <w:b/>
           <w:bCs/>
           <w:i w:val="false"/>
@@ -2708,11 +2965,11 @@
           <w:sz w:val="19"/>
           <w:szCs w:val="19"/>
         </w:rPr>
-        <w:t xml:space="preserve">Accès au site et informations</w:t>
-      </w:r>
-      <w:r>
-        <w:rPr>
-          <w:rFonts w:ascii="Georgia" w:cs="Georgia" w:eastAsia="Georgia" w:hAnsi="Georgia"/>
+        <w:t xml:space="preserve">Accès au site</w:t>
+      </w:r>
+      <w:r>
+        <w:rPr>
+          <w:rFonts w:ascii="Arial" w:cs="Arial" w:eastAsia="Arial" w:hAnsi="Arial"/>
           <w:b w:val="false"/>
           <w:bCs w:val="false"/>
           <w:i w:val="false"/>
@@ -2725,7 +2982,7 @@
       </w:r>
       <w:r>
         <w:rPr>
-          <w:rFonts w:ascii="Georgia" w:cs="Georgia" w:eastAsia="Georgia" w:hAnsi="Georgia"/>
+          <w:rFonts w:ascii="Arial" w:cs="Arial" w:eastAsia="Arial" w:hAnsi="Arial"/>
           <w:b w:val="false"/>
           <w:bCs w:val="false"/>
           <w:i w:val="false"/>
@@ -2734,19 +2991,19 @@
           <w:sz w:val="19"/>
           <w:szCs w:val="19"/>
         </w:rPr>
-        <w:t xml:space="preserve">Le client facilite l'accès au site et fournit les informations nécessaires (procédés, capacités, listes de produits, quantités stockées, plans disponibles, etc.). Les délais peuvent être ajustés en cas de retard de transmission.</w:t>
-      </w:r>
-    </w:p>
-    <w:p>
-      <w:pPr>
-        <w:keepLines w:val="false"/>
+        <w:t xml:space="preserve">Le client facilite l'accès au site et fournit les informations nécessaires. Les délais peuvent être ajustés en cas de retard de transmission.</w:t>
+      </w:r>
+    </w:p>
+    <w:p>
+      <w:pPr>
+        <w:pStyle w:val="CorpsBTH"/>
         <w:widowControl/>
-        <w:spacing w:after="170" w:before="0" w:line="408"/>
+        <w:spacing w:after="170" w:before="0" w:line="360"/>
         <w:jc w:val="both"/>
       </w:pPr>
       <w:r>
         <w:rPr>
-          <w:rFonts w:ascii="Calibri" w:cs="Calibri" w:eastAsia="Calibri" w:hAnsi="Calibri"/>
+          <w:rFonts w:ascii="Arial" w:cs="Arial" w:eastAsia="Arial" w:hAnsi="Arial"/>
           <w:b/>
           <w:bCs/>
           <w:i w:val="false"/>
@@ -2759,7 +3016,7 @@
       </w:r>
       <w:r>
         <w:rPr>
-          <w:rFonts w:ascii="Georgia" w:cs="Georgia" w:eastAsia="Georgia" w:hAnsi="Georgia"/>
+          <w:rFonts w:ascii="Arial" w:cs="Arial" w:eastAsia="Arial" w:hAnsi="Arial"/>
           <w:b w:val="false"/>
           <w:bCs w:val="false"/>
           <w:i w:val="false"/>
@@ -2772,7 +3029,7 @@
       </w:r>
       <w:r>
         <w:rPr>
-          <w:rFonts w:ascii="Georgia" w:cs="Georgia" w:eastAsia="Georgia" w:hAnsi="Georgia"/>
+          <w:rFonts w:ascii="Arial" w:cs="Arial" w:eastAsia="Arial" w:hAnsi="Arial"/>
           <w:b w:val="false"/>
           <w:bCs w:val="false"/>
           <w:i w:val="false"/>
@@ -2781,19 +3038,19 @@
           <w:sz w:val="19"/>
           <w:szCs w:val="19"/>
         </w:rPr>
-        <w:t xml:space="preserve">Une ronde de commentaires/ajustements par livrable est incluse. Toute révision majeure liée à une modification du projet, du procédé, des capacités ou des exigences administratives fera l'objet d'un avenant.</w:t>
-      </w:r>
-    </w:p>
-    <w:p>
-      <w:pPr>
-        <w:keepLines w:val="false"/>
+        <w:t xml:space="preserve">Une ronde de commentaires/ajustements par livrable est incluse. Toute révision majeure fera l'objet d'un avenant.</w:t>
+      </w:r>
+    </w:p>
+    <w:p>
+      <w:pPr>
+        <w:pStyle w:val="CorpsBTH"/>
         <w:widowControl/>
-        <w:spacing w:after="170" w:before="0" w:line="408"/>
+        <w:spacing w:after="170" w:before="0" w:line="360"/>
         <w:jc w:val="both"/>
       </w:pPr>
       <w:r>
         <w:rPr>
-          <w:rFonts w:ascii="Calibri" w:cs="Calibri" w:eastAsia="Calibri" w:hAnsi="Calibri"/>
+          <w:rFonts w:ascii="Arial" w:cs="Arial" w:eastAsia="Arial" w:hAnsi="Arial"/>
           <w:b/>
           <w:bCs/>
           <w:i w:val="false"/>
@@ -2806,7 +3063,7 @@
       </w:r>
       <w:r>
         <w:rPr>
-          <w:rFonts w:ascii="Georgia" w:cs="Georgia" w:eastAsia="Georgia" w:hAnsi="Georgia"/>
+          <w:rFonts w:ascii="Arial" w:cs="Arial" w:eastAsia="Arial" w:hAnsi="Arial"/>
           <w:b w:val="false"/>
           <w:bCs w:val="false"/>
           <w:i w:val="false"/>
@@ -2819,7 +3076,7 @@
       </w:r>
       <w:r>
         <w:rPr>
-          <w:rFonts w:ascii="Georgia" w:cs="Georgia" w:eastAsia="Georgia" w:hAnsi="Georgia"/>
+          <w:rFonts w:ascii="Arial" w:cs="Arial" w:eastAsia="Arial" w:hAnsi="Arial"/>
           <w:b w:val="false"/>
           <w:bCs w:val="false"/>
           <w:i w:val="false"/>
@@ -2828,19 +3085,19 @@
           <w:sz w:val="19"/>
           <w:szCs w:val="19"/>
         </w:rPr>
-        <w:t xml:space="preserve">Le consultant s'engage à produire des livrables conformes aux exigences réglementaires applicables. L'obtention de l'autorisation ou du permis demeure conditionnée à l'instruction et à la décision de l'autorité compétente.</w:t>
-      </w:r>
-    </w:p>
-    <w:p>
-      <w:pPr>
-        <w:keepLines w:val="false"/>
+        <w:t xml:space="preserve">Le consultant s'engage à produire des livrables conformes aux exigences réglementaires applicables. L'obtention de l'autorisation demeure conditionnée à la décision de l'autorité compétente.</w:t>
+      </w:r>
+    </w:p>
+    <w:p>
+      <w:pPr>
+        <w:pStyle w:val="CorpsBTH"/>
         <w:widowControl/>
-        <w:spacing w:after="170" w:before="0" w:line="408"/>
+        <w:spacing w:after="170" w:before="0" w:line="360"/>
         <w:jc w:val="both"/>
       </w:pPr>
       <w:r>
         <w:rPr>
-          <w:rFonts w:ascii="Calibri" w:cs="Calibri" w:eastAsia="Calibri" w:hAnsi="Calibri"/>
+          <w:rFonts w:ascii="Arial" w:cs="Arial" w:eastAsia="Arial" w:hAnsi="Arial"/>
           <w:b/>
           <w:bCs/>
           <w:i w:val="false"/>
@@ -2853,7 +3110,7 @@
       </w:r>
       <w:r>
         <w:rPr>
-          <w:rFonts w:ascii="Georgia" w:cs="Georgia" w:eastAsia="Georgia" w:hAnsi="Georgia"/>
+          <w:rFonts w:ascii="Arial" w:cs="Arial" w:eastAsia="Arial" w:hAnsi="Arial"/>
           <w:b w:val="false"/>
           <w:bCs w:val="false"/>
           <w:i w:val="false"/>
@@ -2866,7 +3123,7 @@
       </w:r>
       <w:r>
         <w:rPr>
-          <w:rFonts w:ascii="Georgia" w:cs="Georgia" w:eastAsia="Georgia" w:hAnsi="Georgia"/>
+          <w:rFonts w:ascii="Arial" w:cs="Arial" w:eastAsia="Arial" w:hAnsi="Arial"/>
           <w:b w:val="false"/>
           <w:bCs w:val="false"/>
           <w:i w:val="false"/>
@@ -2888,7 +3145,7 @@
       </w:pPr>
       <w:r>
         <w:rPr>
-          <w:rFonts w:ascii="Georgia" w:cs="Georgia" w:eastAsia="Georgia" w:hAnsi="Georgia"/>
+          <w:rFonts w:ascii="Arial" w:cs="Arial" w:eastAsia="Arial" w:hAnsi="Arial"/>
           <w:b w:val="false"/>
           <w:bCs w:val="false"/>
           <w:i w:val="false"/>
@@ -2902,15 +3159,16 @@
     </w:p>
     <w:p>
       <w:pPr>
+        <w:pStyle w:val="CorpsBTH"/>
         <w:keepNext w:val="false"/>
         <w:keepLines w:val="false"/>
         <w:widowControl/>
-        <w:spacing w:after="227" w:before="0" w:line="408"/>
+        <w:spacing w:after="227" w:before="0" w:line="360"/>
         <w:jc w:val="both"/>
       </w:pPr>
       <w:r>
         <w:rPr>
-          <w:rFonts w:ascii="Georgia" w:cs="Georgia" w:eastAsia="Georgia" w:hAnsi="Georgia"/>
+          <w:rFonts w:ascii="Arial" w:cs="Arial" w:eastAsia="Arial" w:hAnsi="Arial"/>
           <w:b w:val="false"/>
           <w:bCs w:val="false"/>
           <w:i w:val="false"/>
@@ -2924,15 +3182,16 @@
     </w:p>
     <w:p>
       <w:pPr>
+        <w:pStyle w:val="CorpsBTH"/>
         <w:keepNext w:val="false"/>
         <w:keepLines w:val="false"/>
         <w:widowControl/>
-        <w:spacing w:after="227" w:before="0" w:line="408"/>
+        <w:spacing w:after="227" w:before="0" w:line="360"/>
         <w:jc w:val="both"/>
       </w:pPr>
       <w:r>
         <w:rPr>
-          <w:rFonts w:ascii="Georgia" w:cs="Georgia" w:eastAsia="Georgia" w:hAnsi="Georgia"/>
+          <w:rFonts w:ascii="Arial" w:cs="Arial" w:eastAsia="Arial" w:hAnsi="Arial"/>
           <w:b w:val="false"/>
           <w:bCs w:val="false"/>
           <w:i w:val="false"/>
@@ -2954,7 +3213,7 @@
       </w:pPr>
       <w:r>
         <w:rPr>
-          <w:rFonts w:ascii="Georgia" w:cs="Georgia" w:eastAsia="Georgia" w:hAnsi="Georgia"/>
+          <w:rFonts w:ascii="Arial" w:cs="Arial" w:eastAsia="Arial" w:hAnsi="Arial"/>
           <w:b w:val="false"/>
           <w:bCs w:val="false"/>
           <w:i w:val="false"/>
@@ -3009,7 +3268,7 @@
             </w:pPr>
             <w:r>
               <w:rPr>
-                <w:rFonts w:ascii="Calibri" w:cs="Calibri" w:eastAsia="Calibri" w:hAnsi="Calibri"/>
+                <w:rFonts w:ascii="Arial" w:cs="Arial" w:eastAsia="Arial" w:hAnsi="Arial"/>
                 <w:b w:val="false"/>
                 <w:bCs w:val="false"/>
                 <w:i w:val="false"/>
@@ -3031,7 +3290,7 @@
             </w:pPr>
             <w:r>
               <w:rPr>
-                <w:rFonts w:ascii="Georgia" w:cs="Georgia" w:eastAsia="Georgia" w:hAnsi="Georgia"/>
+                <w:rFonts w:ascii="Arial" w:cs="Arial" w:eastAsia="Arial" w:hAnsi="Arial"/>
                 <w:b w:val="false"/>
                 <w:bCs w:val="false"/>
                 <w:i w:val="false"/>
@@ -3053,7 +3312,7 @@
             </w:pPr>
             <w:r>
               <w:rPr>
-                <w:rFonts w:ascii="Calibri" w:cs="Calibri" w:eastAsia="Calibri" w:hAnsi="Calibri"/>
+                <w:rFonts w:ascii="Arial" w:cs="Arial" w:eastAsia="Arial" w:hAnsi="Arial"/>
                 <w:b/>
                 <w:bCs/>
                 <w:i w:val="false"/>
@@ -3075,7 +3334,7 @@
             </w:pPr>
             <w:r>
               <w:rPr>
-                <w:rFonts w:ascii="Georgia" w:cs="Georgia" w:eastAsia="Georgia" w:hAnsi="Georgia"/>
+                <w:rFonts w:ascii="Arial" w:cs="Arial" w:eastAsia="Arial" w:hAnsi="Arial"/>
                 <w:b w:val="false"/>
                 <w:bCs w:val="false"/>
                 <w:i w:val="false"/>
@@ -3114,7 +3373,7 @@
             </w:pPr>
             <w:r>
               <w:rPr>
-                <w:rFonts w:ascii="Calibri" w:cs="Calibri" w:eastAsia="Calibri" w:hAnsi="Calibri"/>
+                <w:rFonts w:ascii="Arial" w:cs="Arial" w:eastAsia="Arial" w:hAnsi="Arial"/>
                 <w:b w:val="false"/>
                 <w:bCs w:val="false"/>
                 <w:i w:val="false"/>
@@ -3136,7 +3395,7 @@
             </w:pPr>
             <w:r>
               <w:rPr>
-                <w:rFonts w:ascii="Georgia" w:cs="Georgia" w:eastAsia="Georgia" w:hAnsi="Georgia"/>
+                <w:rFonts w:ascii="Arial" w:cs="Arial" w:eastAsia="Arial" w:hAnsi="Arial"/>
                 <w:b w:val="false"/>
                 <w:bCs w:val="false"/>
                 <w:i w:val="false"/>
@@ -3158,7 +3417,7 @@
             </w:pPr>
             <w:r>
               <w:rPr>
-                <w:rFonts w:ascii="Calibri" w:cs="Calibri" w:eastAsia="Calibri" w:hAnsi="Calibri"/>
+                <w:rFonts w:ascii="Arial" w:cs="Arial" w:eastAsia="Arial" w:hAnsi="Arial"/>
                 <w:b/>
                 <w:bCs/>
                 <w:i w:val="false"/>
@@ -3180,7 +3439,7 @@
             </w:pPr>
             <w:r>
               <w:rPr>
-                <w:rFonts w:ascii="Georgia" w:cs="Georgia" w:eastAsia="Georgia" w:hAnsi="Georgia"/>
+                <w:rFonts w:ascii="Arial" w:cs="Arial" w:eastAsia="Arial" w:hAnsi="Arial"/>
                 <w:b w:val="false"/>
                 <w:bCs w:val="false"/>
                 <w:i w:val="false"/>
@@ -3199,7 +3458,7 @@
       <w:headerReference w:type="default" r:id="rId7"/>
       <w:footerReference w:type="default" r:id="rId8"/>
       <w:pgSz w:w="11906" w:h="16838" w:orient="portrait"/>
-      <w:pgMar w:top="1361" w:right="1134" w:bottom="1134" w:left="1247" w:header="454" w:footer="680" w:gutter="0"/>
+      <w:pgMar w:top="1928" w:right="1134" w:bottom="1134" w:left="1247" w:header="454" w:footer="680" w:gutter="0"/>
       <w:pgNumType w:start="1" w:fmt="decimal"/>
       <w:docGrid w:linePitch="360"/>
     </w:sectPr>
@@ -3482,7 +3741,7 @@
         <w:ind w:left="454" w:hanging="284"/>
       </w:pPr>
       <w:rPr>
-        <w:rFonts w:ascii="Georgia" w:cs="Georgia" w:eastAsia="Georgia" w:hAnsi="Georgia"/>
+        <w:rFonts w:ascii="Arial" w:cs="Arial" w:eastAsia="Arial" w:hAnsi="Arial"/>
         <w:color w:val="C9A96E"/>
         <w:sz w:val="16"/>
         <w:szCs w:val="16"/>
@@ -3509,13 +3768,17 @@
   <w:docDefaults>
     <w:rPrDefault>
       <w:rPr>
-        <w:rFonts w:ascii="Georgia" w:cs="Georgia" w:eastAsia="Georgia" w:hAnsi="Georgia"/>
+        <w:rFonts w:ascii="Arial" w:cs="Arial" w:eastAsia="Arial" w:hAnsi="Arial"/>
         <w:color w:val="1C1C1C"/>
         <w:sz w:val="20"/>
         <w:szCs w:val="20"/>
       </w:rPr>
     </w:rPrDefault>
-    <w:pPrDefault/>
+    <w:pPrDefault>
+      <w:pPr>
+        <w:spacing w:line="360"/>
+      </w:pPr>
+    </w:pPrDefault>
   </w:docDefaults>
   <w:style w:type="paragraph" w:styleId="Title">
     <w:name w:val="Title"/>
@@ -3688,5 +3951,105 @@
       <w:szCs w:val="20"/>
     </w:rPr>
   </w:style>
+  <w:style w:type="paragraph" w:styleId="CorpsBTH">
+    <w:name w:val="Corps BTH"/>
+    <w:basedOn w:val="Normal"/>
+    <w:qFormat/>
+    <w:pPr>
+      <w:widowControl/>
+      <w:spacing w:after="227" w:line="360"/>
+      <w:jc w:val="both"/>
+    </w:pPr>
+    <w:rPr>
+      <w:rFonts w:ascii="Arial" w:cs="Arial" w:eastAsia="Arial" w:hAnsi="Arial"/>
+      <w:color w:val="1C1C1C"/>
+      <w:sz w:val="20"/>
+      <w:szCs w:val="20"/>
+    </w:rPr>
+  </w:style>
+  <w:style w:type="paragraph" w:styleId="Titre1BTH">
+    <w:name w:val="Titre 1 BTH"/>
+    <w:basedOn w:val="Heading1"/>
+    <w:qFormat/>
+    <w:pPr>
+      <w:keepNext/>
+      <w:keepLines/>
+      <w:spacing w:after="227" w:before="567" w:line="288"/>
+    </w:pPr>
+    <w:rPr>
+      <w:rFonts w:ascii="Arial" w:cs="Arial" w:eastAsia="Arial" w:hAnsi="Arial"/>
+      <w:b/>
+      <w:bCs/>
+      <w:color w:val="1A2E1E"/>
+      <w:sz w:val="26"/>
+      <w:szCs w:val="26"/>
+    </w:rPr>
+  </w:style>
+  <w:style w:type="paragraph" w:styleId="Titre2BTH">
+    <w:name w:val="Titre 2 BTH"/>
+    <w:basedOn w:val="Heading2"/>
+    <w:qFormat/>
+    <w:pPr>
+      <w:keepNext/>
+      <w:keepLines/>
+      <w:spacing w:after="170" w:before="397" w:line="288"/>
+    </w:pPr>
+    <w:rPr>
+      <w:rFonts w:ascii="Arial" w:cs="Arial" w:eastAsia="Arial" w:hAnsi="Arial"/>
+      <w:color w:val="2D4A30"/>
+      <w:sz w:val="21"/>
+      <w:szCs w:val="21"/>
+    </w:rPr>
+  </w:style>
+  <w:style w:type="paragraph" w:styleId="PuceBTH">
+    <w:name w:val="Puce BTH"/>
+    <w:basedOn w:val="ListParagraph"/>
+    <w:qFormat/>
+    <w:pPr>
+      <w:spacing w:after="100" w:before="100" w:line="360"/>
+      <w:ind w:left="454" w:hanging="284"/>
+      <w:jc w:val="both"/>
+    </w:pPr>
+    <w:rPr>
+      <w:rFonts w:ascii="Arial" w:cs="Arial" w:eastAsia="Arial" w:hAnsi="Arial"/>
+      <w:color w:val="1C1C1C"/>
+      <w:sz w:val="19"/>
+      <w:szCs w:val="19"/>
+    </w:rPr>
+  </w:style>
+  <w:style w:type="paragraph" w:styleId="CalloutBTH">
+    <w:name w:val="Callout BTH"/>
+    <w:basedOn w:val="Normal"/>
+    <w:qFormat/>
+    <w:pPr>
+      <w:spacing w:line="360"/>
+      <w:jc w:val="both"/>
+    </w:pPr>
+    <w:rPr>
+      <w:rFonts w:ascii="Arial" w:cs="Arial" w:eastAsia="Arial" w:hAnsi="Arial"/>
+      <w:i w:val="false"/>
+      <w:iCs w:val="false"/>
+      <w:color w:val="1C1C1C"/>
+      <w:sz w:val="20"/>
+      <w:szCs w:val="20"/>
+    </w:rPr>
+  </w:style>
+  <w:style w:type="paragraph" w:styleId="TitreTableauBTH">
+    <w:name w:val="Titre Tableau BTH"/>
+    <w:basedOn w:val="Normal"/>
+    <w:qFormat/>
+    <w:pPr>
+      <w:keepNext/>
+      <w:spacing w:after="142" w:before="340" w:line="288"/>
+    </w:pPr>
+    <w:rPr>
+      <w:rFonts w:ascii="Arial" w:cs="Arial" w:eastAsia="Arial" w:hAnsi="Arial"/>
+      <w:b/>
+      <w:bCs/>
+      <w:color w:val="1A2E1E"/>
+      <w:sz w:val="20"/>
+      <w:szCs w:val="20"/>
+    </w:rPr>
+  </w:style>
 </w:styles>
 </file>
</xml_diff>

<commit_message>
fix(export): auto-generate intro_paragraphe, callout_objectif and perimetre_items
Co-Authored-By: Claude Sonnet 4.6 <noreply@anthropic.com>
</commit_message>
<xml_diff>
--- a/templates/template-standard-v2.docx
+++ b/templates/template-standard-v2.docx
@@ -338,13 +338,13 @@
         </w:tblBorders>
       </w:tblPr>
       <w:tblGrid>
-        <w:gridCol w:w="1247"/>
-        <w:gridCol w:w="8278"/>
+        <w:gridCol w:w="1701"/>
+        <w:gridCol w:w="7824"/>
       </w:tblGrid>
       <w:tr>
         <w:tc>
           <w:tcPr>
-            <w:tcW w:type="dxa" w:w="1247"/>
+            <w:tcW w:type="dxa" w:w="1701"/>
             <w:tcBorders>
               <w:top w:val="none" w:color="FFFFFF" w:sz="0"/>
               <w:left w:val="none" w:color="FFFFFF" w:sz="0"/>
@@ -355,7 +355,7 @@
               <w:top w:type="dxa" w:w="0"/>
               <w:left w:type="dxa" w:w="0"/>
               <w:bottom w:type="dxa" w:w="0"/>
-              <w:right w:type="dxa" w:w="340"/>
+              <w:right w:type="dxa" w:w="454"/>
             </w:tcMar>
             <w:vAlign w:val="top"/>
           </w:tcPr>
@@ -397,8 +397,8 @@
                 <w:i w:val="false"/>
                 <w:iCs w:val="false"/>
                 <w:color w:val="4A4A4A"/>
-                <w:sz w:val="17"/>
-                <w:szCs w:val="17"/>
+                <w:sz w:val="19"/>
+                <w:szCs w:val="19"/>
               </w:rPr>
               <w:t xml:space="preserve">{date_offre}</w:t>
             </w:r>
@@ -406,7 +406,7 @@
         </w:tc>
         <w:tc>
           <w:tcPr>
-            <w:tcW w:type="dxa" w:w="8278"/>
+            <w:tcW w:type="dxa" w:w="7824"/>
             <w:tcBorders>
               <w:top w:val="none" w:color="FFFFFF" w:sz="0"/>
               <w:left w:val="none" w:color="FFFFFF" w:sz="0"/>
@@ -552,7 +552,7 @@
           </w:p>
           <w:tbl>
             <w:tblPr>
-              <w:tblW w:type="dxa" w:w="7938"/>
+              <w:tblW w:type="dxa" w:w="7370"/>
               <w:tblBorders>
                 <w:top w:val="single" w:color="auto" w:sz="4"/>
                 <w:left w:val="single" w:color="auto" w:sz="4"/>
@@ -563,12 +563,12 @@
               </w:tblBorders>
             </w:tblPr>
             <w:tblGrid>
-              <w:gridCol w:w="7938"/>
+              <w:gridCol w:w="7370"/>
             </w:tblGrid>
             <w:tr>
               <w:tc>
                 <w:tcPr>
-                  <w:tcW w:type="dxa" w:w="7938"/>
+                  <w:tcW w:type="dxa" w:w="7370"/>
                   <w:tcBorders>
                     <w:top w:val="none" w:color="FFFFFF" w:sz="0"/>
                     <w:left w:val="single" w:color="C9A96E" w:sz="16"/>
@@ -1383,10 +1383,10 @@
             </w:tcBorders>
             <w:shd w:fill="F0EDE6" w:val="clear"/>
             <w:tcMar>
-              <w:top w:type="dxa" w:w="160"/>
-              <w:left w:type="dxa" w:w="170"/>
-              <w:bottom w:type="dxa" w:w="160"/>
-              <w:right w:type="dxa" w:w="170"/>
+              <w:top w:type="dxa" w:w="200"/>
+              <w:left w:type="dxa" w:w="200"/>
+              <w:bottom w:type="dxa" w:w="200"/>
+              <w:right w:type="dxa" w:w="200"/>
             </w:tcMar>
             <w:vAlign w:val="top"/>
           </w:tcPr>
@@ -1403,8 +1403,8 @@
                 <w:i w:val="false"/>
                 <w:iCs w:val="false"/>
                 <w:color w:val="1A2E1E"/>
-                <w:sz w:val="17"/>
-                <w:szCs w:val="17"/>
+                <w:sz w:val="20"/>
+                <w:szCs w:val="20"/>
               </w:rPr>
               <w:t xml:space="preserve">N°</w:t>
             </w:r>
@@ -1422,10 +1422,10 @@
             </w:tcBorders>
             <w:shd w:fill="F0EDE6" w:val="clear"/>
             <w:tcMar>
-              <w:top w:type="dxa" w:w="160"/>
-              <w:left w:type="dxa" w:w="170"/>
-              <w:bottom w:type="dxa" w:w="160"/>
-              <w:right w:type="dxa" w:w="170"/>
+              <w:top w:type="dxa" w:w="200"/>
+              <w:left w:type="dxa" w:w="200"/>
+              <w:bottom w:type="dxa" w:w="200"/>
+              <w:right w:type="dxa" w:w="200"/>
             </w:tcMar>
             <w:vAlign w:val="top"/>
           </w:tcPr>
@@ -1442,8 +1442,8 @@
                 <w:i w:val="false"/>
                 <w:iCs w:val="false"/>
                 <w:color w:val="1A2E1E"/>
-                <w:sz w:val="17"/>
-                <w:szCs w:val="17"/>
+                <w:sz w:val="20"/>
+                <w:szCs w:val="20"/>
               </w:rPr>
               <w:t xml:space="preserve">Désignation</w:t>
             </w:r>
@@ -1461,10 +1461,10 @@
             </w:tcBorders>
             <w:shd w:fill="F0EDE6" w:val="clear"/>
             <w:tcMar>
-              <w:top w:type="dxa" w:w="160"/>
-              <w:left w:type="dxa" w:w="170"/>
-              <w:bottom w:type="dxa" w:w="160"/>
-              <w:right w:type="dxa" w:w="170"/>
+              <w:top w:type="dxa" w:w="200"/>
+              <w:left w:type="dxa" w:w="200"/>
+              <w:bottom w:type="dxa" w:w="200"/>
+              <w:right w:type="dxa" w:w="200"/>
             </w:tcMar>
             <w:vAlign w:val="top"/>
           </w:tcPr>
@@ -1481,8 +1481,8 @@
                 <w:i w:val="false"/>
                 <w:iCs w:val="false"/>
                 <w:color w:val="1A2E1E"/>
-                <w:sz w:val="17"/>
-                <w:szCs w:val="17"/>
+                <w:sz w:val="20"/>
+                <w:szCs w:val="20"/>
               </w:rPr>
               <w:t xml:space="preserve">Q</w:t>
             </w:r>
@@ -1500,10 +1500,10 @@
             </w:tcBorders>
             <w:shd w:fill="F0EDE6" w:val="clear"/>
             <w:tcMar>
-              <w:top w:type="dxa" w:w="160"/>
-              <w:left w:type="dxa" w:w="170"/>
-              <w:bottom w:type="dxa" w:w="160"/>
-              <w:right w:type="dxa" w:w="170"/>
+              <w:top w:type="dxa" w:w="200"/>
+              <w:left w:type="dxa" w:w="200"/>
+              <w:bottom w:type="dxa" w:w="200"/>
+              <w:right w:type="dxa" w:w="200"/>
             </w:tcMar>
             <w:vAlign w:val="top"/>
           </w:tcPr>
@@ -1520,8 +1520,8 @@
                 <w:i w:val="false"/>
                 <w:iCs w:val="false"/>
                 <w:color w:val="1A2E1E"/>
-                <w:sz w:val="17"/>
-                <w:szCs w:val="17"/>
+                <w:sz w:val="20"/>
+                <w:szCs w:val="20"/>
               </w:rPr>
               <w:t xml:space="preserve">Prix</w:t>
             </w:r>
@@ -1543,10 +1543,10 @@
               <w:right w:val="single" w:color="DCE8DC" w:sz="4"/>
             </w:tcBorders>
             <w:tcMar>
-              <w:top w:type="dxa" w:w="160"/>
-              <w:left w:type="dxa" w:w="170"/>
-              <w:bottom w:type="dxa" w:w="160"/>
-              <w:right w:type="dxa" w:w="170"/>
+              <w:top w:type="dxa" w:w="200"/>
+              <w:left w:type="dxa" w:w="200"/>
+              <w:bottom w:type="dxa" w:w="200"/>
+              <w:right w:type="dxa" w:w="200"/>
             </w:tcMar>
             <w:vAlign w:val="top"/>
           </w:tcPr>
@@ -1563,8 +1563,8 @@
                 <w:i w:val="false"/>
                 <w:iCs w:val="false"/>
                 <w:color w:val="1A2E1E"/>
-                <w:sz w:val="18"/>
-                <w:szCs w:val="18"/>
+                <w:sz w:val="20"/>
+                <w:szCs w:val="20"/>
               </w:rPr>
               <w:t xml:space="preserve">{#lignes}{numero}</w:t>
             </w:r>
@@ -1581,10 +1581,10 @@
               <w:right w:val="single" w:color="DCE8DC" w:sz="4"/>
             </w:tcBorders>
             <w:tcMar>
-              <w:top w:type="dxa" w:w="160"/>
-              <w:left w:type="dxa" w:w="170"/>
-              <w:bottom w:type="dxa" w:w="160"/>
-              <w:right w:type="dxa" w:w="170"/>
+              <w:top w:type="dxa" w:w="200"/>
+              <w:left w:type="dxa" w:w="200"/>
+              <w:bottom w:type="dxa" w:w="200"/>
+              <w:right w:type="dxa" w:w="200"/>
             </w:tcMar>
             <w:vAlign w:val="top"/>
           </w:tcPr>
@@ -1601,8 +1601,8 @@
                 <w:i w:val="false"/>
                 <w:iCs w:val="false"/>
                 <w:color w:val="1C1C1C"/>
-                <w:sz w:val="18"/>
-                <w:szCs w:val="18"/>
+                <w:sz w:val="20"/>
+                <w:szCs w:val="20"/>
               </w:rPr>
               <w:t xml:space="preserve">{designation}</w:t>
             </w:r>
@@ -1619,10 +1619,10 @@
               <w:right w:val="single" w:color="DCE8DC" w:sz="4"/>
             </w:tcBorders>
             <w:tcMar>
-              <w:top w:type="dxa" w:w="160"/>
-              <w:left w:type="dxa" w:w="170"/>
-              <w:bottom w:type="dxa" w:w="160"/>
-              <w:right w:type="dxa" w:w="170"/>
+              <w:top w:type="dxa" w:w="200"/>
+              <w:left w:type="dxa" w:w="200"/>
+              <w:bottom w:type="dxa" w:w="200"/>
+              <w:right w:type="dxa" w:w="200"/>
             </w:tcMar>
             <w:vAlign w:val="top"/>
           </w:tcPr>
@@ -1639,8 +1639,8 @@
                 <w:i w:val="false"/>
                 <w:iCs w:val="false"/>
                 <w:color w:val="1C1C1C"/>
-                <w:sz w:val="18"/>
-                <w:szCs w:val="18"/>
+                <w:sz w:val="20"/>
+                <w:szCs w:val="20"/>
               </w:rPr>
               <w:t xml:space="preserve">{quantite}</w:t>
             </w:r>
@@ -1657,10 +1657,10 @@
               <w:right w:val="single" w:color="DCE8DC" w:sz="4"/>
             </w:tcBorders>
             <w:tcMar>
-              <w:top w:type="dxa" w:w="160"/>
-              <w:left w:type="dxa" w:w="170"/>
-              <w:bottom w:type="dxa" w:w="160"/>
-              <w:right w:type="dxa" w:w="170"/>
+              <w:top w:type="dxa" w:w="200"/>
+              <w:left w:type="dxa" w:w="200"/>
+              <w:bottom w:type="dxa" w:w="200"/>
+              <w:right w:type="dxa" w:w="200"/>
             </w:tcMar>
             <w:vAlign w:val="top"/>
           </w:tcPr>
@@ -1677,8 +1677,8 @@
                 <w:i w:val="false"/>
                 <w:iCs w:val="false"/>
                 <w:color w:val="1C1C1C"/>
-                <w:sz w:val="18"/>
-                <w:szCs w:val="18"/>
+                <w:sz w:val="20"/>
+                <w:szCs w:val="20"/>
               </w:rPr>
               <w:t xml:space="preserve">{prix_formate}{/lignes}</w:t>
             </w:r>
@@ -1720,8 +1720,8 @@
                 <w:i w:val="false"/>
                 <w:iCs w:val="false"/>
                 <w:color w:val="1A2E1E"/>
-                <w:sz w:val="17"/>
-                <w:szCs w:val="17"/>
+                <w:sz w:val="20"/>
+                <w:szCs w:val="20"/>
               </w:rPr>
               <w:t xml:space="preserve">Total hors taxes</w:t>
             </w:r>
@@ -1739,10 +1739,10 @@
             </w:tcBorders>
             <w:shd w:fill="F0EDE6" w:val="clear"/>
             <w:tcMar>
-              <w:top w:type="dxa" w:w="160"/>
-              <w:left w:type="dxa" w:w="170"/>
-              <w:bottom w:type="dxa" w:w="160"/>
-              <w:right w:type="dxa" w:w="170"/>
+              <w:top w:type="dxa" w:w="200"/>
+              <w:left w:type="dxa" w:w="200"/>
+              <w:bottom w:type="dxa" w:w="200"/>
+              <w:right w:type="dxa" w:w="200"/>
             </w:tcMar>
             <w:vAlign w:val="top"/>
           </w:tcPr>
@@ -1759,8 +1759,8 @@
                 <w:i w:val="false"/>
                 <w:iCs w:val="false"/>
                 <w:color w:val="1A2E1E"/>
-                <w:sz w:val="17"/>
-                <w:szCs w:val="17"/>
+                <w:sz w:val="20"/>
+                <w:szCs w:val="20"/>
               </w:rPr>
               <w:t xml:space="preserve">{sous_total_formate}</w:t>
             </w:r>
@@ -1843,10 +1843,10 @@
             </w:tcBorders>
             <w:shd w:fill="F0EDE6" w:val="clear"/>
             <w:tcMar>
-              <w:top w:type="dxa" w:w="160"/>
-              <w:left w:type="dxa" w:w="170"/>
-              <w:bottom w:type="dxa" w:w="160"/>
-              <w:right w:type="dxa" w:w="170"/>
+              <w:top w:type="dxa" w:w="200"/>
+              <w:left w:type="dxa" w:w="200"/>
+              <w:bottom w:type="dxa" w:w="200"/>
+              <w:right w:type="dxa" w:w="200"/>
             </w:tcMar>
             <w:vAlign w:val="top"/>
           </w:tcPr>
@@ -1863,8 +1863,8 @@
                 <w:i w:val="false"/>
                 <w:iCs w:val="false"/>
                 <w:color w:val="1A2E1E"/>
-                <w:sz w:val="17"/>
-                <w:szCs w:val="17"/>
+                <w:sz w:val="20"/>
+                <w:szCs w:val="20"/>
               </w:rPr>
               <w:t xml:space="preserve">N°</w:t>
             </w:r>
@@ -1882,10 +1882,10 @@
             </w:tcBorders>
             <w:shd w:fill="F0EDE6" w:val="clear"/>
             <w:tcMar>
-              <w:top w:type="dxa" w:w="160"/>
-              <w:left w:type="dxa" w:w="170"/>
-              <w:bottom w:type="dxa" w:w="160"/>
-              <w:right w:type="dxa" w:w="170"/>
+              <w:top w:type="dxa" w:w="200"/>
+              <w:left w:type="dxa" w:w="200"/>
+              <w:bottom w:type="dxa" w:w="200"/>
+              <w:right w:type="dxa" w:w="200"/>
             </w:tcMar>
             <w:vAlign w:val="top"/>
           </w:tcPr>
@@ -1902,8 +1902,8 @@
                 <w:i w:val="false"/>
                 <w:iCs w:val="false"/>
                 <w:color w:val="1A2E1E"/>
-                <w:sz w:val="17"/>
-                <w:szCs w:val="17"/>
+                <w:sz w:val="20"/>
+                <w:szCs w:val="20"/>
               </w:rPr>
               <w:t xml:space="preserve">Désignation</w:t>
             </w:r>
@@ -1921,10 +1921,10 @@
             </w:tcBorders>
             <w:shd w:fill="F0EDE6" w:val="clear"/>
             <w:tcMar>
-              <w:top w:type="dxa" w:w="160"/>
-              <w:left w:type="dxa" w:w="170"/>
-              <w:bottom w:type="dxa" w:w="160"/>
-              <w:right w:type="dxa" w:w="170"/>
+              <w:top w:type="dxa" w:w="200"/>
+              <w:left w:type="dxa" w:w="200"/>
+              <w:bottom w:type="dxa" w:w="200"/>
+              <w:right w:type="dxa" w:w="200"/>
             </w:tcMar>
             <w:vAlign w:val="top"/>
           </w:tcPr>
@@ -1941,8 +1941,8 @@
                 <w:i w:val="false"/>
                 <w:iCs w:val="false"/>
                 <w:color w:val="1A2E1E"/>
-                <w:sz w:val="17"/>
-                <w:szCs w:val="17"/>
+                <w:sz w:val="20"/>
+                <w:szCs w:val="20"/>
               </w:rPr>
               <w:t xml:space="preserve">Q</w:t>
             </w:r>
@@ -1960,10 +1960,10 @@
             </w:tcBorders>
             <w:shd w:fill="F0EDE6" w:val="clear"/>
             <w:tcMar>
-              <w:top w:type="dxa" w:w="160"/>
-              <w:left w:type="dxa" w:w="170"/>
-              <w:bottom w:type="dxa" w:w="160"/>
-              <w:right w:type="dxa" w:w="170"/>
+              <w:top w:type="dxa" w:w="200"/>
+              <w:left w:type="dxa" w:w="200"/>
+              <w:bottom w:type="dxa" w:w="200"/>
+              <w:right w:type="dxa" w:w="200"/>
             </w:tcMar>
             <w:vAlign w:val="top"/>
           </w:tcPr>
@@ -1980,8 +1980,8 @@
                 <w:i w:val="false"/>
                 <w:iCs w:val="false"/>
                 <w:color w:val="1A2E1E"/>
-                <w:sz w:val="17"/>
-                <w:szCs w:val="17"/>
+                <w:sz w:val="20"/>
+                <w:szCs w:val="20"/>
               </w:rPr>
               <w:t xml:space="preserve">Prix</w:t>
             </w:r>
@@ -2003,10 +2003,10 @@
               <w:right w:val="single" w:color="DCE8DC" w:sz="4"/>
             </w:tcBorders>
             <w:tcMar>
-              <w:top w:type="dxa" w:w="160"/>
-              <w:left w:type="dxa" w:w="170"/>
-              <w:bottom w:type="dxa" w:w="160"/>
-              <w:right w:type="dxa" w:w="170"/>
+              <w:top w:type="dxa" w:w="200"/>
+              <w:left w:type="dxa" w:w="200"/>
+              <w:bottom w:type="dxa" w:w="200"/>
+              <w:right w:type="dxa" w:w="200"/>
             </w:tcMar>
             <w:vAlign w:val="top"/>
           </w:tcPr>
@@ -2023,8 +2023,8 @@
                 <w:i w:val="false"/>
                 <w:iCs w:val="false"/>
                 <w:color w:val="1A2E1E"/>
-                <w:sz w:val="18"/>
-                <w:szCs w:val="18"/>
+                <w:sz w:val="20"/>
+                <w:szCs w:val="20"/>
               </w:rPr>
               <w:t xml:space="preserve">{#recap_lignes}{numero}</w:t>
             </w:r>
@@ -2041,10 +2041,10 @@
               <w:right w:val="single" w:color="DCE8DC" w:sz="4"/>
             </w:tcBorders>
             <w:tcMar>
-              <w:top w:type="dxa" w:w="160"/>
-              <w:left w:type="dxa" w:w="170"/>
-              <w:bottom w:type="dxa" w:w="160"/>
-              <w:right w:type="dxa" w:w="170"/>
+              <w:top w:type="dxa" w:w="200"/>
+              <w:left w:type="dxa" w:w="200"/>
+              <w:bottom w:type="dxa" w:w="200"/>
+              <w:right w:type="dxa" w:w="200"/>
             </w:tcMar>
             <w:vAlign w:val="top"/>
           </w:tcPr>
@@ -2061,8 +2061,8 @@
                 <w:i w:val="false"/>
                 <w:iCs w:val="false"/>
                 <w:color w:val="1C1C1C"/>
-                <w:sz w:val="18"/>
-                <w:szCs w:val="18"/>
+                <w:sz w:val="20"/>
+                <w:szCs w:val="20"/>
               </w:rPr>
               <w:t xml:space="preserve">{designation}</w:t>
             </w:r>
@@ -2079,10 +2079,10 @@
               <w:right w:val="single" w:color="DCE8DC" w:sz="4"/>
             </w:tcBorders>
             <w:tcMar>
-              <w:top w:type="dxa" w:w="160"/>
-              <w:left w:type="dxa" w:w="170"/>
-              <w:bottom w:type="dxa" w:w="160"/>
-              <w:right w:type="dxa" w:w="170"/>
+              <w:top w:type="dxa" w:w="200"/>
+              <w:left w:type="dxa" w:w="200"/>
+              <w:bottom w:type="dxa" w:w="200"/>
+              <w:right w:type="dxa" w:w="200"/>
             </w:tcMar>
             <w:vAlign w:val="top"/>
           </w:tcPr>
@@ -2099,8 +2099,8 @@
                 <w:i w:val="false"/>
                 <w:iCs w:val="false"/>
                 <w:color w:val="1C1C1C"/>
-                <w:sz w:val="18"/>
-                <w:szCs w:val="18"/>
+                <w:sz w:val="20"/>
+                <w:szCs w:val="20"/>
               </w:rPr>
               <w:t xml:space="preserve">{quantite}</w:t>
             </w:r>
@@ -2117,10 +2117,10 @@
               <w:right w:val="single" w:color="DCE8DC" w:sz="4"/>
             </w:tcBorders>
             <w:tcMar>
-              <w:top w:type="dxa" w:w="160"/>
-              <w:left w:type="dxa" w:w="170"/>
-              <w:bottom w:type="dxa" w:w="160"/>
-              <w:right w:type="dxa" w:w="170"/>
+              <w:top w:type="dxa" w:w="200"/>
+              <w:left w:type="dxa" w:w="200"/>
+              <w:bottom w:type="dxa" w:w="200"/>
+              <w:right w:type="dxa" w:w="200"/>
             </w:tcMar>
             <w:vAlign w:val="top"/>
           </w:tcPr>
@@ -2137,8 +2137,8 @@
                 <w:i w:val="false"/>
                 <w:iCs w:val="false"/>
                 <w:color w:val="1C1C1C"/>
-                <w:sz w:val="18"/>
-                <w:szCs w:val="18"/>
+                <w:sz w:val="20"/>
+                <w:szCs w:val="20"/>
               </w:rPr>
               <w:t xml:space="preserve">{prix_formate}{/recap_lignes}</w:t>
             </w:r>
@@ -2180,8 +2180,8 @@
                 <w:i w:val="false"/>
                 <w:iCs w:val="false"/>
                 <w:color w:val="1A2E1E"/>
-                <w:sz w:val="17"/>
-                <w:szCs w:val="17"/>
+                <w:sz w:val="20"/>
+                <w:szCs w:val="20"/>
               </w:rPr>
               <w:t xml:space="preserve">Total hors taxes</w:t>
             </w:r>
@@ -2199,10 +2199,10 @@
             </w:tcBorders>
             <w:shd w:fill="EBF0EB" w:val="clear"/>
             <w:tcMar>
-              <w:top w:type="dxa" w:w="160"/>
-              <w:left w:type="dxa" w:w="170"/>
-              <w:bottom w:type="dxa" w:w="160"/>
-              <w:right w:type="dxa" w:w="170"/>
+              <w:top w:type="dxa" w:w="200"/>
+              <w:left w:type="dxa" w:w="200"/>
+              <w:bottom w:type="dxa" w:w="200"/>
+              <w:right w:type="dxa" w:w="200"/>
             </w:tcMar>
             <w:vAlign w:val="top"/>
           </w:tcPr>
@@ -2219,8 +2219,8 @@
                 <w:i w:val="false"/>
                 <w:iCs w:val="false"/>
                 <w:color w:val="1A2E1E"/>
-                <w:sz w:val="17"/>
-                <w:szCs w:val="17"/>
+                <w:sz w:val="20"/>
+                <w:szCs w:val="20"/>
               </w:rPr>
               <w:t xml:space="preserve">{total_ht_formate}</w:t>
             </w:r>
@@ -2262,8 +2262,8 @@
                 <w:i w:val="false"/>
                 <w:iCs w:val="false"/>
                 <w:color w:val="1A2E1E"/>
-                <w:sz w:val="17"/>
-                <w:szCs w:val="17"/>
+                <w:sz w:val="20"/>
+                <w:szCs w:val="20"/>
               </w:rPr>
               <w:t xml:space="preserve">TVA {tva_pct} %</w:t>
             </w:r>
@@ -2281,10 +2281,10 @@
             </w:tcBorders>
             <w:shd w:fill="EBF0EB" w:val="clear"/>
             <w:tcMar>
-              <w:top w:type="dxa" w:w="160"/>
-              <w:left w:type="dxa" w:w="170"/>
-              <w:bottom w:type="dxa" w:w="160"/>
-              <w:right w:type="dxa" w:w="170"/>
+              <w:top w:type="dxa" w:w="200"/>
+              <w:left w:type="dxa" w:w="200"/>
+              <w:bottom w:type="dxa" w:w="200"/>
+              <w:right w:type="dxa" w:w="200"/>
             </w:tcMar>
             <w:vAlign w:val="top"/>
           </w:tcPr>
@@ -2301,8 +2301,8 @@
                 <w:i w:val="false"/>
                 <w:iCs w:val="false"/>
                 <w:color w:val="1A2E1E"/>
-                <w:sz w:val="17"/>
-                <w:szCs w:val="17"/>
+                <w:sz w:val="20"/>
+                <w:szCs w:val="20"/>
               </w:rPr>
               <w:t xml:space="preserve">{tva_formate}</w:t>
             </w:r>
@@ -2343,8 +2343,8 @@
                 <w:i w:val="false"/>
                 <w:iCs w:val="false"/>
                 <w:color w:val="FFFFFF"/>
-                <w:sz w:val="18"/>
-                <w:szCs w:val="18"/>
+                <w:sz w:val="20"/>
+                <w:szCs w:val="20"/>
               </w:rPr>
               <w:t xml:space="preserve">Total TTC</w:t>
             </w:r>
@@ -2362,10 +2362,10 @@
             </w:tcBorders>
             <w:shd w:fill="C9A96E" w:val="clear"/>
             <w:tcMar>
-              <w:top w:type="dxa" w:w="160"/>
-              <w:left w:type="dxa" w:w="170"/>
-              <w:bottom w:type="dxa" w:w="160"/>
-              <w:right w:type="dxa" w:w="170"/>
+              <w:top w:type="dxa" w:w="200"/>
+              <w:left w:type="dxa" w:w="200"/>
+              <w:bottom w:type="dxa" w:w="200"/>
+              <w:right w:type="dxa" w:w="200"/>
             </w:tcMar>
             <w:vAlign w:val="top"/>
           </w:tcPr>
@@ -2382,8 +2382,8 @@
                 <w:i w:val="false"/>
                 <w:iCs w:val="false"/>
                 <w:color w:val="FFFFFF"/>
-                <w:sz w:val="18"/>
-                <w:szCs w:val="18"/>
+                <w:sz w:val="20"/>
+                <w:szCs w:val="20"/>
               </w:rPr>
               <w:t xml:space="preserve">{total_ttc_formate}</w:t>
             </w:r>

</xml_diff>

<commit_message>
fix(template): logo header all pages, OBJET 2 lines, DATE bold
</commit_message>
<xml_diff>
--- a/templates/template-standard-v2.docx
+++ b/templates/template-standard-v2.docx
@@ -242,7 +242,7 @@
         <w:keepNext/>
         <w:keepLines/>
         <w:widowControl w:val="false"/>
-        <w:spacing w:after="170" w:before="0" w:line="288"/>
+        <w:spacing w:after="113" w:before="0" w:line="288"/>
         <w:jc w:val="left"/>
       </w:pPr>
       <w:r>
@@ -253,32 +253,10 @@
           <w:i w:val="false"/>
           <w:iCs w:val="false"/>
           <w:color w:val="1C1C1C"/>
-          <w:sz w:val="18"/>
-          <w:szCs w:val="18"/>
+          <w:sz w:val="20"/>
+          <w:szCs w:val="20"/>
         </w:rPr>
         <w:t xml:space="preserve">OBJET :</w:t>
-      </w:r>
-    </w:p>
-    <w:p>
-      <w:pPr>
-        <w:keepNext/>
-        <w:keepLines/>
-        <w:widowControl w:val="false"/>
-        <w:spacing w:after="113" w:before="0" w:line="317"/>
-        <w:jc w:val="left"/>
-      </w:pPr>
-      <w:r>
-        <w:rPr>
-          <w:rFonts w:ascii="Arial" w:cs="Arial" w:eastAsia="Arial" w:hAnsi="Arial"/>
-          <w:b w:val="false"/>
-          <w:bCs w:val="false"/>
-          <w:i/>
-          <w:iCs/>
-          <w:color w:val="C9A96E"/>
-          <w:sz w:val="22"/>
-          <w:szCs w:val="22"/>
-        </w:rPr>
-        <w:t xml:space="preserve">Offre de services professionnels</w:t>
       </w:r>
     </w:p>
     <w:p>
@@ -292,13 +270,26 @@
       <w:r>
         <w:rPr>
           <w:rFonts w:ascii="Arial" w:cs="Arial" w:eastAsia="Arial" w:hAnsi="Arial"/>
-          <w:b w:val="false"/>
-          <w:bCs w:val="false"/>
-          <w:i/>
-          <w:iCs/>
+          <w:b/>
+          <w:bCs/>
+          <w:i w:val="false"/>
+          <w:iCs w:val="false"/>
           <w:color w:val="C9A96E"/>
-          <w:sz w:val="22"/>
-          <w:szCs w:val="22"/>
+          <w:sz w:val="20"/>
+          <w:szCs w:val="20"/>
+        </w:rPr>
+        <w:t xml:space="preserve">Offre de services professionnels </w:t>
+      </w:r>
+      <w:r>
+        <w:rPr>
+          <w:rFonts w:ascii="Arial" w:cs="Arial" w:eastAsia="Arial" w:hAnsi="Arial"/>
+          <w:b/>
+          <w:bCs/>
+          <w:i w:val="false"/>
+          <w:iCs w:val="false"/>
+          <w:color w:val="C9A96E"/>
+          <w:sz w:val="20"/>
+          <w:szCs w:val="20"/>
         </w:rPr>
         <w:t xml:space="preserve">{objet_ligne1}</w:t>
       </w:r>
@@ -375,8 +366,8 @@
                 <w:i w:val="false"/>
                 <w:iCs w:val="false"/>
                 <w:color w:val="1A2E1E"/>
-                <w:sz w:val="15"/>
-                <w:szCs w:val="15"/>
+                <w:sz w:val="16"/>
+                <w:szCs w:val="16"/>
               </w:rPr>
               <w:t xml:space="preserve">DATE</w:t>
             </w:r>
@@ -1043,11 +1034,12 @@
         <w:pStyle w:val="Titre1BTH"/>
         <w:keepNext/>
         <w:keepLines/>
+        <w:pageBreakBefore/>
         <w:widowControl w:val="false"/>
         <w:pBdr>
           <w:bottom w:val="single" w:color="C9A96E" w:sz="6" w:space="6"/>
         </w:pBdr>
-        <w:spacing w:after="227" w:before="567" w:line="288"/>
+        <w:spacing w:after="227" w:before="0" w:line="288"/>
       </w:pPr>
       <w:r>
         <w:rPr>
@@ -2497,11 +2489,12 @@
         <w:pStyle w:val="Titre1BTH"/>
         <w:keepNext/>
         <w:keepLines/>
+        <w:pageBreakBefore/>
         <w:widowControl w:val="false"/>
         <w:pBdr>
           <w:bottom w:val="single" w:color="C9A96E" w:sz="6" w:space="6"/>
         </w:pBdr>
-        <w:spacing w:after="227" w:before="567" w:line="288"/>
+        <w:spacing w:after="227" w:before="0" w:line="288"/>
       </w:pPr>
       <w:r>
         <w:rPr>
@@ -3456,10 +3449,13 @@
     </w:tbl>
     <w:sectPr>
       <w:headerReference w:type="default" r:id="rId7"/>
-      <w:footerReference w:type="default" r:id="rId8"/>
+      <w:headerReference w:type="first" r:id="rId8"/>
+      <w:footerReference w:type="default" r:id="rId9"/>
+      <w:footerReference w:type="first" r:id="rId10"/>
       <w:pgSz w:w="11906" w:h="16838" w:orient="portrait"/>
       <w:pgMar w:top="1928" w:right="1134" w:bottom="1134" w:left="1247" w:header="454" w:footer="680" w:gutter="0"/>
       <w:pgNumType w:start="1" w:fmt="decimal"/>
+      <w:titlePg/>
       <w:docGrid w:linePitch="360"/>
     </w:sectPr>
   </w:body>
@@ -3552,6 +3548,51 @@
 </w:ftr>
 </file>
 
+<file path=word/footer2.xml><?xml version="1.0" encoding="utf-8"?>
+<w:ftr xmlns:wpc="http://schemas.microsoft.com/office/word/2010/wordprocessingCanvas" xmlns:mc="http://schemas.openxmlformats.org/markup-compatibility/2006" xmlns:o="urn:schemas-microsoft-com:office:office" xmlns:r="http://schemas.openxmlformats.org/officeDocument/2006/relationships" xmlns:m="http://schemas.openxmlformats.org/officeDocument/2006/math" xmlns:v="urn:schemas-microsoft-com:vml" xmlns:wp14="http://schemas.microsoft.com/office/word/2010/wordprocessingDrawing" xmlns:wp="http://schemas.openxmlformats.org/drawingml/2006/wordprocessingDrawing" xmlns:w10="urn:schemas-microsoft-com:office:word" xmlns:w="http://schemas.openxmlformats.org/wordprocessingml/2006/main" xmlns:w14="http://schemas.microsoft.com/office/word/2010/wordml" xmlns:w15="http://schemas.microsoft.com/office/word/2012/wordml" xmlns:wpg="http://schemas.microsoft.com/office/word/2010/wordprocessingGroup" xmlns:wpi="http://schemas.microsoft.com/office/word/2010/wordprocessingInk" xmlns:wne="http://schemas.microsoft.com/office/word/2006/wordml" xmlns:wps="http://schemas.microsoft.com/office/word/2010/wordprocessingShape">
+  <w:p>
+    <w:pPr>
+      <w:widowControl w:val="false"/>
+      <w:pBdr>
+        <w:top w:val="single" w:color="C9A96E" w:sz="4" w:space="6"/>
+      </w:pBdr>
+      <w:tabs>
+        <w:tab w:val="right" w:pos="9525"/>
+      </w:tabs>
+      <w:spacing w:after="0" w:before="80"/>
+    </w:pPr>
+    <w:r>
+      <w:rPr>
+        <w:rFonts w:ascii="Calibri" w:cs="Calibri" w:eastAsia="Calibri" w:hAnsi="Calibri"/>
+        <w:b w:val="false"/>
+        <w:bCs w:val="false"/>
+        <w:i w:val="false"/>
+        <w:iCs w:val="false"/>
+        <w:color w:val="C9A96E"/>
+        <w:sz w:val="14"/>
+        <w:szCs w:val="14"/>
+      </w:rPr>
+      <w:t xml:space="preserve">BTH Expert</w:t>
+    </w:r>
+    <w:r>
+      <w:t xml:space="preserve">	</w:t>
+    </w:r>
+    <w:r>
+      <w:rPr>
+        <w:rFonts w:ascii="Calibri" w:cs="Calibri" w:eastAsia="Calibri" w:hAnsi="Calibri"/>
+        <w:color w:val="4A4A4A"/>
+        <w:sz w:val="14"/>
+        <w:szCs w:val="14"/>
+      </w:rPr>
+      <w:fldChar w:fldCharType="begin"/>
+      <w:instrText xml:space="preserve">PAGE</w:instrText>
+      <w:fldChar w:fldCharType="separate"/>
+      <w:fldChar w:fldCharType="end"/>
+    </w:r>
+  </w:p>
+</w:ftr>
+</file>
+
 <file path=word/footnotes.xml><?xml version="1.0" encoding="utf-8"?>
 <w:footnotes xmlns:wpc="http://schemas.microsoft.com/office/word/2010/wordprocessingCanvas" xmlns:mc="http://schemas.openxmlformats.org/markup-compatibility/2006" xmlns:o="urn:schemas-microsoft-com:office:office" xmlns:r="http://schemas.openxmlformats.org/officeDocument/2006/relationships" xmlns:m="http://schemas.openxmlformats.org/officeDocument/2006/math" xmlns:v="urn:schemas-microsoft-com:vml" xmlns:wp14="http://schemas.microsoft.com/office/word/2010/wordprocessingDrawing" xmlns:wp="http://schemas.openxmlformats.org/drawingml/2006/wordprocessingDrawing" xmlns:w10="urn:schemas-microsoft-com:office:word" xmlns:w="http://schemas.openxmlformats.org/wordprocessingml/2006/main" xmlns:w14="http://schemas.microsoft.com/office/word/2010/wordml" xmlns:w15="http://schemas.microsoft.com/office/word/2012/wordml" xmlns:wpg="http://schemas.microsoft.com/office/word/2010/wordprocessingGroup" xmlns:wpi="http://schemas.microsoft.com/office/word/2010/wordprocessingInk" xmlns:wne="http://schemas.microsoft.com/office/word/2006/wordml" xmlns:wps="http://schemas.microsoft.com/office/word/2010/wordprocessingShape" mc:Ignorable="w14 w15 wp14">
   <w:footnote w:type="separator" w:id="-1">
@@ -3590,6 +3631,61 @@
 </file>
 
 <file path=word/header1.xml><?xml version="1.0" encoding="utf-8"?>
+<w:hdr xmlns:wpc="http://schemas.microsoft.com/office/word/2010/wordprocessingCanvas" xmlns:mc="http://schemas.openxmlformats.org/markup-compatibility/2006" xmlns:o="urn:schemas-microsoft-com:office:office" xmlns:r="http://schemas.openxmlformats.org/officeDocument/2006/relationships" xmlns:m="http://schemas.openxmlformats.org/officeDocument/2006/math" xmlns:v="urn:schemas-microsoft-com:vml" xmlns:wp14="http://schemas.microsoft.com/office/word/2010/wordprocessingDrawing" xmlns:wp="http://schemas.openxmlformats.org/drawingml/2006/wordprocessingDrawing" xmlns:w10="urn:schemas-microsoft-com:office:word" xmlns:w="http://schemas.openxmlformats.org/wordprocessingml/2006/main" xmlns:w14="http://schemas.microsoft.com/office/word/2010/wordml" xmlns:w15="http://schemas.microsoft.com/office/word/2012/wordml" xmlns:wpg="http://schemas.microsoft.com/office/word/2010/wordprocessingGroup" xmlns:wpi="http://schemas.microsoft.com/office/word/2010/wordprocessingInk" xmlns:wne="http://schemas.microsoft.com/office/word/2006/wordml" xmlns:wps="http://schemas.microsoft.com/office/word/2010/wordprocessingShape" xmlns:cx="http://schemas.microsoft.com/office/drawing/2014/chartex" xmlns:cx1="http://schemas.microsoft.com/office/drawing/2015/9/8/chartex" xmlns:cx2="http://schemas.microsoft.com/office/drawing/2015/10/21/chartex" xmlns:cx3="http://schemas.microsoft.com/office/drawing/2016/5/9/chartex" xmlns:cx4="http://schemas.microsoft.com/office/drawing/2016/5/10/chartex" xmlns:cx5="http://schemas.microsoft.com/office/drawing/2016/5/11/chartex" xmlns:cx6="http://schemas.microsoft.com/office/drawing/2016/5/12/chartex" xmlns:cx7="http://schemas.microsoft.com/office/drawing/2016/5/13/chartex" xmlns:cx8="http://schemas.microsoft.com/office/drawing/2016/5/14/chartex" xmlns:w16cid="http://schemas.microsoft.com/office/word/2016/wordml/cid" xmlns:w16se="http://schemas.microsoft.com/office/word/2015/wordml/symex">
+  <w:p>
+    <w:pPr>
+      <w:widowControl w:val="false"/>
+      <w:pBdr>
+        <w:bottom w:val="single" w:color="C9A96E" w:sz="4" w:space="6"/>
+      </w:pBdr>
+      <w:spacing w:after="80" w:before="0" w:line="240"/>
+      <w:jc w:val="right"/>
+    </w:pPr>
+    <w:r>
+      <w:drawing>
+        <wp:inline distT="0" distB="0" distL="0" distR="0">
+          <wp:extent cx="1524000" cy="438150"/>
+          <wp:effectExtent t="0" r="0" b="0" l="0"/>
+          <wp:docPr id="1" name="" descr="" title=""/>
+          <wp:cNvGraphicFramePr>
+            <a:graphicFrameLocks xmlns:a="http://schemas.openxmlformats.org/drawingml/2006/main" noChangeAspect="1"/>
+          </wp:cNvGraphicFramePr>
+          <a:graphic xmlns:a="http://schemas.openxmlformats.org/drawingml/2006/main">
+            <a:graphicData uri="http://schemas.openxmlformats.org/drawingml/2006/picture">
+              <pic:pic xmlns:pic="http://schemas.openxmlformats.org/drawingml/2006/picture">
+                <pic:nvPicPr>
+                  <pic:cNvPr id="0" name="" descr=""/>
+                  <pic:cNvPicPr>
+                    <a:picLocks noChangeAspect="1" noChangeArrowheads="1"/>
+                  </pic:cNvPicPr>
+                </pic:nvPicPr>
+                <pic:blipFill>
+                  <a:blip r:embed="rId0" cstate="none"/>
+                  <a:srcRect/>
+                  <a:stretch>
+                    <a:fillRect/>
+                  </a:stretch>
+                </pic:blipFill>
+                <pic:spPr bwMode="auto">
+                  <a:xfrm>
+                    <a:off x="0" y="0"/>
+                    <a:ext cx="1524000" cy="438150"/>
+                  </a:xfrm>
+                  <a:prstGeom prst="rect">
+                    <a:avLst/>
+                  </a:prstGeom>
+                </pic:spPr>
+              </pic:pic>
+            </a:graphicData>
+          </a:graphic>
+        </wp:inline>
+      </w:drawing>
+    </w:r>
+  </w:p>
+</w:hdr>
+</file>
+
+<file path=word/header2.xml><?xml version="1.0" encoding="utf-8"?>
 <w:hdr xmlns:wpc="http://schemas.microsoft.com/office/word/2010/wordprocessingCanvas" xmlns:mc="http://schemas.openxmlformats.org/markup-compatibility/2006" xmlns:o="urn:schemas-microsoft-com:office:office" xmlns:r="http://schemas.openxmlformats.org/officeDocument/2006/relationships" xmlns:m="http://schemas.openxmlformats.org/officeDocument/2006/math" xmlns:v="urn:schemas-microsoft-com:vml" xmlns:wp14="http://schemas.microsoft.com/office/word/2010/wordprocessingDrawing" xmlns:wp="http://schemas.openxmlformats.org/drawingml/2006/wordprocessingDrawing" xmlns:w10="urn:schemas-microsoft-com:office:word" xmlns:w="http://schemas.openxmlformats.org/wordprocessingml/2006/main" xmlns:w14="http://schemas.microsoft.com/office/word/2010/wordml" xmlns:w15="http://schemas.microsoft.com/office/word/2012/wordml" xmlns:wpg="http://schemas.microsoft.com/office/word/2010/wordprocessingGroup" xmlns:wpi="http://schemas.microsoft.com/office/word/2010/wordprocessingInk" xmlns:wne="http://schemas.microsoft.com/office/word/2006/wordml" xmlns:wps="http://schemas.microsoft.com/office/word/2010/wordprocessingShape" xmlns:cx="http://schemas.microsoft.com/office/drawing/2014/chartex" xmlns:cx1="http://schemas.microsoft.com/office/drawing/2015/9/8/chartex" xmlns:cx2="http://schemas.microsoft.com/office/drawing/2015/10/21/chartex" xmlns:cx3="http://schemas.microsoft.com/office/drawing/2016/5/9/chartex" xmlns:cx4="http://schemas.microsoft.com/office/drawing/2016/5/10/chartex" xmlns:cx5="http://schemas.microsoft.com/office/drawing/2016/5/11/chartex" xmlns:cx6="http://schemas.microsoft.com/office/drawing/2016/5/12/chartex" xmlns:cx7="http://schemas.microsoft.com/office/drawing/2016/5/13/chartex" xmlns:cx8="http://schemas.microsoft.com/office/drawing/2016/5/14/chartex" xmlns:w16cid="http://schemas.microsoft.com/office/word/2016/wordml/cid" xmlns:w16se="http://schemas.microsoft.com/office/word/2015/wordml/symex">
   <w:p>
     <w:pPr>

</xml_diff>

<commit_message>
fix(template): OBJET 2 lines no label, callout cantSplit
</commit_message>
<xml_diff>
--- a/templates/template-standard-v2.docx
+++ b/templates/template-standard-v2.docx
@@ -242,7 +242,7 @@
         <w:keepNext/>
         <w:keepLines/>
         <w:widowControl w:val="false"/>
-        <w:spacing w:after="113" w:before="0" w:line="288"/>
+        <w:spacing w:after="113" w:before="0" w:line="317"/>
         <w:jc w:val="left"/>
       </w:pPr>
       <w:r>
@@ -252,11 +252,11 @@
           <w:bCs/>
           <w:i w:val="false"/>
           <w:iCs w:val="false"/>
-          <w:color w:val="1C1C1C"/>
-          <w:sz w:val="20"/>
-          <w:szCs w:val="20"/>
-        </w:rPr>
-        <w:t xml:space="preserve">OBJET :</w:t>
+          <w:color w:val="C9A96E"/>
+          <w:sz w:val="22"/>
+          <w:szCs w:val="22"/>
+        </w:rPr>
+        <w:t xml:space="preserve">Offre de services professionnels</w:t>
       </w:r>
     </w:p>
     <w:p>
@@ -275,21 +275,8 @@
           <w:i w:val="false"/>
           <w:iCs w:val="false"/>
           <w:color w:val="C9A96E"/>
-          <w:sz w:val="20"/>
-          <w:szCs w:val="20"/>
-        </w:rPr>
-        <w:t xml:space="preserve">Offre de services professionnels </w:t>
-      </w:r>
-      <w:r>
-        <w:rPr>
-          <w:rFonts w:ascii="Arial" w:cs="Arial" w:eastAsia="Arial" w:hAnsi="Arial"/>
-          <w:b/>
-          <w:bCs/>
-          <w:i w:val="false"/>
-          <w:iCs w:val="false"/>
-          <w:color w:val="C9A96E"/>
-          <w:sz w:val="20"/>
-          <w:szCs w:val="20"/>
+          <w:sz w:val="22"/>
+          <w:szCs w:val="22"/>
         </w:rPr>
         <w:t xml:space="preserve">{objet_ligne1}</w:t>
       </w:r>
@@ -333,6 +320,9 @@
         <w:gridCol w:w="7824"/>
       </w:tblGrid>
       <w:tr>
+        <w:trPr>
+          <w:cantSplit w:val="false"/>
+        </w:trPr>
         <w:tc>
           <w:tcPr>
             <w:tcW w:type="dxa" w:w="1701"/>
@@ -557,6 +547,9 @@
               <w:gridCol w:w="7370"/>
             </w:tblGrid>
             <w:tr>
+              <w:trPr>
+                <w:cantSplit/>
+              </w:trPr>
               <w:tc>
                 <w:tcPr>
                   <w:tcW w:type="dxa" w:w="7370"/>
@@ -2421,6 +2414,9 @@
         <w:gridCol w:w="9525"/>
       </w:tblGrid>
       <w:tr>
+        <w:trPr>
+          <w:cantSplit/>
+        </w:trPr>
         <w:tc>
           <w:tcPr>
             <w:tcW w:type="dxa" w:w="9525"/>
@@ -3449,13 +3445,10 @@
     </w:tbl>
     <w:sectPr>
       <w:headerReference w:type="default" r:id="rId7"/>
-      <w:headerReference w:type="first" r:id="rId8"/>
-      <w:footerReference w:type="default" r:id="rId9"/>
-      <w:footerReference w:type="first" r:id="rId10"/>
+      <w:footerReference w:type="default" r:id="rId8"/>
       <w:pgSz w:w="11906" w:h="16838" w:orient="portrait"/>
       <w:pgMar w:top="1928" w:right="1134" w:bottom="1134" w:left="1247" w:header="454" w:footer="680" w:gutter="0"/>
       <w:pgNumType w:start="1" w:fmt="decimal"/>
-      <w:titlePg/>
       <w:docGrid w:linePitch="360"/>
     </w:sectPr>
   </w:body>
@@ -3548,51 +3541,6 @@
 </w:ftr>
 </file>
 
-<file path=word/footer2.xml><?xml version="1.0" encoding="utf-8"?>
-<w:ftr xmlns:wpc="http://schemas.microsoft.com/office/word/2010/wordprocessingCanvas" xmlns:mc="http://schemas.openxmlformats.org/markup-compatibility/2006" xmlns:o="urn:schemas-microsoft-com:office:office" xmlns:r="http://schemas.openxmlformats.org/officeDocument/2006/relationships" xmlns:m="http://schemas.openxmlformats.org/officeDocument/2006/math" xmlns:v="urn:schemas-microsoft-com:vml" xmlns:wp14="http://schemas.microsoft.com/office/word/2010/wordprocessingDrawing" xmlns:wp="http://schemas.openxmlformats.org/drawingml/2006/wordprocessingDrawing" xmlns:w10="urn:schemas-microsoft-com:office:word" xmlns:w="http://schemas.openxmlformats.org/wordprocessingml/2006/main" xmlns:w14="http://schemas.microsoft.com/office/word/2010/wordml" xmlns:w15="http://schemas.microsoft.com/office/word/2012/wordml" xmlns:wpg="http://schemas.microsoft.com/office/word/2010/wordprocessingGroup" xmlns:wpi="http://schemas.microsoft.com/office/word/2010/wordprocessingInk" xmlns:wne="http://schemas.microsoft.com/office/word/2006/wordml" xmlns:wps="http://schemas.microsoft.com/office/word/2010/wordprocessingShape">
-  <w:p>
-    <w:pPr>
-      <w:widowControl w:val="false"/>
-      <w:pBdr>
-        <w:top w:val="single" w:color="C9A96E" w:sz="4" w:space="6"/>
-      </w:pBdr>
-      <w:tabs>
-        <w:tab w:val="right" w:pos="9525"/>
-      </w:tabs>
-      <w:spacing w:after="0" w:before="80"/>
-    </w:pPr>
-    <w:r>
-      <w:rPr>
-        <w:rFonts w:ascii="Calibri" w:cs="Calibri" w:eastAsia="Calibri" w:hAnsi="Calibri"/>
-        <w:b w:val="false"/>
-        <w:bCs w:val="false"/>
-        <w:i w:val="false"/>
-        <w:iCs w:val="false"/>
-        <w:color w:val="C9A96E"/>
-        <w:sz w:val="14"/>
-        <w:szCs w:val="14"/>
-      </w:rPr>
-      <w:t xml:space="preserve">BTH Expert</w:t>
-    </w:r>
-    <w:r>
-      <w:t xml:space="preserve">	</w:t>
-    </w:r>
-    <w:r>
-      <w:rPr>
-        <w:rFonts w:ascii="Calibri" w:cs="Calibri" w:eastAsia="Calibri" w:hAnsi="Calibri"/>
-        <w:color w:val="4A4A4A"/>
-        <w:sz w:val="14"/>
-        <w:szCs w:val="14"/>
-      </w:rPr>
-      <w:fldChar w:fldCharType="begin"/>
-      <w:instrText xml:space="preserve">PAGE</w:instrText>
-      <w:fldChar w:fldCharType="separate"/>
-      <w:fldChar w:fldCharType="end"/>
-    </w:r>
-  </w:p>
-</w:ftr>
-</file>
-
 <file path=word/footnotes.xml><?xml version="1.0" encoding="utf-8"?>
 <w:footnotes xmlns:wpc="http://schemas.microsoft.com/office/word/2010/wordprocessingCanvas" xmlns:mc="http://schemas.openxmlformats.org/markup-compatibility/2006" xmlns:o="urn:schemas-microsoft-com:office:office" xmlns:r="http://schemas.openxmlformats.org/officeDocument/2006/relationships" xmlns:m="http://schemas.openxmlformats.org/officeDocument/2006/math" xmlns:v="urn:schemas-microsoft-com:vml" xmlns:wp14="http://schemas.microsoft.com/office/word/2010/wordprocessingDrawing" xmlns:wp="http://schemas.openxmlformats.org/drawingml/2006/wordprocessingDrawing" xmlns:w10="urn:schemas-microsoft-com:office:word" xmlns:w="http://schemas.openxmlformats.org/wordprocessingml/2006/main" xmlns:w14="http://schemas.microsoft.com/office/word/2010/wordml" xmlns:w15="http://schemas.microsoft.com/office/word/2012/wordml" xmlns:wpg="http://schemas.microsoft.com/office/word/2010/wordprocessingGroup" xmlns:wpi="http://schemas.microsoft.com/office/word/2010/wordprocessingInk" xmlns:wne="http://schemas.microsoft.com/office/word/2006/wordml" xmlns:wps="http://schemas.microsoft.com/office/word/2010/wordprocessingShape" mc:Ignorable="w14 w15 wp14">
   <w:footnote w:type="separator" w:id="-1">
@@ -3644,7 +3592,7 @@
     <w:r>
       <w:drawing>
         <wp:inline distT="0" distB="0" distL="0" distR="0">
-          <wp:extent cx="1524000" cy="438150"/>
+          <wp:extent cx="1905000" cy="552450"/>
           <wp:effectExtent t="0" r="0" b="0" l="0"/>
           <wp:docPr id="1" name="" descr="" title=""/>
           <wp:cNvGraphicFramePr>
@@ -3669,62 +3617,7 @@
                 <pic:spPr bwMode="auto">
                   <a:xfrm>
                     <a:off x="0" y="0"/>
-                    <a:ext cx="1524000" cy="438150"/>
-                  </a:xfrm>
-                  <a:prstGeom prst="rect">
-                    <a:avLst/>
-                  </a:prstGeom>
-                </pic:spPr>
-              </pic:pic>
-            </a:graphicData>
-          </a:graphic>
-        </wp:inline>
-      </w:drawing>
-    </w:r>
-  </w:p>
-</w:hdr>
-</file>
-
-<file path=word/header2.xml><?xml version="1.0" encoding="utf-8"?>
-<w:hdr xmlns:wpc="http://schemas.microsoft.com/office/word/2010/wordprocessingCanvas" xmlns:mc="http://schemas.openxmlformats.org/markup-compatibility/2006" xmlns:o="urn:schemas-microsoft-com:office:office" xmlns:r="http://schemas.openxmlformats.org/officeDocument/2006/relationships" xmlns:m="http://schemas.openxmlformats.org/officeDocument/2006/math" xmlns:v="urn:schemas-microsoft-com:vml" xmlns:wp14="http://schemas.microsoft.com/office/word/2010/wordprocessingDrawing" xmlns:wp="http://schemas.openxmlformats.org/drawingml/2006/wordprocessingDrawing" xmlns:w10="urn:schemas-microsoft-com:office:word" xmlns:w="http://schemas.openxmlformats.org/wordprocessingml/2006/main" xmlns:w14="http://schemas.microsoft.com/office/word/2010/wordml" xmlns:w15="http://schemas.microsoft.com/office/word/2012/wordml" xmlns:wpg="http://schemas.microsoft.com/office/word/2010/wordprocessingGroup" xmlns:wpi="http://schemas.microsoft.com/office/word/2010/wordprocessingInk" xmlns:wne="http://schemas.microsoft.com/office/word/2006/wordml" xmlns:wps="http://schemas.microsoft.com/office/word/2010/wordprocessingShape" xmlns:cx="http://schemas.microsoft.com/office/drawing/2014/chartex" xmlns:cx1="http://schemas.microsoft.com/office/drawing/2015/9/8/chartex" xmlns:cx2="http://schemas.microsoft.com/office/drawing/2015/10/21/chartex" xmlns:cx3="http://schemas.microsoft.com/office/drawing/2016/5/9/chartex" xmlns:cx4="http://schemas.microsoft.com/office/drawing/2016/5/10/chartex" xmlns:cx5="http://schemas.microsoft.com/office/drawing/2016/5/11/chartex" xmlns:cx6="http://schemas.microsoft.com/office/drawing/2016/5/12/chartex" xmlns:cx7="http://schemas.microsoft.com/office/drawing/2016/5/13/chartex" xmlns:cx8="http://schemas.microsoft.com/office/drawing/2016/5/14/chartex" xmlns:w16cid="http://schemas.microsoft.com/office/word/2016/wordml/cid" xmlns:w16se="http://schemas.microsoft.com/office/word/2015/wordml/symex">
-  <w:p>
-    <w:pPr>
-      <w:widowControl w:val="false"/>
-      <w:pBdr>
-        <w:bottom w:val="single" w:color="C9A96E" w:sz="4" w:space="6"/>
-      </w:pBdr>
-      <w:spacing w:after="80" w:before="0" w:line="240"/>
-      <w:jc w:val="right"/>
-    </w:pPr>
-    <w:r>
-      <w:drawing>
-        <wp:inline distT="0" distB="0" distL="0" distR="0">
-          <wp:extent cx="1524000" cy="438150"/>
-          <wp:effectExtent t="0" r="0" b="0" l="0"/>
-          <wp:docPr id="1" name="" descr="" title=""/>
-          <wp:cNvGraphicFramePr>
-            <a:graphicFrameLocks xmlns:a="http://schemas.openxmlformats.org/drawingml/2006/main" noChangeAspect="1"/>
-          </wp:cNvGraphicFramePr>
-          <a:graphic xmlns:a="http://schemas.openxmlformats.org/drawingml/2006/main">
-            <a:graphicData uri="http://schemas.openxmlformats.org/drawingml/2006/picture">
-              <pic:pic xmlns:pic="http://schemas.openxmlformats.org/drawingml/2006/picture">
-                <pic:nvPicPr>
-                  <pic:cNvPr id="0" name="" descr=""/>
-                  <pic:cNvPicPr>
-                    <a:picLocks noChangeAspect="1" noChangeArrowheads="1"/>
-                  </pic:cNvPicPr>
-                </pic:nvPicPr>
-                <pic:blipFill>
-                  <a:blip r:embed="rId0" cstate="none"/>
-                  <a:srcRect/>
-                  <a:stretch>
-                    <a:fillRect/>
-                  </a:stretch>
-                </pic:blipFill>
-                <pic:spPr bwMode="auto">
-                  <a:xfrm>
-                    <a:off x="0" y="0"/>
-                    <a:ext cx="1524000" cy="438150"/>
+                    <a:ext cx="1905000" cy="552450"/>
                   </a:xfrm>
                   <a:prstGeom prst="rect">
                     <a:avLst/>

</xml_diff>

<commit_message>
fix(template): restore OBJET label
</commit_message>
<xml_diff>
--- a/templates/template-standard-v2.docx
+++ b/templates/template-standard-v2.docx
@@ -242,7 +242,29 @@
         <w:keepNext/>
         <w:keepLines/>
         <w:widowControl w:val="false"/>
-        <w:spacing w:after="113" w:before="0" w:line="317"/>
+        <w:spacing w:after="113" w:before="0" w:line="288"/>
+        <w:jc w:val="left"/>
+      </w:pPr>
+      <w:r>
+        <w:rPr>
+          <w:rFonts w:ascii="Arial" w:cs="Arial" w:eastAsia="Arial" w:hAnsi="Arial"/>
+          <w:b/>
+          <w:bCs/>
+          <w:i w:val="false"/>
+          <w:iCs w:val="false"/>
+          <w:color w:val="1C1C1C"/>
+          <w:sz w:val="20"/>
+          <w:szCs w:val="20"/>
+        </w:rPr>
+        <w:t xml:space="preserve">OBJET :</w:t>
+      </w:r>
+    </w:p>
+    <w:p>
+      <w:pPr>
+        <w:keepNext/>
+        <w:keepLines/>
+        <w:widowControl w:val="false"/>
+        <w:spacing w:after="57" w:before="0" w:line="317"/>
         <w:jc w:val="left"/>
       </w:pPr>
       <w:r>

</xml_diff>

<commit_message>
fix(template): fix table new page problem
</commit_message>
<xml_diff>
--- a/templates/template-standard-v2.docx
+++ b/templates/template-standard-v2.docx
@@ -1399,6 +1399,7 @@
           </w:tcPr>
           <w:p>
             <w:pPr>
+              <w:keepNext w:val="false"/>
               <w:spacing w:after="60" w:before="60"/>
               <w:jc w:val="center"/>
             </w:pPr>
@@ -1438,6 +1439,7 @@
           </w:tcPr>
           <w:p>
             <w:pPr>
+              <w:keepNext w:val="false"/>
               <w:spacing w:after="60" w:before="60"/>
               <w:jc w:val="left"/>
             </w:pPr>
@@ -1477,6 +1479,7 @@
           </w:tcPr>
           <w:p>
             <w:pPr>
+              <w:keepNext w:val="false"/>
               <w:spacing w:after="60" w:before="60"/>
               <w:jc w:val="center"/>
             </w:pPr>
@@ -1516,6 +1519,7 @@
           </w:tcPr>
           <w:p>
             <w:pPr>
+              <w:keepNext w:val="false"/>
               <w:spacing w:after="60" w:before="60"/>
               <w:jc w:val="right"/>
             </w:pPr>
@@ -1559,6 +1563,7 @@
           </w:tcPr>
           <w:p>
             <w:pPr>
+              <w:keepNext w:val="false"/>
               <w:spacing w:after="60" w:before="60"/>
               <w:jc w:val="center"/>
             </w:pPr>
@@ -1597,6 +1602,7 @@
           </w:tcPr>
           <w:p>
             <w:pPr>
+              <w:keepNext w:val="false"/>
               <w:spacing w:after="60" w:before="60"/>
               <w:jc w:val="left"/>
             </w:pPr>
@@ -1635,6 +1641,7 @@
           </w:tcPr>
           <w:p>
             <w:pPr>
+              <w:keepNext w:val="false"/>
               <w:spacing w:after="60" w:before="60"/>
               <w:jc w:val="center"/>
             </w:pPr>
@@ -1673,6 +1680,7 @@
           </w:tcPr>
           <w:p>
             <w:pPr>
+              <w:keepNext w:val="false"/>
               <w:spacing w:after="60" w:before="60"/>
               <w:jc w:val="right"/>
             </w:pPr>
@@ -1755,6 +1763,7 @@
           </w:tcPr>
           <w:p>
             <w:pPr>
+              <w:keepNext w:val="false"/>
               <w:spacing w:after="60" w:before="60"/>
               <w:jc w:val="right"/>
             </w:pPr>
@@ -1859,6 +1868,7 @@
           </w:tcPr>
           <w:p>
             <w:pPr>
+              <w:keepNext/>
               <w:spacing w:after="60" w:before="60"/>
               <w:jc w:val="center"/>
             </w:pPr>
@@ -1898,6 +1908,7 @@
           </w:tcPr>
           <w:p>
             <w:pPr>
+              <w:keepNext/>
               <w:spacing w:after="60" w:before="60"/>
               <w:jc w:val="left"/>
             </w:pPr>
@@ -1937,6 +1948,7 @@
           </w:tcPr>
           <w:p>
             <w:pPr>
+              <w:keepNext/>
               <w:spacing w:after="60" w:before="60"/>
               <w:jc w:val="center"/>
             </w:pPr>
@@ -1976,6 +1988,7 @@
           </w:tcPr>
           <w:p>
             <w:pPr>
+              <w:keepNext/>
               <w:spacing w:after="60" w:before="60"/>
               <w:jc w:val="right"/>
             </w:pPr>
@@ -2019,6 +2032,7 @@
           </w:tcPr>
           <w:p>
             <w:pPr>
+              <w:keepNext/>
               <w:spacing w:after="60" w:before="60"/>
               <w:jc w:val="center"/>
             </w:pPr>
@@ -2057,6 +2071,7 @@
           </w:tcPr>
           <w:p>
             <w:pPr>
+              <w:keepNext/>
               <w:spacing w:after="60" w:before="60"/>
               <w:jc w:val="left"/>
             </w:pPr>
@@ -2095,6 +2110,7 @@
           </w:tcPr>
           <w:p>
             <w:pPr>
+              <w:keepNext/>
               <w:spacing w:after="60" w:before="60"/>
               <w:jc w:val="center"/>
             </w:pPr>
@@ -2133,6 +2149,7 @@
           </w:tcPr>
           <w:p>
             <w:pPr>
+              <w:keepNext/>
               <w:spacing w:after="60" w:before="60"/>
               <w:jc w:val="right"/>
             </w:pPr>
@@ -2176,6 +2193,7 @@
           </w:tcPr>
           <w:p>
             <w:pPr>
+              <w:keepNext/>
               <w:spacing w:after="80" w:before="80"/>
               <w:jc w:val="right"/>
             </w:pPr>
@@ -2215,6 +2233,7 @@
           </w:tcPr>
           <w:p>
             <w:pPr>
+              <w:keepNext/>
               <w:spacing w:after="60" w:before="60"/>
               <w:jc w:val="right"/>
             </w:pPr>
@@ -2258,6 +2277,7 @@
           </w:tcPr>
           <w:p>
             <w:pPr>
+              <w:keepNext/>
               <w:spacing w:after="80" w:before="80"/>
               <w:jc w:val="right"/>
             </w:pPr>
@@ -2297,6 +2317,7 @@
           </w:tcPr>
           <w:p>
             <w:pPr>
+              <w:keepNext/>
               <w:spacing w:after="60" w:before="60"/>
               <w:jc w:val="right"/>
             </w:pPr>
@@ -2378,6 +2399,7 @@
           </w:tcPr>
           <w:p>
             <w:pPr>
+              <w:keepNext w:val="false"/>
               <w:spacing w:after="60" w:before="60"/>
               <w:jc w:val="right"/>
             </w:pPr>

</xml_diff>

<commit_message>
feat(template): refonte design tableaux devis — en-tête vert, lignes resserrées, total HT filet vert, suppression de la grille
</commit_message>
<xml_diff>
--- a/templates/template-standard-v2.docx
+++ b/templates/template-standard-v2.docx
@@ -2,6 +2,94 @@
 <file path=word/document.xml><?xml version="1.0" encoding="utf-8"?>
 <w:document xmlns:wpc="http://schemas.microsoft.com/office/word/2010/wordprocessingCanvas" xmlns:cx="http://schemas.microsoft.com/office/drawing/2014/chartex" xmlns:cx1="http://schemas.microsoft.com/office/drawing/2015/9/8/chartex" xmlns:cx2="http://schemas.microsoft.com/office/drawing/2015/10/21/chartex" xmlns:cx3="http://schemas.microsoft.com/office/drawing/2016/5/9/chartex" xmlns:cx4="http://schemas.microsoft.com/office/drawing/2016/5/10/chartex" xmlns:cx5="http://schemas.microsoft.com/office/drawing/2016/5/11/chartex" xmlns:cx6="http://schemas.microsoft.com/office/drawing/2016/5/12/chartex" xmlns:cx7="http://schemas.microsoft.com/office/drawing/2016/5/13/chartex" xmlns:cx8="http://schemas.microsoft.com/office/drawing/2016/5/14/chartex" xmlns:mc="http://schemas.openxmlformats.org/markup-compatibility/2006" xmlns:aink="http://schemas.microsoft.com/office/drawing/2016/ink" xmlns:am3d="http://schemas.microsoft.com/office/drawing/2017/model3d" xmlns:o="urn:schemas-microsoft-com:office:office" xmlns:oel="http://schemas.microsoft.com/office/2019/extlst" xmlns:r="http://schemas.openxmlformats.org/officeDocument/2006/relationships" xmlns:m="http://schemas.openxmlformats.org/officeDocument/2006/math" xmlns:v="urn:schemas-microsoft-com:vml" xmlns:wp14="http://schemas.microsoft.com/office/word/2010/wordprocessingDrawing" xmlns:wp="http://schemas.openxmlformats.org/drawingml/2006/wordprocessingDrawing" xmlns:w10="urn:schemas-microsoft-com:office:word" xmlns:w="http://schemas.openxmlformats.org/wordprocessingml/2006/main" xmlns:w14="http://schemas.microsoft.com/office/word/2010/wordml" xmlns:w15="http://schemas.microsoft.com/office/word/2012/wordml" xmlns:w16cex="http://schemas.microsoft.com/office/word/2018/wordml/cex" xmlns:w16cid="http://schemas.microsoft.com/office/word/2016/wordml/cid" xmlns:w16="http://schemas.microsoft.com/office/word/2018/wordml" xmlns:w16sdtdh="http://schemas.microsoft.com/office/word/2020/wordml/sdtdatahash" xmlns:w16se="http://schemas.microsoft.com/office/word/2015/wordml/symex" xmlns:wpg="http://schemas.microsoft.com/office/word/2010/wordprocessingGroup" xmlns:wpi="http://schemas.microsoft.com/office/word/2010/wordprocessingInk" xmlns:wne="http://schemas.microsoft.com/office/word/2006/wordml" xmlns:wps="http://schemas.microsoft.com/office/word/2010/wordprocessingShape" mc:Ignorable="w14 w15 w16se w16cid w16 w16cex w16sdtdh wp14">
   <w:body>
+    <w:p>
+      <w:pPr>
+        <w:spacing w:before="3600" w:after="0" w:line="240" w:lineRule="auto"/>
+      </w:pPr>
+      <w:r>
+        <w:rPr>
+          <w:caps/>
+          <w:color w:val="C9A96E"/>
+          <w:sz w:val="20"/>
+          <w:spacing w:val="120"/>
+        </w:rPr>
+        <w:t>Offre de services</w:t>
+      </w:r>
+    </w:p>
+    <w:p>
+      <w:pPr>
+        <w:spacing w:before="200" w:after="0" w:line="240" w:lineRule="auto"/>
+      </w:pPr>
+      <w:r>
+        <w:rPr>
+          <w:b/>
+          <w:color w:val="1A2E1E"/>
+          <w:sz w:val="64"/>
+          <w:spacing w:val="-20"/>
+        </w:rPr>
+        <w:t>BTH Expert</w:t>
+      </w:r>
+    </w:p>
+    <w:p>
+      <w:pPr>
+        <w:spacing w:before="60" w:after="0" w:line="240" w:lineRule="auto"/>
+        <w:pBdr>
+          <w:bottom w:val="single" w:sz="4" w:space="6" w:color="C9A96E"/>
+        </w:pBdr>
+      </w:pPr>
+      <w:r>
+        <w:rPr>
+          <w:color w:val="2B2B2B"/>
+          <w:sz w:val="20"/>
+        </w:rPr>
+        <w:t xml:space="preserve">Environnement  ·  Ingénierie</w:t>
+      </w:r>
+    </w:p>
+    <w:p>
+      <w:pPr>
+        <w:spacing w:before="3200" w:after="0" w:line="240" w:lineRule="auto"/>
+      </w:pPr>
+      <w:r>
+        <w:rPr>
+          <w:caps/>
+          <w:color w:val="C9A96E"/>
+          <w:sz w:val="16"/>
+          <w:spacing w:val="80"/>
+        </w:rPr>
+        <w:t>Préparée pour</w:t>
+      </w:r>
+    </w:p>
+    <w:p>
+      <w:pPr>
+        <w:spacing w:before="100" w:after="0" w:line="280" w:lineRule="auto"/>
+      </w:pPr>
+      <w:r>
+        <w:rPr>
+          <w:b/>
+          <w:color w:val="1A2E1E"/>
+          <w:sz w:val="34"/>
+        </w:rPr>
+        <w:t>{nom_client}</w:t>
+      </w:r>
+    </w:p>
+    <w:p>
+      <w:pPr>
+        <w:spacing w:before="20" w:after="0" w:line="240" w:lineRule="auto"/>
+      </w:pPr>
+      <w:r>
+        <w:rPr>
+          <w:color w:val="2B2B2B"/>
+          <w:sz w:val="22"/>
+        </w:rPr>
+        <w:t>{entreprise}</w:t>
+      </w:r>
+    </w:p>
+    <w:p>
+      <w:pPr>
+        <w:pageBreakBefore/>
+        <w:spacing w:before="0" w:after="0" w:line="240" w:lineRule="auto"/>
+      </w:pPr>
+    </w:p>
     <w:tbl>
       <w:tblPr>
         <w:tblW w:w="9525" w:type="dxa"/>
@@ -60,25 +148,7 @@
                 <w:szCs w:val="19"/>
                 <w:lang w:val="fr-CA"/>
               </w:rPr>
-              <w:t>{</w:t>
-            </w:r>
-            <w:proofErr w:type="gramStart"/>
-            <w:r>
-              <w:rPr>
-                <w:sz w:val="19"/>
-                <w:szCs w:val="19"/>
-                <w:lang w:val="fr-CA"/>
-              </w:rPr>
-              <w:t>titre</w:t>
-            </w:r>
-            <w:proofErr w:type="gramEnd"/>
-            <w:r>
-              <w:rPr>
-                <w:sz w:val="19"/>
-                <w:szCs w:val="19"/>
-                <w:lang w:val="fr-CA"/>
-              </w:rPr>
-              <w:t xml:space="preserve">} </w:t>
+              <w:t xml:space="preserve">{titre} </w:t>
             </w:r>
             <w:r>
               <w:rPr>
@@ -88,141 +158,53 @@
                 <w:szCs w:val="19"/>
                 <w:lang w:val="fr-CA"/>
               </w:rPr>
-              <w:t>{</w:t>
-            </w:r>
-            <w:proofErr w:type="spellStart"/>
-            <w:r>
-              <w:rPr>
-                <w:b/>
-                <w:bCs/>
+              <w:t>{nom_client}</w:t>
+            </w:r>
+            <w:r>
+              <w:rPr>
                 <w:sz w:val="19"/>
                 <w:szCs w:val="19"/>
                 <w:lang w:val="fr-CA"/>
               </w:rPr>
-              <w:t>nom_client</w:t>
-            </w:r>
-            <w:proofErr w:type="spellEnd"/>
-            <w:r>
-              <w:rPr>
-                <w:b/>
-                <w:bCs/>
+              <w:t>, {poste_client}</w:t>
+            </w:r>
+          </w:p>
+          <w:p>
+            <w:pPr>
+              <w:widowControl w:val="0"/>
+              <w:spacing w:after="57"/>
+            </w:pPr>
+            <w:r>
+              <w:rPr>
                 <w:sz w:val="19"/>
                 <w:szCs w:val="19"/>
-                <w:lang w:val="fr-CA"/>
-              </w:rPr>
-              <w:t>}</w:t>
-            </w:r>
+              </w:rPr>
+              <w:t>{entreprise}</w:t>
+            </w:r>
+          </w:p>
+          <w:p>
+            <w:pPr>
+              <w:widowControl w:val="0"/>
+              <w:spacing w:after="57"/>
+            </w:pPr>
             <w:r>
               <w:rPr>
                 <w:sz w:val="19"/>
                 <w:szCs w:val="19"/>
-                <w:lang w:val="fr-CA"/>
-              </w:rPr>
-              <w:t>, {</w:t>
-            </w:r>
-            <w:proofErr w:type="spellStart"/>
+              </w:rPr>
+              <w:t>{adresse}</w:t>
+            </w:r>
+          </w:p>
+          <w:p>
+            <w:pPr>
+              <w:widowControl w:val="0"/>
+            </w:pPr>
             <w:r>
               <w:rPr>
                 <w:sz w:val="19"/>
                 <w:szCs w:val="19"/>
-                <w:lang w:val="fr-CA"/>
-              </w:rPr>
-              <w:t>poste_client</w:t>
-            </w:r>
-            <w:proofErr w:type="spellEnd"/>
-            <w:r>
-              <w:rPr>
-                <w:sz w:val="19"/>
-                <w:szCs w:val="19"/>
-                <w:lang w:val="fr-CA"/>
-              </w:rPr>
-              <w:t>}</w:t>
-            </w:r>
-          </w:p>
-          <w:p>
-            <w:pPr>
-              <w:widowControl w:val="0"/>
-              <w:spacing w:after="57"/>
-            </w:pPr>
-            <w:r>
-              <w:rPr>
-                <w:sz w:val="19"/>
-                <w:szCs w:val="19"/>
-              </w:rPr>
-              <w:t>{</w:t>
-            </w:r>
-            <w:proofErr w:type="spellStart"/>
-            <w:r>
-              <w:rPr>
-                <w:sz w:val="19"/>
-                <w:szCs w:val="19"/>
-              </w:rPr>
-              <w:t>entreprise</w:t>
-            </w:r>
-            <w:proofErr w:type="spellEnd"/>
-            <w:r>
-              <w:rPr>
-                <w:sz w:val="19"/>
-                <w:szCs w:val="19"/>
-              </w:rPr>
-              <w:t>}</w:t>
-            </w:r>
-          </w:p>
-          <w:p>
-            <w:pPr>
-              <w:widowControl w:val="0"/>
-              <w:spacing w:after="57"/>
-            </w:pPr>
-            <w:r>
-              <w:rPr>
-                <w:sz w:val="19"/>
-                <w:szCs w:val="19"/>
-              </w:rPr>
-              <w:t>{</w:t>
-            </w:r>
-            <w:proofErr w:type="spellStart"/>
-            <w:r>
-              <w:rPr>
-                <w:sz w:val="19"/>
-                <w:szCs w:val="19"/>
-              </w:rPr>
-              <w:t>adresse</w:t>
-            </w:r>
-            <w:proofErr w:type="spellEnd"/>
-            <w:r>
-              <w:rPr>
-                <w:sz w:val="19"/>
-                <w:szCs w:val="19"/>
-              </w:rPr>
-              <w:t>}</w:t>
-            </w:r>
-          </w:p>
-          <w:p>
-            <w:pPr>
-              <w:widowControl w:val="0"/>
-            </w:pPr>
-            <w:r>
-              <w:rPr>
-                <w:sz w:val="19"/>
-                <w:szCs w:val="19"/>
-              </w:rPr>
-              <w:t>{</w:t>
-            </w:r>
-            <w:proofErr w:type="spellStart"/>
-            <w:r>
-              <w:rPr>
-                <w:sz w:val="19"/>
-                <w:szCs w:val="19"/>
-              </w:rPr>
-              <w:t>ville</w:t>
-            </w:r>
-            <w:proofErr w:type="spellEnd"/>
-            <w:r>
-              <w:rPr>
-                <w:sz w:val="19"/>
-                <w:szCs w:val="19"/>
-              </w:rPr>
-              <w:t>}</w:t>
+              </w:rPr>
+              <w:t>{ville}</w:t>
             </w:r>
           </w:p>
         </w:tc>
@@ -248,31 +230,13 @@
               <w:spacing w:after="57" w:line="240" w:lineRule="auto"/>
               <w:jc w:val="right"/>
             </w:pPr>
-            <w:proofErr w:type="spellStart"/>
             <w:r>
               <w:rPr>
                 <w:sz w:val="18"/>
                 <w:szCs w:val="18"/>
               </w:rPr>
-              <w:t>Offre</w:t>
-            </w:r>
-            <w:proofErr w:type="spellEnd"/>
-            <w:r>
-              <w:rPr>
-                <w:sz w:val="18"/>
-                <w:szCs w:val="18"/>
-              </w:rPr>
-              <w:t xml:space="preserve"> N</w:t>
-            </w:r>
-            <w:proofErr w:type="gramStart"/>
-            <w:r>
-              <w:rPr>
-                <w:sz w:val="18"/>
-                <w:szCs w:val="18"/>
-              </w:rPr>
-              <w:t>° :</w:t>
-            </w:r>
-            <w:proofErr w:type="gramEnd"/>
+              <w:t>Offre N° :</w:t>
+            </w:r>
           </w:p>
           <w:p>
             <w:pPr>
@@ -288,29 +252,7 @@
                 <w:sz w:val="22"/>
                 <w:szCs w:val="22"/>
               </w:rPr>
-              <w:t>{</w:t>
-            </w:r>
-            <w:proofErr w:type="spellStart"/>
-            <w:r>
-              <w:rPr>
-                <w:b/>
-                <w:bCs/>
-                <w:color w:val="1A2E1E"/>
-                <w:sz w:val="22"/>
-                <w:szCs w:val="22"/>
-              </w:rPr>
-              <w:t>numero_offre</w:t>
-            </w:r>
-            <w:proofErr w:type="spellEnd"/>
-            <w:r>
-              <w:rPr>
-                <w:b/>
-                <w:bCs/>
-                <w:color w:val="1A2E1E"/>
-                <w:sz w:val="22"/>
-                <w:szCs w:val="22"/>
-              </w:rPr>
-              <w:t>}</w:t>
+              <w:t>{numero_offre}</w:t>
             </w:r>
           </w:p>
         </w:tc>
@@ -332,7 +274,6 @@
         <w:widowControl w:val="0"/>
         <w:spacing w:after="113" w:line="288" w:lineRule="auto"/>
       </w:pPr>
-      <w:proofErr w:type="gramStart"/>
       <w:r>
         <w:rPr>
           <w:b/>
@@ -340,7 +281,6 @@
         </w:rPr>
         <w:t>OBJET :</w:t>
       </w:r>
-      <w:proofErr w:type="gramEnd"/>
     </w:p>
     <w:p>
       <w:pPr>
@@ -349,7 +289,6 @@
         <w:widowControl w:val="0"/>
         <w:spacing w:after="57" w:line="317" w:lineRule="auto"/>
       </w:pPr>
-      <w:proofErr w:type="spellStart"/>
       <w:r>
         <w:rPr>
           <w:b/>
@@ -358,31 +297,8 @@
           <w:sz w:val="22"/>
           <w:szCs w:val="22"/>
         </w:rPr>
-        <w:t>Offre</w:t>
-      </w:r>
-      <w:proofErr w:type="spellEnd"/>
-      <w:r>
-        <w:rPr>
-          <w:b/>
-          <w:bCs/>
-          <w:color w:val="C9A96E"/>
-          <w:sz w:val="22"/>
-          <w:szCs w:val="22"/>
-        </w:rPr>
-        <w:t xml:space="preserve"> de services </w:t>
-      </w:r>
-      <w:proofErr w:type="spellStart"/>
-      <w:r>
-        <w:rPr>
-          <w:b/>
-          <w:bCs/>
-          <w:color w:val="C9A96E"/>
-          <w:sz w:val="22"/>
-          <w:szCs w:val="22"/>
-        </w:rPr>
-        <w:t>professionnels</w:t>
-      </w:r>
-      <w:proofErr w:type="spellEnd"/>
+        <w:t>Offre de services professionnels</w:t>
+      </w:r>
     </w:p>
     <w:p>
       <w:pPr>
@@ -484,25 +400,7 @@
                 <w:sz w:val="19"/>
                 <w:szCs w:val="19"/>
               </w:rPr>
-              <w:t>{</w:t>
-            </w:r>
-            <w:proofErr w:type="spellStart"/>
-            <w:r>
-              <w:rPr>
-                <w:color w:val="4A4A4A"/>
-                <w:sz w:val="19"/>
-                <w:szCs w:val="19"/>
-              </w:rPr>
-              <w:t>date_offre</w:t>
-            </w:r>
-            <w:proofErr w:type="spellEnd"/>
-            <w:r>
-              <w:rPr>
-                <w:color w:val="4A4A4A"/>
-                <w:sz w:val="19"/>
-                <w:szCs w:val="19"/>
-              </w:rPr>
-              <w:t>}</w:t>
+              <w:t>{date_offre}</w:t>
             </w:r>
           </w:p>
         </w:tc>
@@ -534,57 +432,21 @@
               <w:rPr>
                 <w:lang w:val="fr-CA"/>
               </w:rPr>
-              <w:t>{</w:t>
-            </w:r>
-            <w:proofErr w:type="gramStart"/>
-            <w:r>
+              <w:t>{salutation},</w:t>
+            </w:r>
+          </w:p>
+          <w:p>
+            <w:pPr>
+              <w:pStyle w:val="CorpsBTH"/>
               <w:rPr>
                 <w:lang w:val="fr-CA"/>
               </w:rPr>
-              <w:t>salutation</w:t>
-            </w:r>
-            <w:proofErr w:type="gramEnd"/>
+            </w:pPr>
             <w:r>
               <w:rPr>
                 <w:lang w:val="fr-CA"/>
               </w:rPr>
-              <w:t>},</w:t>
-            </w:r>
-          </w:p>
-          <w:p>
-            <w:pPr>
-              <w:pStyle w:val="CorpsBTH"/>
-              <w:rPr>
-                <w:lang w:val="fr-CA"/>
-              </w:rPr>
-            </w:pPr>
-            <w:r>
-              <w:rPr>
-                <w:lang w:val="fr-CA"/>
-              </w:rPr>
-              <w:t>{</w:t>
-            </w:r>
-            <w:proofErr w:type="spellStart"/>
-            <w:proofErr w:type="gramStart"/>
-            <w:r>
-              <w:rPr>
-                <w:lang w:val="fr-CA"/>
-              </w:rPr>
-              <w:t>intro</w:t>
-            </w:r>
-            <w:proofErr w:type="gramEnd"/>
-            <w:r>
-              <w:rPr>
-                <w:lang w:val="fr-CA"/>
-              </w:rPr>
-              <w:t>_paragraphe</w:t>
-            </w:r>
-            <w:proofErr w:type="spellEnd"/>
-            <w:r>
-              <w:rPr>
-                <w:lang w:val="fr-CA"/>
-              </w:rPr>
-              <w:t>}</w:t>
+              <w:t>{intro_paragraphe}</w:t>
             </w:r>
           </w:p>
           <w:p>
@@ -675,15 +537,7 @@
                     <w:pStyle w:val="CalloutBTH"/>
                   </w:pPr>
                   <w:r>
-                    <w:t>{</w:t>
-                  </w:r>
-                  <w:proofErr w:type="spellStart"/>
-                  <w:r>
-                    <w:t>callout_objectif</w:t>
-                  </w:r>
-                  <w:proofErr w:type="spellEnd"/>
-                  <w:r>
-                    <w:t>}</w:t>
+                    <w:t>{callout_objectif}</w:t>
                   </w:r>
                 </w:p>
               </w:tc>
@@ -696,7 +550,7 @@
     <w:p>
       <w:pPr>
         <w:widowControl w:val="0"/>
-        <w:spacing w:before="80" w:line="240" w:lineRule="auto"/>
+        <w:spacing w:before="400" w:line="240" w:lineRule="auto" w:after="240"/>
       </w:pPr>
       <w:r>
         <w:t xml:space="preserve"> </w:t>
@@ -705,11 +559,9 @@
     <w:p>
       <w:pPr>
         <w:pStyle w:val="Titre2BTH"/>
-        <w:pageBreakBefore/>
         <w:widowControl w:val="0"/>
         <w:spacing w:before="0"/>
       </w:pPr>
-      <w:proofErr w:type="gramStart"/>
       <w:r>
         <w:rPr>
           <w:color w:val="C9A96E"/>
@@ -717,20 +569,9 @@
         <w:lastRenderedPageBreak/>
         <w:t xml:space="preserve">1.1  </w:t>
       </w:r>
-      <w:proofErr w:type="spellStart"/>
-      <w:r>
-        <w:t>Périmètre</w:t>
-      </w:r>
-      <w:proofErr w:type="spellEnd"/>
-      <w:proofErr w:type="gramEnd"/>
-      <w:r>
-        <w:t xml:space="preserve"> </w:t>
-      </w:r>
-      <w:proofErr w:type="spellStart"/>
-      <w:r>
-        <w:t>fonctionnel</w:t>
-      </w:r>
-      <w:proofErr w:type="spellEnd"/>
+      <w:r>
+        <w:t>Périmètre fonctionnel</w:t>
+      </w:r>
     </w:p>
     <w:p>
       <w:pPr>
@@ -759,15 +600,7 @@
         <w:spacing w:line="240" w:lineRule="auto"/>
       </w:pPr>
       <w:r>
-        <w:t>{/</w:t>
-      </w:r>
-      <w:proofErr w:type="spellStart"/>
-      <w:r>
-        <w:t>perimetre_items</w:t>
-      </w:r>
-      <w:proofErr w:type="spellEnd"/>
-      <w:r>
-        <w:t>}</w:t>
+        <w:t>{/perimetre_items}</w:t>
       </w:r>
     </w:p>
     <w:p>
@@ -784,27 +617,15 @@
         <w:pStyle w:val="Titre2BTH"/>
         <w:widowControl w:val="0"/>
       </w:pPr>
-      <w:proofErr w:type="gramStart"/>
       <w:r>
         <w:rPr>
           <w:color w:val="C9A96E"/>
         </w:rPr>
         <w:t xml:space="preserve">1.2  </w:t>
       </w:r>
-      <w:proofErr w:type="spellStart"/>
-      <w:r>
-        <w:t>Objectifs</w:t>
-      </w:r>
-      <w:proofErr w:type="spellEnd"/>
-      <w:proofErr w:type="gramEnd"/>
-      <w:r>
-        <w:t xml:space="preserve"> du </w:t>
-      </w:r>
-      <w:proofErr w:type="spellStart"/>
-      <w:r>
-        <w:t>projet</w:t>
-      </w:r>
-      <w:proofErr w:type="spellEnd"/>
+      <w:r>
+        <w:t>Objectifs du projet</w:t>
+      </w:r>
     </w:p>
     <w:p>
       <w:pPr>
@@ -849,15 +670,7 @@
         <w:spacing w:line="240" w:lineRule="auto"/>
       </w:pPr>
       <w:r>
-        <w:t>{/</w:t>
-      </w:r>
-      <w:proofErr w:type="spellStart"/>
-      <w:r>
-        <w:t>objectifs_items</w:t>
-      </w:r>
-      <w:proofErr w:type="spellEnd"/>
-      <w:r>
-        <w:t>}</w:t>
+        <w:t>{/objectifs_items}</w:t>
       </w:r>
     </w:p>
     <w:p>
@@ -874,19 +687,15 @@
         <w:pStyle w:val="Titre2BTH"/>
         <w:widowControl w:val="0"/>
       </w:pPr>
-      <w:proofErr w:type="gramStart"/>
       <w:r>
         <w:rPr>
           <w:color w:val="C9A96E"/>
         </w:rPr>
         <w:t xml:space="preserve">1.3  </w:t>
       </w:r>
-      <w:proofErr w:type="spellStart"/>
       <w:r>
         <w:t>Hypothèses</w:t>
       </w:r>
-      <w:proofErr w:type="spellEnd"/>
-      <w:proofErr w:type="gramEnd"/>
     </w:p>
     <w:p>
       <w:pPr>
@@ -931,15 +740,7 @@
         <w:spacing w:line="240" w:lineRule="auto"/>
       </w:pPr>
       <w:r>
-        <w:t>{/</w:t>
-      </w:r>
-      <w:proofErr w:type="spellStart"/>
-      <w:r>
-        <w:t>hypotheses_items</w:t>
-      </w:r>
-      <w:proofErr w:type="spellEnd"/>
-      <w:r>
-        <w:t>}</w:t>
+        <w:t>{/hypotheses_items}</w:t>
       </w:r>
     </w:p>
     <w:p>
@@ -954,7 +755,6 @@
     <w:p>
       <w:pPr>
         <w:pStyle w:val="Titre1BTH"/>
-        <w:pageBreakBefore/>
         <w:widowControl w:val="0"/>
         <w:pBdr>
           <w:bottom w:val="single" w:sz="6" w:space="6" w:color="C9A96E"/>
@@ -963,13 +763,8 @@
       </w:pPr>
       <w:r>
         <w:lastRenderedPageBreak/>
-        <w:t xml:space="preserve">2.  </w:t>
-      </w:r>
-      <w:proofErr w:type="spellStart"/>
-      <w:r>
-        <w:t>Livrables</w:t>
-      </w:r>
-      <w:proofErr w:type="spellEnd"/>
+        <w:t>2.  Livrables</w:t>
+      </w:r>
     </w:p>
     <w:p>
       <w:pPr>
@@ -1014,15 +809,7 @@
         <w:spacing w:line="240" w:lineRule="auto"/>
       </w:pPr>
       <w:r>
-        <w:t>{/</w:t>
-      </w:r>
-      <w:proofErr w:type="spellStart"/>
-      <w:r>
-        <w:t>livrables_items</w:t>
-      </w:r>
-      <w:proofErr w:type="spellEnd"/>
-      <w:r>
-        <w:t>}</w:t>
+        <w:t>{/livrables_items}</w:t>
       </w:r>
     </w:p>
     <w:p>
@@ -1037,34 +824,22 @@
     <w:p>
       <w:pPr>
         <w:pStyle w:val="Titre1BTH"/>
+        <w:pageBreakBefore w:val="0"/>
         <w:widowControl w:val="0"/>
         <w:pBdr>
           <w:bottom w:val="single" w:sz="6" w:space="6" w:color="C9A96E"/>
         </w:pBdr>
       </w:pPr>
       <w:r>
-        <w:t xml:space="preserve">3.  </w:t>
-      </w:r>
-      <w:proofErr w:type="spellStart"/>
-      <w:r>
-        <w:t>Échéancier</w:t>
-      </w:r>
-      <w:proofErr w:type="spellEnd"/>
+        <w:t>3.  Échéancier</w:t>
+      </w:r>
     </w:p>
     <w:p>
       <w:pPr>
         <w:pStyle w:val="CorpsBTH"/>
       </w:pPr>
       <w:r>
-        <w:t>{</w:t>
-      </w:r>
-      <w:proofErr w:type="spellStart"/>
-      <w:r>
-        <w:t>description_echeancier</w:t>
-      </w:r>
-      <w:proofErr w:type="spellEnd"/>
-      <w:r>
-        <w:t>}</w:t>
+        <w:t>{description_echeancier}</w:t>
       </w:r>
     </w:p>
     <w:p>
@@ -1119,37 +894,19 @@
           <w:bCs/>
           <w:color w:val="1A2E1E"/>
         </w:rPr>
-        <w:t>{#groupes_</w:t>
-      </w:r>
-      <w:proofErr w:type="gramStart"/>
-      <w:r>
-        <w:rPr>
-          <w:b/>
-          <w:bCs/>
-          <w:color w:val="1A2E1E"/>
-        </w:rPr>
-        <w:t>budget}{</w:t>
-      </w:r>
-      <w:proofErr w:type="gramEnd"/>
-      <w:r>
-        <w:rPr>
-          <w:b/>
-          <w:bCs/>
-          <w:color w:val="1A2E1E"/>
-        </w:rPr>
-        <w:t>titre_groupe}</w:t>
+        <w:t>{#groupes_budget}{titre_groupe}</w:t>
       </w:r>
     </w:p>
     <w:tbl>
       <w:tblPr>
         <w:tblW w:w="9525" w:type="dxa"/>
         <w:tblBorders>
-          <w:top w:val="single" w:sz="4" w:space="0" w:color="auto"/>
-          <w:left w:val="single" w:sz="4" w:space="0" w:color="auto"/>
-          <w:bottom w:val="single" w:sz="4" w:space="0" w:color="auto"/>
-          <w:right w:val="single" w:sz="4" w:space="0" w:color="auto"/>
-          <w:insideH w:val="single" w:sz="4" w:space="0" w:color="auto"/>
-          <w:insideV w:val="single" w:sz="4" w:space="0" w:color="auto"/>
+          <w:top w:val="none" w:sz="0" w:space="0" w:color="auto"/>
+          <w:left w:val="none" w:sz="0" w:space="0" w:color="auto"/>
+          <w:bottom w:val="none" w:sz="0" w:space="0" w:color="auto"/>
+          <w:right w:val="none" w:sz="0" w:space="0" w:color="auto"/>
+          <w:insideH w:val="none" w:sz="0" w:space="0" w:color="auto"/>
+          <w:insideV w:val="none" w:sz="0" w:space="0" w:color="auto"/>
         </w:tblBorders>
         <w:tblCellMar>
           <w:left w:w="10" w:type="dxa"/>
@@ -1158,10 +915,10 @@
         <w:tblLook w:val="04A0" w:firstRow="1" w:lastRow="0" w:firstColumn="1" w:lastColumn="0" w:noHBand="0" w:noVBand="1"/>
       </w:tblPr>
       <w:tblGrid>
-        <w:gridCol w:w="2134"/>
-        <w:gridCol w:w="3744"/>
-        <w:gridCol w:w="1246"/>
-        <w:gridCol w:w="2401"/>
+        <w:gridCol w:w="650"/>
+        <w:gridCol w:w="5900"/>
+        <w:gridCol w:w="775"/>
+        <w:gridCol w:w="2200"/>
       </w:tblGrid>
       <w:tr>
         <w:tblPrEx>
@@ -1172,23 +929,25 @@
         </w:tblPrEx>
         <w:trPr>
           <w:cantSplit/>
+          <w:tblHeader/>
         </w:trPr>
         <w:tc>
           <w:tcPr>
-            <w:tcW w:w="667" w:type="dxa"/>
+            <w:tcW w:w="650" w:type="dxa"/>
             <w:tcBorders>
-              <w:top w:val="single" w:sz="4" w:space="0" w:color="DCE8DC"/>
-              <w:left w:val="single" w:sz="4" w:space="0" w:color="DCE8DC"/>
-              <w:bottom w:val="single" w:sz="4" w:space="0" w:color="DCE8DC"/>
-              <w:right w:val="single" w:sz="4" w:space="0" w:color="DCE8DC"/>
+              <w:top w:val="none" w:sz="0" w:space="0" w:color="auto"/>
+              <w:left w:val="none" w:sz="0" w:space="0" w:color="auto"/>
+              <w:bottom w:val="none" w:sz="0" w:space="0" w:color="auto"/>
+              <w:right w:val="none" w:sz="0" w:space="0" w:color="auto"/>
             </w:tcBorders>
-            <w:shd w:val="clear" w:color="auto" w:fill="F3F4F6"/>
+            <w:shd w:val="clear" w:color="auto" w:fill="1A2E1E"/>
             <w:tcMar>
-              <w:top w:w="200" w:type="dxa"/>
-              <w:left w:w="200" w:type="dxa"/>
-              <w:bottom w:w="200" w:type="dxa"/>
-              <w:right w:w="200" w:type="dxa"/>
+              <w:top w:w="120" w:type="dxa"/>
+              <w:left w:w="150" w:type="dxa"/>
+              <w:bottom w:w="120" w:type="dxa"/>
+              <w:right w:w="150" w:type="dxa"/>
             </w:tcMar>
+            <w:vAlign w:val="center"/>
           </w:tcPr>
           <w:p>
             <w:pPr>
@@ -1199,7 +958,7 @@
               <w:rPr>
                 <w:b/>
                 <w:bCs/>
-                <w:color w:val="1A2E1E"/>
+                <w:color w:val="FEFEFE"/>
               </w:rPr>
               <w:t>N°</w:t>
             </w:r>
@@ -1207,53 +966,53 @@
         </w:tc>
         <w:tc>
           <w:tcPr>
-            <w:tcW w:w="6668" w:type="dxa"/>
+            <w:tcW w:w="5900" w:type="dxa"/>
             <w:tcBorders>
-              <w:top w:val="single" w:sz="4" w:space="0" w:color="DCE8DC"/>
-              <w:left w:val="single" w:sz="4" w:space="0" w:color="DCE8DC"/>
-              <w:bottom w:val="single" w:sz="4" w:space="0" w:color="DCE8DC"/>
-              <w:right w:val="single" w:sz="4" w:space="0" w:color="DCE8DC"/>
+              <w:top w:val="none" w:sz="0" w:space="0" w:color="auto"/>
+              <w:left w:val="none" w:sz="0" w:space="0" w:color="auto"/>
+              <w:bottom w:val="none" w:sz="0" w:space="0" w:color="auto"/>
+              <w:right w:val="none" w:sz="0" w:space="0" w:color="auto"/>
             </w:tcBorders>
-            <w:shd w:val="clear" w:color="auto" w:fill="F3F4F6"/>
+            <w:shd w:val="clear" w:color="auto" w:fill="1A2E1E"/>
             <w:tcMar>
-              <w:top w:w="200" w:type="dxa"/>
-              <w:left w:w="200" w:type="dxa"/>
-              <w:bottom w:w="200" w:type="dxa"/>
-              <w:right w:w="200" w:type="dxa"/>
+              <w:top w:w="120" w:type="dxa"/>
+              <w:left w:w="150" w:type="dxa"/>
+              <w:bottom w:w="120" w:type="dxa"/>
+              <w:right w:w="150" w:type="dxa"/>
             </w:tcMar>
+            <w:vAlign w:val="center"/>
           </w:tcPr>
           <w:p>
             <w:pPr>
               <w:spacing w:before="60" w:after="60"/>
             </w:pPr>
-            <w:proofErr w:type="spellStart"/>
             <w:r>
               <w:rPr>
                 <w:b/>
                 <w:bCs/>
-                <w:color w:val="1A2E1E"/>
+                <w:color w:val="FEFEFE"/>
               </w:rPr>
               <w:t>Désignation</w:t>
             </w:r>
-            <w:proofErr w:type="spellEnd"/>
           </w:p>
         </w:tc>
         <w:tc>
           <w:tcPr>
-            <w:tcW w:w="762" w:type="dxa"/>
+            <w:tcW w:w="775" w:type="dxa"/>
             <w:tcBorders>
-              <w:top w:val="single" w:sz="4" w:space="0" w:color="DCE8DC"/>
-              <w:left w:val="single" w:sz="4" w:space="0" w:color="DCE8DC"/>
-              <w:bottom w:val="single" w:sz="4" w:space="0" w:color="DCE8DC"/>
-              <w:right w:val="single" w:sz="4" w:space="0" w:color="DCE8DC"/>
+              <w:top w:val="none" w:sz="0" w:space="0" w:color="auto"/>
+              <w:left w:val="none" w:sz="0" w:space="0" w:color="auto"/>
+              <w:bottom w:val="none" w:sz="0" w:space="0" w:color="auto"/>
+              <w:right w:val="none" w:sz="0" w:space="0" w:color="auto"/>
             </w:tcBorders>
-            <w:shd w:val="clear" w:color="auto" w:fill="F3F4F6"/>
+            <w:shd w:val="clear" w:color="auto" w:fill="1A2E1E"/>
             <w:tcMar>
-              <w:top w:w="200" w:type="dxa"/>
-              <w:left w:w="200" w:type="dxa"/>
-              <w:bottom w:w="200" w:type="dxa"/>
-              <w:right w:w="200" w:type="dxa"/>
+              <w:top w:w="120" w:type="dxa"/>
+              <w:left w:w="150" w:type="dxa"/>
+              <w:bottom w:w="120" w:type="dxa"/>
+              <w:right w:w="150" w:type="dxa"/>
             </w:tcMar>
+            <w:vAlign w:val="center"/>
           </w:tcPr>
           <w:p>
             <w:pPr>
@@ -1264,7 +1023,7 @@
               <w:rPr>
                 <w:b/>
                 <w:bCs/>
-                <w:color w:val="1A2E1E"/>
+                <w:color w:val="FEFEFE"/>
               </w:rPr>
               <w:t>Q</w:t>
             </w:r>
@@ -1272,20 +1031,21 @@
         </w:tc>
         <w:tc>
           <w:tcPr>
-            <w:tcW w:w="1428" w:type="dxa"/>
+            <w:tcW w:w="2200" w:type="dxa"/>
             <w:tcBorders>
-              <w:top w:val="single" w:sz="4" w:space="0" w:color="DCE8DC"/>
-              <w:left w:val="single" w:sz="4" w:space="0" w:color="DCE8DC"/>
-              <w:bottom w:val="single" w:sz="4" w:space="0" w:color="DCE8DC"/>
-              <w:right w:val="single" w:sz="4" w:space="0" w:color="DCE8DC"/>
+              <w:top w:val="none" w:sz="0" w:space="0" w:color="auto"/>
+              <w:left w:val="none" w:sz="0" w:space="0" w:color="auto"/>
+              <w:bottom w:val="none" w:sz="0" w:space="0" w:color="auto"/>
+              <w:right w:val="none" w:sz="0" w:space="0" w:color="auto"/>
             </w:tcBorders>
-            <w:shd w:val="clear" w:color="auto" w:fill="F3F4F6"/>
+            <w:shd w:val="clear" w:color="auto" w:fill="1A2E1E"/>
             <w:tcMar>
-              <w:top w:w="200" w:type="dxa"/>
-              <w:left w:w="200" w:type="dxa"/>
-              <w:bottom w:w="200" w:type="dxa"/>
-              <w:right w:w="200" w:type="dxa"/>
+              <w:top w:w="120" w:type="dxa"/>
+              <w:left w:w="150" w:type="dxa"/>
+              <w:bottom w:w="120" w:type="dxa"/>
+              <w:right w:w="150" w:type="dxa"/>
             </w:tcMar>
+            <w:vAlign w:val="center"/>
           </w:tcPr>
           <w:p>
             <w:pPr>
@@ -1296,7 +1056,7 @@
               <w:rPr>
                 <w:b/>
                 <w:bCs/>
-                <w:color w:val="1A2E1E"/>
+                <w:color w:val="FEFEFE"/>
               </w:rPr>
               <w:t>Prix</w:t>
             </w:r>
@@ -1315,19 +1075,20 @@
         </w:trPr>
         <w:tc>
           <w:tcPr>
-            <w:tcW w:w="667" w:type="dxa"/>
+            <w:tcW w:w="650" w:type="dxa"/>
             <w:tcBorders>
-              <w:top w:val="single" w:sz="4" w:space="0" w:color="DCE8DC"/>
-              <w:left w:val="single" w:sz="4" w:space="0" w:color="DCE8DC"/>
-              <w:bottom w:val="single" w:sz="4" w:space="0" w:color="DCE8DC"/>
-              <w:right w:val="single" w:sz="4" w:space="0" w:color="DCE8DC"/>
+              <w:top w:val="none" w:sz="0" w:space="0" w:color="auto"/>
+              <w:left w:val="none" w:sz="0" w:space="0" w:color="auto"/>
+              <w:bottom w:val="single" w:sz="4" w:space="0" w:color="E6E9E6"/>
+              <w:right w:val="none" w:sz="0" w:space="0" w:color="auto"/>
             </w:tcBorders>
             <w:tcMar>
-              <w:top w:w="200" w:type="dxa"/>
-              <w:left w:w="200" w:type="dxa"/>
-              <w:bottom w:w="200" w:type="dxa"/>
-              <w:right w:w="200" w:type="dxa"/>
+              <w:top w:w="90" w:type="dxa"/>
+              <w:left w:w="150" w:type="dxa"/>
+              <w:bottom w:w="90" w:type="dxa"/>
+              <w:right w:w="150" w:type="dxa"/>
             </w:tcMar>
+            <w:vAlign w:val="top"/>
           </w:tcPr>
           <w:p>
             <w:pPr>
@@ -1340,68 +1101,55 @@
                 <w:bCs/>
                 <w:color w:val="1A2E1E"/>
               </w:rPr>
-              <w:t>{#</w:t>
-            </w:r>
-            <w:proofErr w:type="gramStart"/>
-            <w:r>
-              <w:rPr>
-                <w:b/>
-                <w:bCs/>
-                <w:color w:val="1A2E1E"/>
-              </w:rPr>
-              <w:t>lignes}{</w:t>
-            </w:r>
-            <w:proofErr w:type="gramEnd"/>
-            <w:r>
-              <w:rPr>
-                <w:b/>
-                <w:bCs/>
-                <w:color w:val="1A2E1E"/>
-              </w:rPr>
-              <w:t>numero}</w:t>
+              <w:t>{#lignes}{numero}</w:t>
             </w:r>
           </w:p>
         </w:tc>
         <w:tc>
           <w:tcPr>
-            <w:tcW w:w="6668" w:type="dxa"/>
+            <w:tcW w:w="5900" w:type="dxa"/>
             <w:tcBorders>
-              <w:top w:val="single" w:sz="4" w:space="0" w:color="DCE8DC"/>
-              <w:left w:val="single" w:sz="4" w:space="0" w:color="DCE8DC"/>
-              <w:bottom w:val="single" w:sz="4" w:space="0" w:color="DCE8DC"/>
-              <w:right w:val="single" w:sz="4" w:space="0" w:color="DCE8DC"/>
+              <w:top w:val="none" w:sz="0" w:space="0" w:color="auto"/>
+              <w:left w:val="none" w:sz="0" w:space="0" w:color="auto"/>
+              <w:bottom w:val="single" w:sz="4" w:space="0" w:color="E6E9E6"/>
+              <w:right w:val="none" w:sz="0" w:space="0" w:color="auto"/>
             </w:tcBorders>
             <w:tcMar>
-              <w:top w:w="200" w:type="dxa"/>
-              <w:left w:w="200" w:type="dxa"/>
-              <w:bottom w:w="200" w:type="dxa"/>
-              <w:right w:w="200" w:type="dxa"/>
+              <w:top w:w="90" w:type="dxa"/>
+              <w:left w:w="150" w:type="dxa"/>
+              <w:bottom w:w="90" w:type="dxa"/>
+              <w:right w:w="150" w:type="dxa"/>
             </w:tcMar>
+            <w:vAlign w:val="top"/>
           </w:tcPr>
           <w:p>
             <w:pPr>
               <w:spacing w:before="60" w:after="60"/>
             </w:pPr>
             <w:r>
+              <w:rPr>
+                <w:color w:val="2B2B2B"/>
+              </w:rPr>
               <w:t>{designation}</w:t>
             </w:r>
           </w:p>
         </w:tc>
         <w:tc>
           <w:tcPr>
-            <w:tcW w:w="762" w:type="dxa"/>
+            <w:tcW w:w="775" w:type="dxa"/>
             <w:tcBorders>
-              <w:top w:val="single" w:sz="4" w:space="0" w:color="DCE8DC"/>
-              <w:left w:val="single" w:sz="4" w:space="0" w:color="DCE8DC"/>
-              <w:bottom w:val="single" w:sz="4" w:space="0" w:color="DCE8DC"/>
-              <w:right w:val="single" w:sz="4" w:space="0" w:color="DCE8DC"/>
+              <w:top w:val="none" w:sz="0" w:space="0" w:color="auto"/>
+              <w:left w:val="none" w:sz="0" w:space="0" w:color="auto"/>
+              <w:bottom w:val="single" w:sz="4" w:space="0" w:color="E6E9E6"/>
+              <w:right w:val="none" w:sz="0" w:space="0" w:color="auto"/>
             </w:tcBorders>
             <w:tcMar>
-              <w:top w:w="200" w:type="dxa"/>
-              <w:left w:w="200" w:type="dxa"/>
-              <w:bottom w:w="200" w:type="dxa"/>
-              <w:right w:w="200" w:type="dxa"/>
+              <w:top w:w="90" w:type="dxa"/>
+              <w:left w:w="150" w:type="dxa"/>
+              <w:bottom w:w="90" w:type="dxa"/>
+              <w:right w:w="150" w:type="dxa"/>
             </w:tcMar>
+            <w:vAlign w:val="top"/>
           </w:tcPr>
           <w:p>
             <w:pPr>
@@ -1409,33 +1157,29 @@
               <w:jc w:val="center"/>
             </w:pPr>
             <w:r>
-              <w:t>{</w:t>
-            </w:r>
-            <w:proofErr w:type="spellStart"/>
-            <w:r>
-              <w:t>quantite</w:t>
-            </w:r>
-            <w:proofErr w:type="spellEnd"/>
-            <w:r>
-              <w:t>}</w:t>
+              <w:rPr>
+                <w:color w:val="2B2B2B"/>
+              </w:rPr>
+              <w:t>{quantite}</w:t>
             </w:r>
           </w:p>
         </w:tc>
         <w:tc>
           <w:tcPr>
-            <w:tcW w:w="1428" w:type="dxa"/>
+            <w:tcW w:w="2200" w:type="dxa"/>
             <w:tcBorders>
-              <w:top w:val="single" w:sz="4" w:space="0" w:color="DCE8DC"/>
-              <w:left w:val="single" w:sz="4" w:space="0" w:color="DCE8DC"/>
-              <w:bottom w:val="single" w:sz="4" w:space="0" w:color="DCE8DC"/>
-              <w:right w:val="single" w:sz="4" w:space="0" w:color="DCE8DC"/>
+              <w:top w:val="none" w:sz="0" w:space="0" w:color="auto"/>
+              <w:left w:val="none" w:sz="0" w:space="0" w:color="auto"/>
+              <w:bottom w:val="single" w:sz="4" w:space="0" w:color="E6E9E6"/>
+              <w:right w:val="none" w:sz="0" w:space="0" w:color="auto"/>
             </w:tcBorders>
             <w:tcMar>
-              <w:top w:w="200" w:type="dxa"/>
-              <w:left w:w="200" w:type="dxa"/>
-              <w:bottom w:w="200" w:type="dxa"/>
-              <w:right w:w="200" w:type="dxa"/>
+              <w:top w:w="90" w:type="dxa"/>
+              <w:left w:w="150" w:type="dxa"/>
+              <w:bottom w:w="90" w:type="dxa"/>
+              <w:right w:w="150" w:type="dxa"/>
             </w:tcMar>
+            <w:vAlign w:val="top"/>
           </w:tcPr>
           <w:p>
             <w:pPr>
@@ -1443,31 +1187,10 @@
               <w:jc w:val="right"/>
             </w:pPr>
             <w:r>
-              <w:t>{</w:t>
-            </w:r>
-            <w:proofErr w:type="spellStart"/>
-            <w:r>
-              <w:t>prix_</w:t>
-            </w:r>
-            <w:proofErr w:type="gramStart"/>
-            <w:r>
-              <w:t>formate</w:t>
-            </w:r>
-            <w:proofErr w:type="spellEnd"/>
-            <w:r>
-              <w:t>}{</w:t>
-            </w:r>
-            <w:proofErr w:type="gramEnd"/>
-            <w:r>
-              <w:t>/</w:t>
-            </w:r>
-            <w:proofErr w:type="spellStart"/>
-            <w:r>
-              <w:t>lignes</w:t>
-            </w:r>
-            <w:proofErr w:type="spellEnd"/>
-            <w:r>
-              <w:t>}</w:t>
+              <w:rPr>
+                <w:color w:val="2B2B2B"/>
+              </w:rPr>
+              <w:t>{prix_formate}{/lignes}</w:t>
             </w:r>
           </w:p>
         </w:tc>
@@ -1487,18 +1210,18 @@
             <w:tcW w:w="8097" w:type="dxa"/>
             <w:gridSpan w:val="3"/>
             <w:tcBorders>
-              <w:top w:val="single" w:sz="4" w:space="0" w:color="DCE8DC"/>
-              <w:left w:val="single" w:sz="4" w:space="0" w:color="DCE8DC"/>
-              <w:bottom w:val="single" w:sz="4" w:space="0" w:color="DCE8DC"/>
-              <w:right w:val="single" w:sz="4" w:space="0" w:color="DCE8DC"/>
+              <w:top w:val="single" w:sz="12" w:space="0" w:color="1A2E1E"/>
+              <w:left w:val="none" w:sz="0" w:space="0" w:color="auto"/>
+              <w:bottom w:val="none" w:sz="0" w:space="0" w:color="auto"/>
+              <w:right w:val="none" w:sz="0" w:space="0" w:color="auto"/>
             </w:tcBorders>
-            <w:shd w:val="clear" w:color="auto" w:fill="F3F4F6"/>
             <w:tcMar>
-              <w:top w:w="80" w:type="dxa"/>
-              <w:left w:w="170" w:type="dxa"/>
-              <w:bottom w:w="80" w:type="dxa"/>
-              <w:right w:w="170" w:type="dxa"/>
+              <w:top w:w="120" w:type="dxa"/>
+              <w:left w:w="150" w:type="dxa"/>
+              <w:bottom w:w="120" w:type="dxa"/>
+              <w:right w:w="150" w:type="dxa"/>
             </w:tcMar>
+            <w:vAlign w:val="center"/>
           </w:tcPr>
           <w:p>
             <w:pPr>
@@ -1509,7 +1232,7 @@
               <w:rPr>
                 <w:b/>
                 <w:bCs/>
-                <w:color w:val="1A2E1E"/>
+                <w:color w:val="2B2B2B"/>
               </w:rPr>
               <w:t>Total hors taxes</w:t>
             </w:r>
@@ -1519,18 +1242,18 @@
           <w:tcPr>
             <w:tcW w:w="1428" w:type="dxa"/>
             <w:tcBorders>
-              <w:top w:val="single" w:sz="4" w:space="0" w:color="DCE8DC"/>
-              <w:left w:val="single" w:sz="4" w:space="0" w:color="DCE8DC"/>
-              <w:bottom w:val="single" w:sz="4" w:space="0" w:color="DCE8DC"/>
-              <w:right w:val="single" w:sz="4" w:space="0" w:color="DCE8DC"/>
+              <w:top w:val="single" w:sz="12" w:space="0" w:color="1A2E1E"/>
+              <w:left w:val="none" w:sz="0" w:space="0" w:color="auto"/>
+              <w:bottom w:val="none" w:sz="0" w:space="0" w:color="auto"/>
+              <w:right w:val="none" w:sz="0" w:space="0" w:color="auto"/>
             </w:tcBorders>
-            <w:shd w:val="clear" w:color="auto" w:fill="F3F4F6"/>
             <w:tcMar>
-              <w:top w:w="200" w:type="dxa"/>
-              <w:left w:w="200" w:type="dxa"/>
-              <w:bottom w:w="200" w:type="dxa"/>
-              <w:right w:w="200" w:type="dxa"/>
+              <w:top w:w="120" w:type="dxa"/>
+              <w:left w:w="150" w:type="dxa"/>
+              <w:bottom w:w="120" w:type="dxa"/>
+              <w:right w:w="150" w:type="dxa"/>
             </w:tcMar>
+            <w:vAlign w:val="center"/>
           </w:tcPr>
           <w:p>
             <w:pPr>
@@ -1543,25 +1266,7 @@
                 <w:bCs/>
                 <w:color w:val="1A2E1E"/>
               </w:rPr>
-              <w:t>{</w:t>
-            </w:r>
-            <w:proofErr w:type="spellStart"/>
-            <w:r>
-              <w:rPr>
-                <w:b/>
-                <w:bCs/>
-                <w:color w:val="1A2E1E"/>
-              </w:rPr>
-              <w:t>sous_total_formate</w:t>
-            </w:r>
-            <w:proofErr w:type="spellEnd"/>
-            <w:r>
-              <w:rPr>
-                <w:b/>
-                <w:bCs/>
-                <w:color w:val="1A2E1E"/>
-              </w:rPr>
-              <w:t>}</w:t>
+              <w:t>{sous_total_formate}</w:t>
             </w:r>
           </w:p>
         </w:tc>
@@ -1578,30 +1283,13 @@
           <w:sz w:val="8"/>
           <w:szCs w:val="8"/>
         </w:rPr>
-        <w:t>{/</w:t>
-      </w:r>
-      <w:proofErr w:type="spellStart"/>
-      <w:r>
-        <w:rPr>
-          <w:color w:val="FFFFFF"/>
-          <w:sz w:val="8"/>
-          <w:szCs w:val="8"/>
-        </w:rPr>
-        <w:t>groupes_budget</w:t>
-      </w:r>
-      <w:proofErr w:type="spellEnd"/>
-      <w:r>
-        <w:rPr>
-          <w:color w:val="FFFFFF"/>
-          <w:sz w:val="8"/>
-          <w:szCs w:val="8"/>
-        </w:rPr>
-        <w:t>}</w:t>
+        <w:t>{/groupes_budget}</w:t>
       </w:r>
     </w:p>
     <w:p>
       <w:pPr>
         <w:pStyle w:val="TitreTableauBTH"/>
+        <w:keepNext/>
         <w:keepLines/>
         <w:widowControl w:val="0"/>
         <w:spacing w:before="454"/>
@@ -1620,12 +1308,12 @@
       <w:tblPr>
         <w:tblW w:w="9525" w:type="dxa"/>
         <w:tblBorders>
-          <w:top w:val="single" w:sz="4" w:space="0" w:color="auto"/>
-          <w:left w:val="single" w:sz="4" w:space="0" w:color="auto"/>
-          <w:bottom w:val="single" w:sz="4" w:space="0" w:color="auto"/>
-          <w:right w:val="single" w:sz="4" w:space="0" w:color="auto"/>
-          <w:insideH w:val="single" w:sz="4" w:space="0" w:color="auto"/>
-          <w:insideV w:val="single" w:sz="4" w:space="0" w:color="auto"/>
+          <w:top w:val="none" w:sz="0" w:space="0" w:color="auto"/>
+          <w:left w:val="none" w:sz="0" w:space="0" w:color="auto"/>
+          <w:bottom w:val="none" w:sz="0" w:space="0" w:color="auto"/>
+          <w:right w:val="none" w:sz="0" w:space="0" w:color="auto"/>
+          <w:insideH w:val="none" w:sz="0" w:space="0" w:color="auto"/>
+          <w:insideV w:val="none" w:sz="0" w:space="0" w:color="auto"/>
         </w:tblBorders>
         <w:tblCellMar>
           <w:left w:w="10" w:type="dxa"/>
@@ -1634,10 +1322,10 @@
         <w:tblLook w:val="04A0" w:firstRow="1" w:lastRow="0" w:firstColumn="1" w:lastColumn="0" w:noHBand="0" w:noVBand="1"/>
       </w:tblPr>
       <w:tblGrid>
-        <w:gridCol w:w="2779"/>
-        <w:gridCol w:w="2531"/>
-        <w:gridCol w:w="1246"/>
-        <w:gridCol w:w="2969"/>
+        <w:gridCol w:w="650"/>
+        <w:gridCol w:w="5900"/>
+        <w:gridCol w:w="775"/>
+        <w:gridCol w:w="2200"/>
       </w:tblGrid>
       <w:tr>
         <w:tblPrEx>
@@ -1648,23 +1336,25 @@
         </w:tblPrEx>
         <w:trPr>
           <w:cantSplit/>
+          <w:tblHeader/>
         </w:trPr>
         <w:tc>
           <w:tcPr>
-            <w:tcW w:w="667" w:type="dxa"/>
+            <w:tcW w:w="650" w:type="dxa"/>
             <w:tcBorders>
-              <w:top w:val="single" w:sz="4" w:space="0" w:color="DCE8DC"/>
-              <w:left w:val="single" w:sz="4" w:space="0" w:color="DCE8DC"/>
-              <w:bottom w:val="single" w:sz="4" w:space="0" w:color="DCE8DC"/>
-              <w:right w:val="single" w:sz="4" w:space="0" w:color="DCE8DC"/>
+              <w:top w:val="none" w:sz="0" w:space="0" w:color="auto"/>
+              <w:left w:val="none" w:sz="0" w:space="0" w:color="auto"/>
+              <w:bottom w:val="none" w:sz="0" w:space="0" w:color="auto"/>
+              <w:right w:val="none" w:sz="0" w:space="0" w:color="auto"/>
             </w:tcBorders>
-            <w:shd w:val="clear" w:color="auto" w:fill="F3F4F6"/>
+            <w:shd w:val="clear" w:color="auto" w:fill="1A2E1E"/>
             <w:tcMar>
-              <w:top w:w="200" w:type="dxa"/>
-              <w:left w:w="200" w:type="dxa"/>
-              <w:bottom w:w="200" w:type="dxa"/>
-              <w:right w:w="200" w:type="dxa"/>
+              <w:top w:w="120" w:type="dxa"/>
+              <w:left w:w="150" w:type="dxa"/>
+              <w:bottom w:w="120" w:type="dxa"/>
+              <w:right w:w="150" w:type="dxa"/>
             </w:tcMar>
+            <w:vAlign w:val="center"/>
           </w:tcPr>
           <w:p>
             <w:pPr>
@@ -1676,7 +1366,7 @@
               <w:rPr>
                 <w:b/>
                 <w:bCs/>
-                <w:color w:val="1A2E1E"/>
+                <w:color w:val="FEFEFE"/>
               </w:rPr>
               <w:t>N°</w:t>
             </w:r>
@@ -1684,54 +1374,54 @@
         </w:tc>
         <w:tc>
           <w:tcPr>
-            <w:tcW w:w="6668" w:type="dxa"/>
+            <w:tcW w:w="5900" w:type="dxa"/>
             <w:tcBorders>
-              <w:top w:val="single" w:sz="4" w:space="0" w:color="DCE8DC"/>
-              <w:left w:val="single" w:sz="4" w:space="0" w:color="DCE8DC"/>
-              <w:bottom w:val="single" w:sz="4" w:space="0" w:color="DCE8DC"/>
-              <w:right w:val="single" w:sz="4" w:space="0" w:color="DCE8DC"/>
+              <w:top w:val="none" w:sz="0" w:space="0" w:color="auto"/>
+              <w:left w:val="none" w:sz="0" w:space="0" w:color="auto"/>
+              <w:bottom w:val="none" w:sz="0" w:space="0" w:color="auto"/>
+              <w:right w:val="none" w:sz="0" w:space="0" w:color="auto"/>
             </w:tcBorders>
-            <w:shd w:val="clear" w:color="auto" w:fill="F3F4F6"/>
+            <w:shd w:val="clear" w:color="auto" w:fill="1A2E1E"/>
             <w:tcMar>
-              <w:top w:w="200" w:type="dxa"/>
-              <w:left w:w="200" w:type="dxa"/>
-              <w:bottom w:w="200" w:type="dxa"/>
-              <w:right w:w="200" w:type="dxa"/>
+              <w:top w:w="120" w:type="dxa"/>
+              <w:left w:w="150" w:type="dxa"/>
+              <w:bottom w:w="120" w:type="dxa"/>
+              <w:right w:w="150" w:type="dxa"/>
             </w:tcMar>
+            <w:vAlign w:val="center"/>
           </w:tcPr>
           <w:p>
             <w:pPr>
               <w:keepNext/>
               <w:spacing w:before="60" w:after="60"/>
             </w:pPr>
-            <w:proofErr w:type="spellStart"/>
             <w:r>
               <w:rPr>
                 <w:b/>
                 <w:bCs/>
-                <w:color w:val="1A2E1E"/>
+                <w:color w:val="FEFEFE"/>
               </w:rPr>
               <w:t>Désignation</w:t>
             </w:r>
-            <w:proofErr w:type="spellEnd"/>
           </w:p>
         </w:tc>
         <w:tc>
           <w:tcPr>
-            <w:tcW w:w="762" w:type="dxa"/>
+            <w:tcW w:w="775" w:type="dxa"/>
             <w:tcBorders>
-              <w:top w:val="single" w:sz="4" w:space="0" w:color="DCE8DC"/>
-              <w:left w:val="single" w:sz="4" w:space="0" w:color="DCE8DC"/>
-              <w:bottom w:val="single" w:sz="4" w:space="0" w:color="DCE8DC"/>
-              <w:right w:val="single" w:sz="4" w:space="0" w:color="DCE8DC"/>
+              <w:top w:val="none" w:sz="0" w:space="0" w:color="auto"/>
+              <w:left w:val="none" w:sz="0" w:space="0" w:color="auto"/>
+              <w:bottom w:val="none" w:sz="0" w:space="0" w:color="auto"/>
+              <w:right w:val="none" w:sz="0" w:space="0" w:color="auto"/>
             </w:tcBorders>
-            <w:shd w:val="clear" w:color="auto" w:fill="F3F4F6"/>
+            <w:shd w:val="clear" w:color="auto" w:fill="1A2E1E"/>
             <w:tcMar>
-              <w:top w:w="200" w:type="dxa"/>
-              <w:left w:w="200" w:type="dxa"/>
-              <w:bottom w:w="200" w:type="dxa"/>
-              <w:right w:w="200" w:type="dxa"/>
+              <w:top w:w="120" w:type="dxa"/>
+              <w:left w:w="150" w:type="dxa"/>
+              <w:bottom w:w="120" w:type="dxa"/>
+              <w:right w:w="150" w:type="dxa"/>
             </w:tcMar>
+            <w:vAlign w:val="center"/>
           </w:tcPr>
           <w:p>
             <w:pPr>
@@ -1743,7 +1433,7 @@
               <w:rPr>
                 <w:b/>
                 <w:bCs/>
-                <w:color w:val="1A2E1E"/>
+                <w:color w:val="FEFEFE"/>
               </w:rPr>
               <w:t>Q</w:t>
             </w:r>
@@ -1751,20 +1441,21 @@
         </w:tc>
         <w:tc>
           <w:tcPr>
-            <w:tcW w:w="1428" w:type="dxa"/>
+            <w:tcW w:w="2200" w:type="dxa"/>
             <w:tcBorders>
-              <w:top w:val="single" w:sz="4" w:space="0" w:color="DCE8DC"/>
-              <w:left w:val="single" w:sz="4" w:space="0" w:color="DCE8DC"/>
-              <w:bottom w:val="single" w:sz="4" w:space="0" w:color="DCE8DC"/>
-              <w:right w:val="single" w:sz="4" w:space="0" w:color="DCE8DC"/>
+              <w:top w:val="none" w:sz="0" w:space="0" w:color="auto"/>
+              <w:left w:val="none" w:sz="0" w:space="0" w:color="auto"/>
+              <w:bottom w:val="none" w:sz="0" w:space="0" w:color="auto"/>
+              <w:right w:val="none" w:sz="0" w:space="0" w:color="auto"/>
             </w:tcBorders>
-            <w:shd w:val="clear" w:color="auto" w:fill="F3F4F6"/>
+            <w:shd w:val="clear" w:color="auto" w:fill="1A2E1E"/>
             <w:tcMar>
-              <w:top w:w="200" w:type="dxa"/>
-              <w:left w:w="200" w:type="dxa"/>
-              <w:bottom w:w="200" w:type="dxa"/>
-              <w:right w:w="200" w:type="dxa"/>
+              <w:top w:w="120" w:type="dxa"/>
+              <w:left w:w="150" w:type="dxa"/>
+              <w:bottom w:w="120" w:type="dxa"/>
+              <w:right w:w="150" w:type="dxa"/>
             </w:tcMar>
+            <w:vAlign w:val="center"/>
           </w:tcPr>
           <w:p>
             <w:pPr>
@@ -1776,7 +1467,7 @@
               <w:rPr>
                 <w:b/>
                 <w:bCs/>
-                <w:color w:val="1A2E1E"/>
+                <w:color w:val="FEFEFE"/>
               </w:rPr>
               <w:t>Prix</w:t>
             </w:r>
@@ -1795,19 +1486,20 @@
         </w:trPr>
         <w:tc>
           <w:tcPr>
-            <w:tcW w:w="667" w:type="dxa"/>
+            <w:tcW w:w="650" w:type="dxa"/>
             <w:tcBorders>
-              <w:top w:val="single" w:sz="4" w:space="0" w:color="DCE8DC"/>
-              <w:left w:val="single" w:sz="4" w:space="0" w:color="DCE8DC"/>
-              <w:bottom w:val="single" w:sz="4" w:space="0" w:color="DCE8DC"/>
-              <w:right w:val="single" w:sz="4" w:space="0" w:color="DCE8DC"/>
+              <w:top w:val="none" w:sz="0" w:space="0" w:color="auto"/>
+              <w:left w:val="none" w:sz="0" w:space="0" w:color="auto"/>
+              <w:bottom w:val="single" w:sz="4" w:space="0" w:color="E6E9E6"/>
+              <w:right w:val="none" w:sz="0" w:space="0" w:color="auto"/>
             </w:tcBorders>
             <w:tcMar>
-              <w:top w:w="200" w:type="dxa"/>
-              <w:left w:w="200" w:type="dxa"/>
-              <w:bottom w:w="200" w:type="dxa"/>
-              <w:right w:w="200" w:type="dxa"/>
+              <w:top w:w="90" w:type="dxa"/>
+              <w:left w:w="150" w:type="dxa"/>
+              <w:bottom w:w="90" w:type="dxa"/>
+              <w:right w:w="150" w:type="dxa"/>
             </w:tcMar>
+            <w:vAlign w:val="top"/>
           </w:tcPr>
           <w:p>
             <w:pPr>
@@ -1821,43 +1513,26 @@
                 <w:bCs/>
                 <w:color w:val="1A2E1E"/>
               </w:rPr>
-              <w:t>{#recap_</w:t>
-            </w:r>
-            <w:proofErr w:type="gramStart"/>
-            <w:r>
-              <w:rPr>
-                <w:b/>
-                <w:bCs/>
-                <w:color w:val="1A2E1E"/>
-              </w:rPr>
-              <w:t>lignes}{</w:t>
-            </w:r>
-            <w:proofErr w:type="gramEnd"/>
-            <w:r>
-              <w:rPr>
-                <w:b/>
-                <w:bCs/>
-                <w:color w:val="1A2E1E"/>
-              </w:rPr>
-              <w:t>numero}</w:t>
+              <w:t>{#recap_lignes}{numero}</w:t>
             </w:r>
           </w:p>
         </w:tc>
         <w:tc>
           <w:tcPr>
-            <w:tcW w:w="6668" w:type="dxa"/>
+            <w:tcW w:w="5900" w:type="dxa"/>
             <w:tcBorders>
-              <w:top w:val="single" w:sz="4" w:space="0" w:color="DCE8DC"/>
-              <w:left w:val="single" w:sz="4" w:space="0" w:color="DCE8DC"/>
-              <w:bottom w:val="single" w:sz="4" w:space="0" w:color="DCE8DC"/>
-              <w:right w:val="single" w:sz="4" w:space="0" w:color="DCE8DC"/>
+              <w:top w:val="none" w:sz="0" w:space="0" w:color="auto"/>
+              <w:left w:val="none" w:sz="0" w:space="0" w:color="auto"/>
+              <w:bottom w:val="single" w:sz="4" w:space="0" w:color="E6E9E6"/>
+              <w:right w:val="none" w:sz="0" w:space="0" w:color="auto"/>
             </w:tcBorders>
             <w:tcMar>
-              <w:top w:w="200" w:type="dxa"/>
-              <w:left w:w="200" w:type="dxa"/>
-              <w:bottom w:w="200" w:type="dxa"/>
-              <w:right w:w="200" w:type="dxa"/>
+              <w:top w:w="90" w:type="dxa"/>
+              <w:left w:w="150" w:type="dxa"/>
+              <w:bottom w:w="90" w:type="dxa"/>
+              <w:right w:w="150" w:type="dxa"/>
             </w:tcMar>
+            <w:vAlign w:val="top"/>
           </w:tcPr>
           <w:p>
             <w:pPr>
@@ -1865,25 +1540,29 @@
               <w:spacing w:before="60" w:after="60"/>
             </w:pPr>
             <w:r>
+              <w:rPr>
+                <w:color w:val="2B2B2B"/>
+              </w:rPr>
               <w:t>{designation}</w:t>
             </w:r>
           </w:p>
         </w:tc>
         <w:tc>
           <w:tcPr>
-            <w:tcW w:w="762" w:type="dxa"/>
+            <w:tcW w:w="775" w:type="dxa"/>
             <w:tcBorders>
-              <w:top w:val="single" w:sz="4" w:space="0" w:color="DCE8DC"/>
-              <w:left w:val="single" w:sz="4" w:space="0" w:color="DCE8DC"/>
-              <w:bottom w:val="single" w:sz="4" w:space="0" w:color="DCE8DC"/>
-              <w:right w:val="single" w:sz="4" w:space="0" w:color="DCE8DC"/>
+              <w:top w:val="none" w:sz="0" w:space="0" w:color="auto"/>
+              <w:left w:val="none" w:sz="0" w:space="0" w:color="auto"/>
+              <w:bottom w:val="single" w:sz="4" w:space="0" w:color="E6E9E6"/>
+              <w:right w:val="none" w:sz="0" w:space="0" w:color="auto"/>
             </w:tcBorders>
             <w:tcMar>
-              <w:top w:w="200" w:type="dxa"/>
-              <w:left w:w="200" w:type="dxa"/>
-              <w:bottom w:w="200" w:type="dxa"/>
-              <w:right w:w="200" w:type="dxa"/>
+              <w:top w:w="90" w:type="dxa"/>
+              <w:left w:w="150" w:type="dxa"/>
+              <w:bottom w:w="90" w:type="dxa"/>
+              <w:right w:w="150" w:type="dxa"/>
             </w:tcMar>
+            <w:vAlign w:val="top"/>
           </w:tcPr>
           <w:p>
             <w:pPr>
@@ -1892,33 +1571,29 @@
               <w:jc w:val="center"/>
             </w:pPr>
             <w:r>
-              <w:t>{</w:t>
-            </w:r>
-            <w:proofErr w:type="spellStart"/>
-            <w:r>
-              <w:t>quantite</w:t>
-            </w:r>
-            <w:proofErr w:type="spellEnd"/>
-            <w:r>
-              <w:t>}</w:t>
+              <w:rPr>
+                <w:color w:val="2B2B2B"/>
+              </w:rPr>
+              <w:t>{quantite}</w:t>
             </w:r>
           </w:p>
         </w:tc>
         <w:tc>
           <w:tcPr>
-            <w:tcW w:w="1428" w:type="dxa"/>
+            <w:tcW w:w="2200" w:type="dxa"/>
             <w:tcBorders>
-              <w:top w:val="single" w:sz="4" w:space="0" w:color="DCE8DC"/>
-              <w:left w:val="single" w:sz="4" w:space="0" w:color="DCE8DC"/>
-              <w:bottom w:val="single" w:sz="4" w:space="0" w:color="DCE8DC"/>
-              <w:right w:val="single" w:sz="4" w:space="0" w:color="DCE8DC"/>
+              <w:top w:val="none" w:sz="0" w:space="0" w:color="auto"/>
+              <w:left w:val="none" w:sz="0" w:space="0" w:color="auto"/>
+              <w:bottom w:val="single" w:sz="4" w:space="0" w:color="E6E9E6"/>
+              <w:right w:val="none" w:sz="0" w:space="0" w:color="auto"/>
             </w:tcBorders>
             <w:tcMar>
-              <w:top w:w="200" w:type="dxa"/>
-              <w:left w:w="200" w:type="dxa"/>
-              <w:bottom w:w="200" w:type="dxa"/>
-              <w:right w:w="200" w:type="dxa"/>
+              <w:top w:w="90" w:type="dxa"/>
+              <w:left w:w="150" w:type="dxa"/>
+              <w:bottom w:w="90" w:type="dxa"/>
+              <w:right w:w="150" w:type="dxa"/>
             </w:tcMar>
+            <w:vAlign w:val="top"/>
           </w:tcPr>
           <w:p>
             <w:pPr>
@@ -1927,31 +1602,10 @@
               <w:jc w:val="right"/>
             </w:pPr>
             <w:r>
-              <w:t>{</w:t>
-            </w:r>
-            <w:proofErr w:type="spellStart"/>
-            <w:r>
-              <w:t>prix_</w:t>
-            </w:r>
-            <w:proofErr w:type="gramStart"/>
-            <w:r>
-              <w:t>formate</w:t>
-            </w:r>
-            <w:proofErr w:type="spellEnd"/>
-            <w:r>
-              <w:t>}{</w:t>
-            </w:r>
-            <w:proofErr w:type="gramEnd"/>
-            <w:r>
-              <w:t>/</w:t>
-            </w:r>
-            <w:proofErr w:type="spellStart"/>
-            <w:r>
-              <w:t>recap_lignes</w:t>
-            </w:r>
-            <w:proofErr w:type="spellEnd"/>
-            <w:r>
-              <w:t>}</w:t>
+              <w:rPr>
+                <w:color w:val="2B2B2B"/>
+              </w:rPr>
+              <w:t>{prix_formate}{/recap_lignes}</w:t>
             </w:r>
           </w:p>
         </w:tc>
@@ -1971,18 +1625,18 @@
             <w:tcW w:w="8097" w:type="dxa"/>
             <w:gridSpan w:val="3"/>
             <w:tcBorders>
-              <w:top w:val="single" w:sz="4" w:space="0" w:color="DCE8DC"/>
-              <w:left w:val="single" w:sz="4" w:space="0" w:color="DCE8DC"/>
-              <w:bottom w:val="single" w:sz="4" w:space="0" w:color="DCE8DC"/>
-              <w:right w:val="single" w:sz="4" w:space="0" w:color="DCE8DC"/>
+              <w:top w:val="single" w:sz="12" w:space="0" w:color="1A2E1E"/>
+              <w:left w:val="none" w:sz="0" w:space="0" w:color="auto"/>
+              <w:bottom w:val="none" w:sz="0" w:space="0" w:color="auto"/>
+              <w:right w:val="none" w:sz="0" w:space="0" w:color="auto"/>
             </w:tcBorders>
-            <w:shd w:val="clear" w:color="auto" w:fill="F3F4F6"/>
             <w:tcMar>
-              <w:top w:w="80" w:type="dxa"/>
-              <w:left w:w="170" w:type="dxa"/>
-              <w:bottom w:w="80" w:type="dxa"/>
-              <w:right w:w="170" w:type="dxa"/>
+              <w:top w:w="120" w:type="dxa"/>
+              <w:left w:w="150" w:type="dxa"/>
+              <w:bottom w:w="120" w:type="dxa"/>
+              <w:right w:w="150" w:type="dxa"/>
             </w:tcMar>
+            <w:vAlign w:val="center"/>
           </w:tcPr>
           <w:p>
             <w:pPr>
@@ -1994,7 +1648,7 @@
               <w:rPr>
                 <w:b/>
                 <w:bCs/>
-                <w:color w:val="1A2E1E"/>
+                <w:color w:val="2B2B2B"/>
               </w:rPr>
               <w:t>Total hors taxes</w:t>
             </w:r>
@@ -2004,18 +1658,18 @@
           <w:tcPr>
             <w:tcW w:w="1428" w:type="dxa"/>
             <w:tcBorders>
-              <w:top w:val="single" w:sz="4" w:space="0" w:color="DCE8DC"/>
-              <w:left w:val="single" w:sz="4" w:space="0" w:color="DCE8DC"/>
-              <w:bottom w:val="single" w:sz="4" w:space="0" w:color="DCE8DC"/>
-              <w:right w:val="single" w:sz="4" w:space="0" w:color="DCE8DC"/>
+              <w:top w:val="single" w:sz="12" w:space="0" w:color="1A2E1E"/>
+              <w:left w:val="none" w:sz="0" w:space="0" w:color="auto"/>
+              <w:bottom w:val="none" w:sz="0" w:space="0" w:color="auto"/>
+              <w:right w:val="none" w:sz="0" w:space="0" w:color="auto"/>
             </w:tcBorders>
-            <w:shd w:val="clear" w:color="auto" w:fill="F3F4F6"/>
             <w:tcMar>
-              <w:top w:w="200" w:type="dxa"/>
-              <w:left w:w="200" w:type="dxa"/>
-              <w:bottom w:w="200" w:type="dxa"/>
-              <w:right w:w="200" w:type="dxa"/>
+              <w:top w:w="120" w:type="dxa"/>
+              <w:left w:w="150" w:type="dxa"/>
+              <w:bottom w:w="120" w:type="dxa"/>
+              <w:right w:w="150" w:type="dxa"/>
             </w:tcMar>
+            <w:vAlign w:val="center"/>
           </w:tcPr>
           <w:p>
             <w:pPr>
@@ -2029,25 +1683,7 @@
                 <w:bCs/>
                 <w:color w:val="1A2E1E"/>
               </w:rPr>
-              <w:t>{</w:t>
-            </w:r>
-            <w:proofErr w:type="spellStart"/>
-            <w:r>
-              <w:rPr>
-                <w:b/>
-                <w:bCs/>
-                <w:color w:val="1A2E1E"/>
-              </w:rPr>
-              <w:t>total_ht_formate</w:t>
-            </w:r>
-            <w:proofErr w:type="spellEnd"/>
-            <w:r>
-              <w:rPr>
-                <w:b/>
-                <w:bCs/>
-                <w:color w:val="1A2E1E"/>
-              </w:rPr>
-              <w:t>}</w:t>
+              <w:t>{total_ht_formate}</w:t>
             </w:r>
           </w:p>
         </w:tc>
@@ -2067,18 +1703,18 @@
             <w:tcW w:w="8097" w:type="dxa"/>
             <w:gridSpan w:val="3"/>
             <w:tcBorders>
-              <w:top w:val="single" w:sz="4" w:space="0" w:color="DCE8DC"/>
-              <w:left w:val="single" w:sz="4" w:space="0" w:color="DCE8DC"/>
-              <w:bottom w:val="single" w:sz="4" w:space="0" w:color="DCE8DC"/>
-              <w:right w:val="single" w:sz="4" w:space="0" w:color="DCE8DC"/>
+              <w:top w:val="none" w:sz="0" w:space="0" w:color="auto"/>
+              <w:left w:val="none" w:sz="0" w:space="0" w:color="auto"/>
+              <w:bottom w:val="none" w:sz="0" w:space="0" w:color="auto"/>
+              <w:right w:val="none" w:sz="0" w:space="0" w:color="auto"/>
             </w:tcBorders>
-            <w:shd w:val="clear" w:color="auto" w:fill="F3F4F6"/>
             <w:tcMar>
-              <w:top w:w="80" w:type="dxa"/>
-              <w:left w:w="170" w:type="dxa"/>
-              <w:bottom w:w="80" w:type="dxa"/>
-              <w:right w:w="170" w:type="dxa"/>
+              <w:top w:w="100" w:type="dxa"/>
+              <w:left w:w="150" w:type="dxa"/>
+              <w:bottom w:w="100" w:type="dxa"/>
+              <w:right w:w="150" w:type="dxa"/>
             </w:tcMar>
+            <w:vAlign w:val="center"/>
           </w:tcPr>
           <w:p>
             <w:pPr>
@@ -2088,23 +1724,9 @@
             </w:pPr>
             <w:r>
               <w:rPr>
-                <w:color w:val="1A2E1E"/>
-              </w:rPr>
-              <w:t>TVA {</w:t>
-            </w:r>
-            <w:proofErr w:type="spellStart"/>
-            <w:r>
-              <w:rPr>
-                <w:color w:val="1A2E1E"/>
-              </w:rPr>
-              <w:t>tva_pct</w:t>
-            </w:r>
-            <w:proofErr w:type="spellEnd"/>
-            <w:r>
-              <w:rPr>
-                <w:color w:val="1A2E1E"/>
-              </w:rPr>
-              <w:t>} %</w:t>
+                <w:color w:val="2B2B2B"/>
+              </w:rPr>
+              <w:t>TVA {tva_pct} %</w:t>
             </w:r>
           </w:p>
         </w:tc>
@@ -2112,18 +1734,18 @@
           <w:tcPr>
             <w:tcW w:w="1428" w:type="dxa"/>
             <w:tcBorders>
-              <w:top w:val="single" w:sz="4" w:space="0" w:color="DCE8DC"/>
-              <w:left w:val="single" w:sz="4" w:space="0" w:color="DCE8DC"/>
-              <w:bottom w:val="single" w:sz="4" w:space="0" w:color="DCE8DC"/>
-              <w:right w:val="single" w:sz="4" w:space="0" w:color="DCE8DC"/>
+              <w:top w:val="none" w:sz="0" w:space="0" w:color="auto"/>
+              <w:left w:val="none" w:sz="0" w:space="0" w:color="auto"/>
+              <w:bottom w:val="none" w:sz="0" w:space="0" w:color="auto"/>
+              <w:right w:val="none" w:sz="0" w:space="0" w:color="auto"/>
             </w:tcBorders>
-            <w:shd w:val="clear" w:color="auto" w:fill="F3F4F6"/>
             <w:tcMar>
-              <w:top w:w="200" w:type="dxa"/>
-              <w:left w:w="200" w:type="dxa"/>
-              <w:bottom w:w="200" w:type="dxa"/>
-              <w:right w:w="200" w:type="dxa"/>
+              <w:top w:w="100" w:type="dxa"/>
+              <w:left w:w="150" w:type="dxa"/>
+              <w:bottom w:w="100" w:type="dxa"/>
+              <w:right w:w="150" w:type="dxa"/>
             </w:tcMar>
+            <w:vAlign w:val="center"/>
           </w:tcPr>
           <w:p>
             <w:pPr>
@@ -2135,27 +1757,9 @@
               <w:rPr>
                 <w:b/>
                 <w:bCs/>
-                <w:color w:val="1A2E1E"/>
-              </w:rPr>
-              <w:t>{</w:t>
-            </w:r>
-            <w:proofErr w:type="spellStart"/>
-            <w:r>
-              <w:rPr>
-                <w:b/>
-                <w:bCs/>
-                <w:color w:val="1A2E1E"/>
-              </w:rPr>
-              <w:t>tva_formate</w:t>
-            </w:r>
-            <w:proofErr w:type="spellEnd"/>
-            <w:r>
-              <w:rPr>
-                <w:b/>
-                <w:bCs/>
-                <w:color w:val="1A2E1E"/>
-              </w:rPr>
-              <w:t>}</w:t>
+                <w:color w:val="2B2B2B"/>
+              </w:rPr>
+              <w:t>{tva_formate}</w:t>
             </w:r>
           </w:p>
         </w:tc>
@@ -2175,18 +1779,19 @@
             <w:tcW w:w="8097" w:type="dxa"/>
             <w:gridSpan w:val="3"/>
             <w:tcBorders>
-              <w:top w:val="single" w:sz="4" w:space="0" w:color="C9A96E"/>
-              <w:left w:val="single" w:sz="4" w:space="0" w:color="C9A96E"/>
-              <w:bottom w:val="single" w:sz="4" w:space="0" w:color="C9A96E"/>
-              <w:right w:val="single" w:sz="4" w:space="0" w:color="C9A96E"/>
+              <w:top w:val="none" w:sz="0" w:space="0" w:color="auto"/>
+              <w:left w:val="none" w:sz="0" w:space="0" w:color="auto"/>
+              <w:bottom w:val="none" w:sz="0" w:space="0" w:color="auto"/>
+              <w:right w:val="none" w:sz="0" w:space="0" w:color="auto"/>
             </w:tcBorders>
             <w:shd w:val="clear" w:color="auto" w:fill="C9A96E"/>
             <w:tcMar>
-              <w:top w:w="80" w:type="dxa"/>
-              <w:left w:w="170" w:type="dxa"/>
-              <w:bottom w:w="80" w:type="dxa"/>
-              <w:right w:w="170" w:type="dxa"/>
+              <w:top w:w="130" w:type="dxa"/>
+              <w:left w:w="150" w:type="dxa"/>
+              <w:bottom w:w="130" w:type="dxa"/>
+              <w:right w:w="150" w:type="dxa"/>
             </w:tcMar>
+            <w:vAlign w:val="center"/>
           </w:tcPr>
           <w:p>
             <w:pPr>
@@ -2196,7 +1801,7 @@
               <w:rPr>
                 <w:b/>
                 <w:bCs/>
-                <w:color w:val="FFFFFF"/>
+                <w:color w:val="FEFEFE"/>
               </w:rPr>
               <w:t>Total TTC</w:t>
             </w:r>
@@ -2206,18 +1811,19 @@
           <w:tcPr>
             <w:tcW w:w="1428" w:type="dxa"/>
             <w:tcBorders>
-              <w:top w:val="single" w:sz="4" w:space="0" w:color="DCE8DC"/>
-              <w:left w:val="single" w:sz="4" w:space="0" w:color="DCE8DC"/>
-              <w:bottom w:val="single" w:sz="4" w:space="0" w:color="DCE8DC"/>
-              <w:right w:val="single" w:sz="4" w:space="0" w:color="DCE8DC"/>
+              <w:top w:val="none" w:sz="0" w:space="0" w:color="auto"/>
+              <w:left w:val="none" w:sz="0" w:space="0" w:color="auto"/>
+              <w:bottom w:val="none" w:sz="0" w:space="0" w:color="auto"/>
+              <w:right w:val="none" w:sz="0" w:space="0" w:color="auto"/>
             </w:tcBorders>
             <w:shd w:val="clear" w:color="auto" w:fill="C9A96E"/>
             <w:tcMar>
-              <w:top w:w="200" w:type="dxa"/>
-              <w:left w:w="200" w:type="dxa"/>
-              <w:bottom w:w="200" w:type="dxa"/>
-              <w:right w:w="200" w:type="dxa"/>
+              <w:top w:w="130" w:type="dxa"/>
+              <w:left w:w="150" w:type="dxa"/>
+              <w:bottom w:w="130" w:type="dxa"/>
+              <w:right w:w="150" w:type="dxa"/>
             </w:tcMar>
+            <w:vAlign w:val="center"/>
           </w:tcPr>
           <w:p>
             <w:pPr>
@@ -2228,27 +1834,9 @@
               <w:rPr>
                 <w:b/>
                 <w:bCs/>
-                <w:color w:val="FFFFFF"/>
-              </w:rPr>
-              <w:t>{</w:t>
-            </w:r>
-            <w:proofErr w:type="spellStart"/>
-            <w:r>
-              <w:rPr>
-                <w:b/>
-                <w:bCs/>
-                <w:color w:val="FFFFFF"/>
-              </w:rPr>
-              <w:t>total_ttc_formate</w:t>
-            </w:r>
-            <w:proofErr w:type="spellEnd"/>
-            <w:r>
-              <w:rPr>
-                <w:b/>
-                <w:bCs/>
-                <w:color w:val="FFFFFF"/>
-              </w:rPr>
-              <w:t>}</w:t>
+                <w:color w:val="FEFEFE"/>
+              </w:rPr>
+              <w:t>{total_ttc_formate}</w:t>
             </w:r>
           </w:p>
         </w:tc>
@@ -2315,15 +1903,7 @@
               <w:pStyle w:val="CalloutBTH"/>
             </w:pPr>
             <w:r>
-              <w:t>{</w:t>
-            </w:r>
-            <w:proofErr w:type="spellStart"/>
-            <w:r>
-              <w:t>modalites_paiement</w:t>
-            </w:r>
-            <w:proofErr w:type="spellEnd"/>
-            <w:r>
-              <w:t>}</w:t>
+              <w:t>{modalites_paiement}</w:t>
             </w:r>
           </w:p>
         </w:tc>
@@ -2361,7 +1941,6 @@
           <w:lang w:val="fr-CA"/>
         </w:rPr>
       </w:pPr>
-      <w:proofErr w:type="gramStart"/>
       <w:r>
         <w:rPr>
           <w:color w:val="C9A96E"/>
@@ -2375,7 +1954,6 @@
         </w:rPr>
         <w:t>Inclusions</w:t>
       </w:r>
-      <w:proofErr w:type="gramEnd"/>
     </w:p>
     <w:p>
       <w:pPr>
@@ -2420,15 +1998,7 @@
         <w:spacing w:line="240" w:lineRule="auto"/>
       </w:pPr>
       <w:r>
-        <w:t>{/</w:t>
-      </w:r>
-      <w:proofErr w:type="spellStart"/>
-      <w:r>
-        <w:t>inclusions_items</w:t>
-      </w:r>
-      <w:proofErr w:type="spellEnd"/>
-      <w:r>
-        <w:t>}</w:t>
+        <w:t>{/inclusions_items}</w:t>
       </w:r>
     </w:p>
     <w:p>
@@ -2445,7 +2015,6 @@
         <w:pStyle w:val="Titre2BTH"/>
         <w:widowControl w:val="0"/>
       </w:pPr>
-      <w:proofErr w:type="gramStart"/>
       <w:r>
         <w:rPr>
           <w:color w:val="C9A96E"/>
@@ -2453,17 +2022,8 @@
         <w:t xml:space="preserve">5.2  </w:t>
       </w:r>
       <w:r>
-        <w:t>Exclusions</w:t>
-      </w:r>
-      <w:proofErr w:type="gramEnd"/>
-      <w:r>
-        <w:t xml:space="preserve"> du </w:t>
-      </w:r>
-      <w:proofErr w:type="spellStart"/>
-      <w:r>
-        <w:t>mandat</w:t>
-      </w:r>
-      <w:proofErr w:type="spellEnd"/>
+        <w:t>Exclusions du mandat</w:t>
+      </w:r>
     </w:p>
     <w:p>
       <w:pPr>
@@ -2508,15 +2068,7 @@
         <w:spacing w:line="240" w:lineRule="auto"/>
       </w:pPr>
       <w:r>
-        <w:t>{/</w:t>
-      </w:r>
-      <w:proofErr w:type="spellStart"/>
-      <w:r>
-        <w:t>exclusions_items</w:t>
-      </w:r>
-      <w:proofErr w:type="spellEnd"/>
-      <w:r>
-        <w:t>}</w:t>
+        <w:t>{/exclusions_items}</w:t>
       </w:r>
     </w:p>
     <w:p>
@@ -2540,13 +2092,8 @@
       </w:pPr>
       <w:r>
         <w:lastRenderedPageBreak/>
-        <w:t xml:space="preserve">6.  Conditions </w:t>
-      </w:r>
-      <w:proofErr w:type="spellStart"/>
-      <w:r>
-        <w:t>générales</w:t>
-      </w:r>
-      <w:proofErr w:type="spellEnd"/>
+        <w:t>6.  Conditions générales</w:t>
+      </w:r>
     </w:p>
     <w:p>
       <w:pPr>
@@ -2573,43 +2120,7 @@
           <w:szCs w:val="19"/>
           <w:lang w:val="fr-CA"/>
         </w:rPr>
-        <w:t xml:space="preserve"> — La présente offre est valide pour une période de {</w:t>
-      </w:r>
-      <w:proofErr w:type="spellStart"/>
-      <w:r>
-        <w:rPr>
-          <w:sz w:val="19"/>
-          <w:szCs w:val="19"/>
-          <w:lang w:val="fr-CA"/>
-        </w:rPr>
-        <w:t>validite_jours_lettres</w:t>
-      </w:r>
-      <w:proofErr w:type="spellEnd"/>
-      <w:r>
-        <w:rPr>
-          <w:sz w:val="19"/>
-          <w:szCs w:val="19"/>
-          <w:lang w:val="fr-CA"/>
-        </w:rPr>
-        <w:t>} ({</w:t>
-      </w:r>
-      <w:proofErr w:type="spellStart"/>
-      <w:r>
-        <w:rPr>
-          <w:sz w:val="19"/>
-          <w:szCs w:val="19"/>
-          <w:lang w:val="fr-CA"/>
-        </w:rPr>
-        <w:t>validite_jours</w:t>
-      </w:r>
-      <w:proofErr w:type="spellEnd"/>
-      <w:r>
-        <w:rPr>
-          <w:sz w:val="19"/>
-          <w:szCs w:val="19"/>
-          <w:lang w:val="fr-CA"/>
-        </w:rPr>
-        <w:t>}) jours à compter de sa date d'émission.</w:t>
+        <w:t xml:space="preserve"> — La présente offre est valide pour une période de {validite_jours_lettres} ({validite_jours}) jours à compter de sa date d'émission.</w:t>
       </w:r>
     </w:p>
     <w:p>
@@ -2792,21 +2303,7 @@
         <w:rPr>
           <w:lang w:val="fr-CA"/>
         </w:rPr>
-        <w:t>Espérant le tout selon vos attentes, nous vous prions d'agréer, {</w:t>
-      </w:r>
-      <w:proofErr w:type="spellStart"/>
-      <w:r>
-        <w:rPr>
-          <w:lang w:val="fr-CA"/>
-        </w:rPr>
-        <w:t>salutation_fin</w:t>
-      </w:r>
-      <w:proofErr w:type="spellEnd"/>
-      <w:r>
-        <w:rPr>
-          <w:lang w:val="fr-CA"/>
-        </w:rPr>
-        <w:t>}, l'expression de nos meilleurs sentiments.</w:t>
+        <w:t>Espérant le tout selon vos attentes, nous vous prions d'agréer, {salutation_fin}, l'expression de nos meilleurs sentiments.</w:t>
       </w:r>
     </w:p>
     <w:p>
@@ -2826,7 +2323,8 @@
     </w:p>
     <w:tbl>
       <w:tblPr>
-        <w:tblW w:w="9525" w:type="dxa"/>
+        <w:tblW w:w="5400" w:type="dxa"/>
+        <w:jc w:val="left"/>
         <w:tblBorders>
           <w:top w:val="single" w:sz="4" w:space="0" w:color="auto"/>
           <w:left w:val="single" w:sz="4" w:space="0" w:color="auto"/>
@@ -2842,8 +2340,8 @@
         <w:tblLook w:val="04A0" w:firstRow="1" w:lastRow="0" w:firstColumn="1" w:lastColumn="0" w:noHBand="0" w:noVBand="1"/>
       </w:tblPr>
       <w:tblGrid>
-        <w:gridCol w:w="4762"/>
-        <w:gridCol w:w="4763"/>
+        <w:gridCol w:w="2700"/>
+        <w:gridCol w:w="2700"/>
       </w:tblGrid>
       <w:tr>
         <w:tblPrEx>
@@ -2854,7 +2352,7 @@
         </w:tblPrEx>
         <w:tc>
           <w:tcPr>
-            <w:tcW w:w="4535" w:type="dxa"/>
+            <w:tcW w:w="2700" w:type="dxa"/>
             <w:tcBorders>
               <w:top w:val="none" w:sz="0" w:space="0" w:color="FFFFFF"/>
               <w:left w:val="none" w:sz="0" w:space="0" w:color="FFFFFF"/>
@@ -2942,27 +2440,7 @@
                 <w:color w:val="1A2E1E"/>
                 <w:lang w:val="fr-CA"/>
               </w:rPr>
-              <w:t>{</w:t>
-            </w:r>
-            <w:proofErr w:type="gramStart"/>
-            <w:r>
-              <w:rPr>
-                <w:b/>
-                <w:bCs/>
-                <w:color w:val="1A2E1E"/>
-                <w:lang w:val="fr-CA"/>
-              </w:rPr>
-              <w:t>signataire</w:t>
-            </w:r>
-            <w:proofErr w:type="gramEnd"/>
-            <w:r>
-              <w:rPr>
-                <w:b/>
-                <w:bCs/>
-                <w:color w:val="1A2E1E"/>
-                <w:lang w:val="fr-CA"/>
-              </w:rPr>
-              <w:t>_1_nom}</w:t>
+              <w:t>{signataire_1_nom}</w:t>
             </w:r>
           </w:p>
           <w:p>
@@ -2982,7 +2460,7 @@
         </w:tc>
         <w:tc>
           <w:tcPr>
-            <w:tcW w:w="4536" w:type="dxa"/>
+            <w:tcW w:w="2700" w:type="dxa"/>
             <w:tcBorders>
               <w:top w:val="none" w:sz="0" w:space="0" w:color="FFFFFF"/>
               <w:left w:val="none" w:sz="0" w:space="0" w:color="FFFFFF"/>
@@ -3076,27 +2554,7 @@
                 <w:color w:val="1A2E1E"/>
                 <w:lang w:val="fr-CA"/>
               </w:rPr>
-              <w:t>{</w:t>
-            </w:r>
-            <w:proofErr w:type="gramStart"/>
-            <w:r>
-              <w:rPr>
-                <w:b/>
-                <w:bCs/>
-                <w:color w:val="1A2E1E"/>
-                <w:lang w:val="fr-CA"/>
-              </w:rPr>
-              <w:t>signataire</w:t>
-            </w:r>
-            <w:proofErr w:type="gramEnd"/>
-            <w:r>
-              <w:rPr>
-                <w:b/>
-                <w:bCs/>
-                <w:color w:val="1A2E1E"/>
-                <w:lang w:val="fr-CA"/>
-              </w:rPr>
-              <w:t>_2_nom}</w:t>
+              <w:t>{signataire_2_nom}</w:t>
             </w:r>
           </w:p>
           <w:p>

</xml_diff>

<commit_message>
style(fix): fix template style
</commit_message>
<xml_diff>
--- a/templates/template-standard-v2.docx
+++ b/templates/template-standard-v2.docx
@@ -4,7 +4,7 @@
   <w:body>
     <w:p>
       <w:pPr>
-        <w:spacing w:before="3600" w:after="0" w:line="240" w:lineRule="auto"/>
+        <w:spacing w:before="3000" w:after="0" w:line="240" w:lineRule="auto"/>
       </w:pPr>
       <w:r>
         <w:rPr>
@@ -47,7 +47,7 @@
     </w:p>
     <w:p>
       <w:pPr>
-        <w:spacing w:before="3200" w:after="0" w:line="240" w:lineRule="auto"/>
+        <w:spacing w:before="1800" w:after="0" w:line="240" w:lineRule="auto"/>
       </w:pPr>
       <w:r>
         <w:rPr>
@@ -56,18 +56,45 @@
           <w:sz w:val="16"/>
           <w:spacing w:val="80"/>
         </w:rPr>
-        <w:t>Préparée pour</w:t>
-      </w:r>
-    </w:p>
-    <w:p>
-      <w:pPr>
-        <w:spacing w:before="100" w:after="0" w:line="280" w:lineRule="auto"/>
+        <w:t>Objet</w:t>
+      </w:r>
+    </w:p>
+    <w:p>
+      <w:pPr>
+        <w:spacing w:before="100" w:after="0" w:line="320" w:lineRule="auto"/>
       </w:pPr>
       <w:r>
         <w:rPr>
           <w:b/>
           <w:color w:val="1A2E1E"/>
-          <w:sz w:val="34"/>
+          <w:sz w:val="28"/>
+        </w:rPr>
+        <w:t>{objet_ligne1}</w:t>
+      </w:r>
+    </w:p>
+    <w:p>
+      <w:pPr>
+        <w:spacing w:before="1200" w:after="0" w:line="240" w:lineRule="auto"/>
+      </w:pPr>
+      <w:r>
+        <w:rPr>
+          <w:caps/>
+          <w:color w:val="C9A96E"/>
+          <w:sz w:val="16"/>
+          <w:spacing w:val="80"/>
+        </w:rPr>
+        <w:t>Préparée pour</w:t>
+      </w:r>
+    </w:p>
+    <w:p>
+      <w:pPr>
+        <w:spacing w:before="80" w:after="0" w:line="280" w:lineRule="auto"/>
+      </w:pPr>
+      <w:r>
+        <w:rPr>
+          <w:b/>
+          <w:color w:val="1A2E1E"/>
+          <w:sz w:val="28"/>
         </w:rPr>
         <w:t>{nom_client}</w:t>
       </w:r>
@@ -86,9 +113,26 @@
     </w:p>
     <w:p>
       <w:pPr>
-        <w:pageBreakBefore/>
-        <w:spacing w:before="0" w:after="0" w:line="240" w:lineRule="auto"/>
-      </w:pPr>
+        <w:spacing w:before="1600" w:after="0" w:line="240" w:lineRule="auto"/>
+        <w:pBdr>
+          <w:top w:val="single" w:sz="4" w:space="6" w:color="C9A96E"/>
+        </w:pBdr>
+        <w:sectPr>
+          <w:headerReference w:type="default" r:id="rId11"/>
+          <w:footerReference w:type="default" r:id="rId12"/>
+          <w:pgSz w:w="11906" w:h="16838"/>
+          <w:pgMar w:top="1928" w:right="1134" w:bottom="1134" w:left="1247" w:header="454" w:footer="680" w:gutter="0"/>
+          <w:pgNumType w:start="0"/>
+          <w:cols w:space="720"/>
+        </w:sectPr>
+      </w:pPr>
+      <w:r>
+        <w:rPr>
+          <w:color w:val="887F74"/>
+          <w:sz w:val="18"/>
+        </w:rPr>
+        <w:t xml:space="preserve">Réf. {numero_offre}  ·  {date_offre}</w:t>
+      </w:r>
     </w:p>
     <w:tbl>
       <w:tblPr>
@@ -1025,7 +1069,7 @@
                 <w:bCs/>
                 <w:color w:val="FEFEFE"/>
               </w:rPr>
-              <w:t>Q</w:t>
+              <w:t>Qté</w:t>
             </w:r>
           </w:p>
         </w:tc>
@@ -1058,7 +1102,7 @@
                 <w:bCs/>
                 <w:color w:val="FEFEFE"/>
               </w:rPr>
-              <w:t>Prix</w:t>
+              <w:t>Prix HT</w:t>
             </w:r>
           </w:p>
         </w:tc>
@@ -1079,13 +1123,13 @@
             <w:tcBorders>
               <w:top w:val="none" w:sz="0" w:space="0" w:color="auto"/>
               <w:left w:val="none" w:sz="0" w:space="0" w:color="auto"/>
-              <w:bottom w:val="single" w:sz="4" w:space="0" w:color="E6E9E6"/>
+              <w:bottom w:val="none" w:sz="0" w:space="0" w:color="auto"/>
               <w:right w:val="none" w:sz="0" w:space="0" w:color="auto"/>
             </w:tcBorders>
             <w:tcMar>
-              <w:top w:w="90" w:type="dxa"/>
+              <w:top w:w="120" w:type="dxa"/>
               <w:left w:w="150" w:type="dxa"/>
-              <w:bottom w:w="90" w:type="dxa"/>
+              <w:bottom w:w="120" w:type="dxa"/>
               <w:right w:w="150" w:type="dxa"/>
             </w:tcMar>
             <w:vAlign w:val="top"/>
@@ -1101,7 +1145,7 @@
                 <w:bCs/>
                 <w:color w:val="1A2E1E"/>
               </w:rPr>
-              <w:t>{#lignes}{numero}</w:t>
+              <w:t>{#lignes}{^pair}{numero}</w:t>
             </w:r>
           </w:p>
         </w:tc>
@@ -1111,13 +1155,13 @@
             <w:tcBorders>
               <w:top w:val="none" w:sz="0" w:space="0" w:color="auto"/>
               <w:left w:val="none" w:sz="0" w:space="0" w:color="auto"/>
-              <w:bottom w:val="single" w:sz="4" w:space="0" w:color="E6E9E6"/>
+              <w:bottom w:val="none" w:sz="0" w:space="0" w:color="auto"/>
               <w:right w:val="none" w:sz="0" w:space="0" w:color="auto"/>
             </w:tcBorders>
             <w:tcMar>
-              <w:top w:w="90" w:type="dxa"/>
+              <w:top w:w="120" w:type="dxa"/>
               <w:left w:w="150" w:type="dxa"/>
-              <w:bottom w:w="90" w:type="dxa"/>
+              <w:bottom w:w="120" w:type="dxa"/>
               <w:right w:w="150" w:type="dxa"/>
             </w:tcMar>
             <w:vAlign w:val="top"/>
@@ -1140,13 +1184,13 @@
             <w:tcBorders>
               <w:top w:val="none" w:sz="0" w:space="0" w:color="auto"/>
               <w:left w:val="none" w:sz="0" w:space="0" w:color="auto"/>
-              <w:bottom w:val="single" w:sz="4" w:space="0" w:color="E6E9E6"/>
+              <w:bottom w:val="none" w:sz="0" w:space="0" w:color="auto"/>
               <w:right w:val="none" w:sz="0" w:space="0" w:color="auto"/>
             </w:tcBorders>
             <w:tcMar>
-              <w:top w:w="90" w:type="dxa"/>
+              <w:top w:w="120" w:type="dxa"/>
               <w:left w:w="150" w:type="dxa"/>
-              <w:bottom w:w="90" w:type="dxa"/>
+              <w:bottom w:w="120" w:type="dxa"/>
               <w:right w:w="150" w:type="dxa"/>
             </w:tcMar>
             <w:vAlign w:val="top"/>
@@ -1170,13 +1214,13 @@
             <w:tcBorders>
               <w:top w:val="none" w:sz="0" w:space="0" w:color="auto"/>
               <w:left w:val="none" w:sz="0" w:space="0" w:color="auto"/>
-              <w:bottom w:val="single" w:sz="4" w:space="0" w:color="E6E9E6"/>
+              <w:bottom w:val="none" w:sz="0" w:space="0" w:color="auto"/>
               <w:right w:val="none" w:sz="0" w:space="0" w:color="auto"/>
             </w:tcBorders>
             <w:tcMar>
-              <w:top w:w="90" w:type="dxa"/>
+              <w:top w:w="120" w:type="dxa"/>
               <w:left w:w="150" w:type="dxa"/>
-              <w:bottom w:w="90" w:type="dxa"/>
+              <w:bottom w:w="120" w:type="dxa"/>
               <w:right w:w="150" w:type="dxa"/>
             </w:tcMar>
             <w:vAlign w:val="top"/>
@@ -1190,7 +1234,143 @@
               <w:rPr>
                 <w:color w:val="2B2B2B"/>
               </w:rPr>
-              <w:t>{prix_formate}{/lignes}</w:t>
+              <w:t>{prix_formate}{/pair}</w:t>
+            </w:r>
+          </w:p>
+        </w:tc>
+      </w:tr>
+      <w:tr w14:paraId="E1D63A471">
+        <w:tblPrEx>
+          <w:tblCellMar>
+            <w:top w:w="0" w:type="dxa"/>
+            <w:bottom w:w="0" w:type="dxa"/>
+          </w:tblCellMar>
+        </w:tblPrEx>
+        <w:trPr>
+          <w:cantSplit/>
+        </w:trPr>
+        <w:tc>
+          <w:tcPr>
+            <w:tcW w:w="650" w:type="dxa"/>
+            <w:tcBorders>
+              <w:top w:val="none" w:sz="0" w:space="0" w:color="auto"/>
+              <w:left w:val="none" w:sz="0" w:space="0" w:color="auto"/>
+              <w:bottom w:val="none" w:sz="0" w:space="0" w:color="auto"/>
+              <w:right w:val="none" w:sz="0" w:space="0" w:color="auto"/>
+            </w:tcBorders>
+            <w:shd w:val="clear" w:color="auto" w:fill="F6F8F6"/>
+            <w:tcMar>
+              <w:top w:w="120" w:type="dxa"/>
+              <w:left w:w="150" w:type="dxa"/>
+              <w:bottom w:w="120" w:type="dxa"/>
+              <w:right w:w="150" w:type="dxa"/>
+            </w:tcMar>
+            <w:vAlign w:val="top"/>
+          </w:tcPr>
+          <w:p w14:paraId="E0358BD82">
+            <w:pPr>
+              <w:spacing w:before="60" w:after="60"/>
+              <w:jc w:val="center"/>
+            </w:pPr>
+            <w:r>
+              <w:rPr>
+                <w:b/>
+                <w:bCs/>
+                <w:color w:val="1A2E1E"/>
+              </w:rPr>
+              <w:t>{#pair}{numero}</w:t>
+            </w:r>
+          </w:p>
+        </w:tc>
+        <w:tc>
+          <w:tcPr>
+            <w:tcW w:w="5900" w:type="dxa"/>
+            <w:tcBorders>
+              <w:top w:val="none" w:sz="0" w:space="0" w:color="auto"/>
+              <w:left w:val="none" w:sz="0" w:space="0" w:color="auto"/>
+              <w:bottom w:val="none" w:sz="0" w:space="0" w:color="auto"/>
+              <w:right w:val="none" w:sz="0" w:space="0" w:color="auto"/>
+            </w:tcBorders>
+            <w:shd w:val="clear" w:color="auto" w:fill="F6F8F6"/>
+            <w:tcMar>
+              <w:top w:w="120" w:type="dxa"/>
+              <w:left w:w="150" w:type="dxa"/>
+              <w:bottom w:w="120" w:type="dxa"/>
+              <w:right w:w="150" w:type="dxa"/>
+            </w:tcMar>
+            <w:vAlign w:val="top"/>
+          </w:tcPr>
+          <w:p w14:paraId="E7E6AC6EA">
+            <w:pPr>
+              <w:spacing w:before="60" w:after="60"/>
+            </w:pPr>
+            <w:r>
+              <w:rPr>
+                <w:color w:val="2B2B2B"/>
+              </w:rPr>
+              <w:t>{designation}</w:t>
+            </w:r>
+          </w:p>
+        </w:tc>
+        <w:tc>
+          <w:tcPr>
+            <w:tcW w:w="775" w:type="dxa"/>
+            <w:tcBorders>
+              <w:top w:val="none" w:sz="0" w:space="0" w:color="auto"/>
+              <w:left w:val="none" w:sz="0" w:space="0" w:color="auto"/>
+              <w:bottom w:val="none" w:sz="0" w:space="0" w:color="auto"/>
+              <w:right w:val="none" w:sz="0" w:space="0" w:color="auto"/>
+            </w:tcBorders>
+            <w:shd w:val="clear" w:color="auto" w:fill="F6F8F6"/>
+            <w:tcMar>
+              <w:top w:w="120" w:type="dxa"/>
+              <w:left w:w="150" w:type="dxa"/>
+              <w:bottom w:w="120" w:type="dxa"/>
+              <w:right w:w="150" w:type="dxa"/>
+            </w:tcMar>
+            <w:vAlign w:val="top"/>
+          </w:tcPr>
+          <w:p w14:paraId="E615E0308">
+            <w:pPr>
+              <w:spacing w:before="60" w:after="60"/>
+              <w:jc w:val="center"/>
+            </w:pPr>
+            <w:r>
+              <w:rPr>
+                <w:color w:val="2B2B2B"/>
+              </w:rPr>
+              <w:t>{quantite}</w:t>
+            </w:r>
+          </w:p>
+        </w:tc>
+        <w:tc>
+          <w:tcPr>
+            <w:tcW w:w="2200" w:type="dxa"/>
+            <w:tcBorders>
+              <w:top w:val="none" w:sz="0" w:space="0" w:color="auto"/>
+              <w:left w:val="none" w:sz="0" w:space="0" w:color="auto"/>
+              <w:bottom w:val="none" w:sz="0" w:space="0" w:color="auto"/>
+              <w:right w:val="none" w:sz="0" w:space="0" w:color="auto"/>
+            </w:tcBorders>
+            <w:shd w:val="clear" w:color="auto" w:fill="F6F8F6"/>
+            <w:tcMar>
+              <w:top w:w="120" w:type="dxa"/>
+              <w:left w:w="150" w:type="dxa"/>
+              <w:bottom w:w="120" w:type="dxa"/>
+              <w:right w:w="150" w:type="dxa"/>
+            </w:tcMar>
+            <w:vAlign w:val="top"/>
+          </w:tcPr>
+          <w:p w14:paraId="E6EA725D7">
+            <w:pPr>
+              <w:spacing w:before="60" w:after="60"/>
+              <w:jc w:val="right"/>
+            </w:pPr>
+            <w:r>
+              <w:rPr>
+                <w:color w:val="2B2B2B"/>
+              </w:rPr>
+              <w:t>{prix_formate}{/pair}{/lignes}</w:t>
             </w:r>
           </w:p>
         </w:tc>
@@ -1210,7 +1390,7 @@
             <w:tcW w:w="8097" w:type="dxa"/>
             <w:gridSpan w:val="3"/>
             <w:tcBorders>
-              <w:top w:val="single" w:sz="12" w:space="0" w:color="1A2E1E"/>
+              <w:top w:val="single" w:sz="6" w:space="0" w:color="DADCDA"/>
               <w:left w:val="none" w:sz="0" w:space="0" w:color="auto"/>
               <w:bottom w:val="none" w:sz="0" w:space="0" w:color="auto"/>
               <w:right w:val="none" w:sz="0" w:space="0" w:color="auto"/>
@@ -1242,7 +1422,7 @@
           <w:tcPr>
             <w:tcW w:w="1428" w:type="dxa"/>
             <w:tcBorders>
-              <w:top w:val="single" w:sz="12" w:space="0" w:color="1A2E1E"/>
+              <w:top w:val="single" w:sz="6" w:space="0" w:color="DADCDA"/>
               <w:left w:val="none" w:sz="0" w:space="0" w:color="auto"/>
               <w:bottom w:val="none" w:sz="0" w:space="0" w:color="auto"/>
               <w:right w:val="none" w:sz="0" w:space="0" w:color="auto"/>
@@ -1435,7 +1615,7 @@
                 <w:bCs/>
                 <w:color w:val="FEFEFE"/>
               </w:rPr>
-              <w:t>Q</w:t>
+              <w:t>Qté</w:t>
             </w:r>
           </w:p>
         </w:tc>
@@ -1469,7 +1649,7 @@
                 <w:bCs/>
                 <w:color w:val="FEFEFE"/>
               </w:rPr>
-              <w:t>Prix</w:t>
+              <w:t>Prix HT</w:t>
             </w:r>
           </w:p>
         </w:tc>
@@ -1490,13 +1670,13 @@
             <w:tcBorders>
               <w:top w:val="none" w:sz="0" w:space="0" w:color="auto"/>
               <w:left w:val="none" w:sz="0" w:space="0" w:color="auto"/>
-              <w:bottom w:val="single" w:sz="4" w:space="0" w:color="E6E9E6"/>
+              <w:bottom w:val="none" w:sz="0" w:space="0" w:color="auto"/>
               <w:right w:val="none" w:sz="0" w:space="0" w:color="auto"/>
             </w:tcBorders>
             <w:tcMar>
-              <w:top w:w="90" w:type="dxa"/>
+              <w:top w:w="120" w:type="dxa"/>
               <w:left w:w="150" w:type="dxa"/>
-              <w:bottom w:w="90" w:type="dxa"/>
+              <w:bottom w:w="120" w:type="dxa"/>
               <w:right w:w="150" w:type="dxa"/>
             </w:tcMar>
             <w:vAlign w:val="top"/>
@@ -1513,7 +1693,7 @@
                 <w:bCs/>
                 <w:color w:val="1A2E1E"/>
               </w:rPr>
-              <w:t>{#recap_lignes}{numero}</w:t>
+              <w:t>{#recap_lignes}{^pair}{numero}</w:t>
             </w:r>
           </w:p>
         </w:tc>
@@ -1523,13 +1703,13 @@
             <w:tcBorders>
               <w:top w:val="none" w:sz="0" w:space="0" w:color="auto"/>
               <w:left w:val="none" w:sz="0" w:space="0" w:color="auto"/>
-              <w:bottom w:val="single" w:sz="4" w:space="0" w:color="E6E9E6"/>
+              <w:bottom w:val="none" w:sz="0" w:space="0" w:color="auto"/>
               <w:right w:val="none" w:sz="0" w:space="0" w:color="auto"/>
             </w:tcBorders>
             <w:tcMar>
-              <w:top w:w="90" w:type="dxa"/>
+              <w:top w:w="120" w:type="dxa"/>
               <w:left w:w="150" w:type="dxa"/>
-              <w:bottom w:w="90" w:type="dxa"/>
+              <w:bottom w:w="120" w:type="dxa"/>
               <w:right w:w="150" w:type="dxa"/>
             </w:tcMar>
             <w:vAlign w:val="top"/>
@@ -1553,13 +1733,13 @@
             <w:tcBorders>
               <w:top w:val="none" w:sz="0" w:space="0" w:color="auto"/>
               <w:left w:val="none" w:sz="0" w:space="0" w:color="auto"/>
-              <w:bottom w:val="single" w:sz="4" w:space="0" w:color="E6E9E6"/>
+              <w:bottom w:val="none" w:sz="0" w:space="0" w:color="auto"/>
               <w:right w:val="none" w:sz="0" w:space="0" w:color="auto"/>
             </w:tcBorders>
             <w:tcMar>
-              <w:top w:w="90" w:type="dxa"/>
+              <w:top w:w="120" w:type="dxa"/>
               <w:left w:w="150" w:type="dxa"/>
-              <w:bottom w:w="90" w:type="dxa"/>
+              <w:bottom w:w="120" w:type="dxa"/>
               <w:right w:w="150" w:type="dxa"/>
             </w:tcMar>
             <w:vAlign w:val="top"/>
@@ -1584,13 +1764,13 @@
             <w:tcBorders>
               <w:top w:val="none" w:sz="0" w:space="0" w:color="auto"/>
               <w:left w:val="none" w:sz="0" w:space="0" w:color="auto"/>
-              <w:bottom w:val="single" w:sz="4" w:space="0" w:color="E6E9E6"/>
+              <w:bottom w:val="none" w:sz="0" w:space="0" w:color="auto"/>
               <w:right w:val="none" w:sz="0" w:space="0" w:color="auto"/>
             </w:tcBorders>
             <w:tcMar>
-              <w:top w:w="90" w:type="dxa"/>
+              <w:top w:w="120" w:type="dxa"/>
               <w:left w:w="150" w:type="dxa"/>
-              <w:bottom w:w="90" w:type="dxa"/>
+              <w:bottom w:w="120" w:type="dxa"/>
               <w:right w:w="150" w:type="dxa"/>
             </w:tcMar>
             <w:vAlign w:val="top"/>
@@ -1605,7 +1785,147 @@
               <w:rPr>
                 <w:color w:val="2B2B2B"/>
               </w:rPr>
-              <w:t>{prix_formate}{/recap_lignes}</w:t>
+              <w:t>{prix_formate}{/pair}</w:t>
+            </w:r>
+          </w:p>
+        </w:tc>
+      </w:tr>
+      <w:tr w14:paraId="R3B056DBD">
+        <w:tblPrEx>
+          <w:tblCellMar>
+            <w:top w:w="0" w:type="dxa"/>
+            <w:bottom w:w="0" w:type="dxa"/>
+          </w:tblCellMar>
+        </w:tblPrEx>
+        <w:trPr>
+          <w:cantSplit/>
+        </w:trPr>
+        <w:tc>
+          <w:tcPr>
+            <w:tcW w:w="650" w:type="dxa"/>
+            <w:tcBorders>
+              <w:top w:val="none" w:sz="0" w:space="0" w:color="auto"/>
+              <w:left w:val="none" w:sz="0" w:space="0" w:color="auto"/>
+              <w:bottom w:val="none" w:sz="0" w:space="0" w:color="auto"/>
+              <w:right w:val="none" w:sz="0" w:space="0" w:color="auto"/>
+            </w:tcBorders>
+            <w:shd w:val="clear" w:color="auto" w:fill="F6F8F6"/>
+            <w:tcMar>
+              <w:top w:w="120" w:type="dxa"/>
+              <w:left w:w="150" w:type="dxa"/>
+              <w:bottom w:w="120" w:type="dxa"/>
+              <w:right w:w="150" w:type="dxa"/>
+            </w:tcMar>
+            <w:vAlign w:val="top"/>
+          </w:tcPr>
+          <w:p w14:paraId="R56F10528">
+            <w:pPr>
+              <w:keepNext/>
+              <w:spacing w:before="60" w:after="60"/>
+              <w:jc w:val="center"/>
+            </w:pPr>
+            <w:r>
+              <w:rPr>
+                <w:b/>
+                <w:bCs/>
+                <w:color w:val="1A2E1E"/>
+              </w:rPr>
+              <w:t>{#pair}{numero}</w:t>
+            </w:r>
+          </w:p>
+        </w:tc>
+        <w:tc>
+          <w:tcPr>
+            <w:tcW w:w="5900" w:type="dxa"/>
+            <w:tcBorders>
+              <w:top w:val="none" w:sz="0" w:space="0" w:color="auto"/>
+              <w:left w:val="none" w:sz="0" w:space="0" w:color="auto"/>
+              <w:bottom w:val="none" w:sz="0" w:space="0" w:color="auto"/>
+              <w:right w:val="none" w:sz="0" w:space="0" w:color="auto"/>
+            </w:tcBorders>
+            <w:shd w:val="clear" w:color="auto" w:fill="F6F8F6"/>
+            <w:tcMar>
+              <w:top w:w="120" w:type="dxa"/>
+              <w:left w:w="150" w:type="dxa"/>
+              <w:bottom w:w="120" w:type="dxa"/>
+              <w:right w:w="150" w:type="dxa"/>
+            </w:tcMar>
+            <w:vAlign w:val="top"/>
+          </w:tcPr>
+          <w:p w14:paraId="R775FBF52">
+            <w:pPr>
+              <w:keepNext/>
+              <w:spacing w:before="60" w:after="60"/>
+            </w:pPr>
+            <w:r>
+              <w:rPr>
+                <w:color w:val="2B2B2B"/>
+              </w:rPr>
+              <w:t>{designation}</w:t>
+            </w:r>
+          </w:p>
+        </w:tc>
+        <w:tc>
+          <w:tcPr>
+            <w:tcW w:w="775" w:type="dxa"/>
+            <w:tcBorders>
+              <w:top w:val="none" w:sz="0" w:space="0" w:color="auto"/>
+              <w:left w:val="none" w:sz="0" w:space="0" w:color="auto"/>
+              <w:bottom w:val="none" w:sz="0" w:space="0" w:color="auto"/>
+              <w:right w:val="none" w:sz="0" w:space="0" w:color="auto"/>
+            </w:tcBorders>
+            <w:shd w:val="clear" w:color="auto" w:fill="F6F8F6"/>
+            <w:tcMar>
+              <w:top w:w="120" w:type="dxa"/>
+              <w:left w:w="150" w:type="dxa"/>
+              <w:bottom w:w="120" w:type="dxa"/>
+              <w:right w:w="150" w:type="dxa"/>
+            </w:tcMar>
+            <w:vAlign w:val="top"/>
+          </w:tcPr>
+          <w:p w14:paraId="R2F3BAD4B">
+            <w:pPr>
+              <w:keepNext/>
+              <w:spacing w:before="60" w:after="60"/>
+              <w:jc w:val="center"/>
+            </w:pPr>
+            <w:r>
+              <w:rPr>
+                <w:color w:val="2B2B2B"/>
+              </w:rPr>
+              <w:t>{quantite}</w:t>
+            </w:r>
+          </w:p>
+        </w:tc>
+        <w:tc>
+          <w:tcPr>
+            <w:tcW w:w="2200" w:type="dxa"/>
+            <w:tcBorders>
+              <w:top w:val="none" w:sz="0" w:space="0" w:color="auto"/>
+              <w:left w:val="none" w:sz="0" w:space="0" w:color="auto"/>
+              <w:bottom w:val="none" w:sz="0" w:space="0" w:color="auto"/>
+              <w:right w:val="none" w:sz="0" w:space="0" w:color="auto"/>
+            </w:tcBorders>
+            <w:shd w:val="clear" w:color="auto" w:fill="F6F8F6"/>
+            <w:tcMar>
+              <w:top w:w="120" w:type="dxa"/>
+              <w:left w:w="150" w:type="dxa"/>
+              <w:bottom w:w="120" w:type="dxa"/>
+              <w:right w:w="150" w:type="dxa"/>
+            </w:tcMar>
+            <w:vAlign w:val="top"/>
+          </w:tcPr>
+          <w:p w14:paraId="R1F73DD81">
+            <w:pPr>
+              <w:keepNext/>
+              <w:spacing w:before="60" w:after="60"/>
+              <w:jc w:val="right"/>
+            </w:pPr>
+            <w:r>
+              <w:rPr>
+                <w:color w:val="2B2B2B"/>
+              </w:rPr>
+              <w:t>{prix_formate}{/pair}{/recap_lignes}</w:t>
             </w:r>
           </w:p>
         </w:tc>
@@ -1625,7 +1945,7 @@
             <w:tcW w:w="8097" w:type="dxa"/>
             <w:gridSpan w:val="3"/>
             <w:tcBorders>
-              <w:top w:val="single" w:sz="12" w:space="0" w:color="1A2E1E"/>
+              <w:top w:val="single" w:sz="6" w:space="0" w:color="DADCDA"/>
               <w:left w:val="none" w:sz="0" w:space="0" w:color="auto"/>
               <w:bottom w:val="none" w:sz="0" w:space="0" w:color="auto"/>
               <w:right w:val="none" w:sz="0" w:space="0" w:color="auto"/>
@@ -1658,7 +1978,7 @@
           <w:tcPr>
             <w:tcW w:w="1428" w:type="dxa"/>
             <w:tcBorders>
-              <w:top w:val="single" w:sz="12" w:space="0" w:color="1A2E1E"/>
+              <w:top w:val="single" w:sz="6" w:space="0" w:color="DADCDA"/>
               <w:left w:val="none" w:sz="0" w:space="0" w:color="auto"/>
               <w:bottom w:val="none" w:sz="0" w:space="0" w:color="auto"/>
               <w:right w:val="none" w:sz="0" w:space="0" w:color="auto"/>
@@ -2323,7 +2643,7 @@
     </w:p>
     <w:tbl>
       <w:tblPr>
-        <w:tblW w:w="5400" w:type="dxa"/>
+        <w:tblW w:w="9525" w:type="dxa"/>
         <w:jc w:val="left"/>
         <w:tblBorders>
           <w:top w:val="single" w:sz="4" w:space="0" w:color="auto"/>
@@ -2340,8 +2660,9 @@
         <w:tblLook w:val="04A0" w:firstRow="1" w:lastRow="0" w:firstColumn="1" w:lastColumn="0" w:noHBand="0" w:noVBand="1"/>
       </w:tblPr>
       <w:tblGrid>
-        <w:gridCol w:w="2700"/>
-        <w:gridCol w:w="2700"/>
+        <w:gridCol w:w="3800"/>
+        <w:gridCol w:w="1925"/>
+        <w:gridCol w:w="3800"/>
       </w:tblGrid>
       <w:tr>
         <w:tblPrEx>
@@ -2352,7 +2673,7 @@
         </w:tblPrEx>
         <w:tc>
           <w:tcPr>
-            <w:tcW w:w="2700" w:type="dxa"/>
+            <w:tcW w:w="3800" w:type="dxa"/>
             <w:tcBorders>
               <w:top w:val="none" w:sz="0" w:space="0" w:color="FFFFFF"/>
               <w:left w:val="none" w:sz="0" w:space="0" w:color="FFFFFF"/>
@@ -2363,7 +2684,7 @@
               <w:top w:w="0" w:type="dxa"/>
               <w:left w:w="0" w:type="dxa"/>
               <w:bottom w:w="0" w:type="dxa"/>
-              <w:right w:w="454" w:type="dxa"/>
+              <w:right w:w="0" w:type="dxa"/>
             </w:tcMar>
           </w:tcPr>
           <w:p>
@@ -2460,7 +2781,23 @@
         </w:tc>
         <w:tc>
           <w:tcPr>
-            <w:tcW w:w="2700" w:type="dxa"/>
+            <w:tcW w:w="1925" w:type="dxa"/>
+            <w:tcBorders>
+              <w:top w:val="none" w:sz="0" w:space="0" w:color="FFFFFF"/>
+              <w:left w:val="none" w:sz="0" w:space="0" w:color="FFFFFF"/>
+              <w:bottom w:val="none" w:sz="0" w:space="0" w:color="FFFFFF"/>
+              <w:right w:val="none" w:sz="0" w:space="0" w:color="FFFFFF"/>
+            </w:tcBorders>
+          </w:tcPr>
+          <w:p>
+            <w:pPr>
+              <w:spacing w:after="0" w:line="240" w:lineRule="auto"/>
+            </w:pPr>
+          </w:p>
+        </w:tc>
+        <w:tc>
+          <w:tcPr>
+            <w:tcW w:w="3800" w:type="dxa"/>
             <w:tcBorders>
               <w:top w:val="none" w:sz="0" w:space="0" w:color="FFFFFF"/>
               <w:left w:val="none" w:sz="0" w:space="0" w:color="FFFFFF"/>
@@ -2688,6 +3025,16 @@
 </w:ftr>
 </file>
 
+<file path=word/footer2.xml><?xml version="1.0" encoding="utf-8"?>
+<w:ftr xmlns:wpc="http://schemas.microsoft.com/office/word/2010/wordprocessingCanvas" xmlns:mc="http://schemas.openxmlformats.org/markup-compatibility/2006" xmlns:o="urn:schemas-microsoft-com:office:office" xmlns:r="http://schemas.openxmlformats.org/officeDocument/2006/relationships" xmlns:m="http://schemas.openxmlformats.org/officeDocument/2006/math" xmlns:v="urn:schemas-microsoft-com:vml" xmlns:wp14="http://schemas.microsoft.com/office/word/2010/wordprocessingDrawing" xmlns:wp="http://schemas.openxmlformats.org/drawingml/2006/wordprocessingDrawing" xmlns:w10="urn:schemas-microsoft-com:office:word" xmlns:w="http://schemas.openxmlformats.org/wordprocessingml/2006/main" xmlns:w14="http://schemas.microsoft.com/office/word/2010/wordml" xmlns:w15="http://schemas.microsoft.com/office/word/2012/wordml" xmlns:w16cex="http://schemas.microsoft.com/office/word/2018/wordml/cex" xmlns:w16cid="http://schemas.microsoft.com/office/word/2016/wordml/cid" xmlns:w16="http://schemas.microsoft.com/office/word/2018/wordml" xmlns:w16sdtdh="http://schemas.microsoft.com/office/word/2020/wordml/sdtdatahash" xmlns:w16se="http://schemas.microsoft.com/office/word/2015/wordml/symex" xmlns:wpg="http://schemas.microsoft.com/office/word/2010/wordprocessingGroup" xmlns:wpi="http://schemas.microsoft.com/office/word/2010/wordprocessingInk" xmlns:wne="http://schemas.microsoft.com/office/word/2006/wordml" xmlns:wps="http://schemas.microsoft.com/office/word/2010/wordprocessingShape" mc:Ignorable="w14 w15 w16se w16cid w16 w16cex w16sdtdh wp14">
+  <w:p>
+    <w:pPr>
+      <w:pStyle w:val="Footer"/>
+    </w:pPr>
+  </w:p>
+</w:ftr>
+</file>
+
 <file path=word/footnotes.xml><?xml version="1.0" encoding="utf-8"?>
 <w:footnotes xmlns:wpc="http://schemas.microsoft.com/office/word/2010/wordprocessingCanvas" xmlns:cx="http://schemas.microsoft.com/office/drawing/2014/chartex" xmlns:cx1="http://schemas.microsoft.com/office/drawing/2015/9/8/chartex" xmlns:cx2="http://schemas.microsoft.com/office/drawing/2015/10/21/chartex" xmlns:cx3="http://schemas.microsoft.com/office/drawing/2016/5/9/chartex" xmlns:cx4="http://schemas.microsoft.com/office/drawing/2016/5/10/chartex" xmlns:cx5="http://schemas.microsoft.com/office/drawing/2016/5/11/chartex" xmlns:cx6="http://schemas.microsoft.com/office/drawing/2016/5/12/chartex" xmlns:cx7="http://schemas.microsoft.com/office/drawing/2016/5/13/chartex" xmlns:cx8="http://schemas.microsoft.com/office/drawing/2016/5/14/chartex" xmlns:mc="http://schemas.openxmlformats.org/markup-compatibility/2006" xmlns:aink="http://schemas.microsoft.com/office/drawing/2016/ink" xmlns:am3d="http://schemas.microsoft.com/office/drawing/2017/model3d" xmlns:o="urn:schemas-microsoft-com:office:office" xmlns:oel="http://schemas.microsoft.com/office/2019/extlst" xmlns:r="http://schemas.openxmlformats.org/officeDocument/2006/relationships" xmlns:m="http://schemas.openxmlformats.org/officeDocument/2006/math" xmlns:v="urn:schemas-microsoft-com:vml" xmlns:wp14="http://schemas.microsoft.com/office/word/2010/wordprocessingDrawing" xmlns:wp="http://schemas.openxmlformats.org/drawingml/2006/wordprocessingDrawing" xmlns:w10="urn:schemas-microsoft-com:office:word" xmlns:w="http://schemas.openxmlformats.org/wordprocessingml/2006/main" xmlns:w14="http://schemas.microsoft.com/office/word/2010/wordml" xmlns:w15="http://schemas.microsoft.com/office/word/2012/wordml" xmlns:w16cex="http://schemas.microsoft.com/office/word/2018/wordml/cex" xmlns:w16cid="http://schemas.microsoft.com/office/word/2016/wordml/cid" xmlns:w16="http://schemas.microsoft.com/office/word/2018/wordml" xmlns:w16sdtdh="http://schemas.microsoft.com/office/word/2020/wordml/sdtdatahash" xmlns:w16se="http://schemas.microsoft.com/office/word/2015/wordml/symex" xmlns:wpg="http://schemas.microsoft.com/office/word/2010/wordprocessingGroup" xmlns:wpi="http://schemas.microsoft.com/office/word/2010/wordprocessingInk" xmlns:wne="http://schemas.microsoft.com/office/word/2006/wordml" xmlns:wps="http://schemas.microsoft.com/office/word/2010/wordprocessingShape" mc:Ignorable="w14 w15 w16se w16cid w16 w16cex w16sdtdh wp14">
   <w:footnote w:type="separator" w:id="-1">
@@ -2767,6 +3114,16 @@
         </wp:inline>
       </w:drawing>
     </w:r>
+  </w:p>
+</w:hdr>
+</file>
+
+<file path=word/header2.xml><?xml version="1.0" encoding="utf-8"?>
+<w:hdr xmlns:wpc="http://schemas.microsoft.com/office/word/2010/wordprocessingCanvas" xmlns:mc="http://schemas.openxmlformats.org/markup-compatibility/2006" xmlns:o="urn:schemas-microsoft-com:office:office" xmlns:r="http://schemas.openxmlformats.org/officeDocument/2006/relationships" xmlns:m="http://schemas.openxmlformats.org/officeDocument/2006/math" xmlns:v="urn:schemas-microsoft-com:vml" xmlns:wp14="http://schemas.microsoft.com/office/word/2010/wordprocessingDrawing" xmlns:wp="http://schemas.openxmlformats.org/drawingml/2006/wordprocessingDrawing" xmlns:w10="urn:schemas-microsoft-com:office:word" xmlns:w="http://schemas.openxmlformats.org/wordprocessingml/2006/main" xmlns:w14="http://schemas.microsoft.com/office/word/2010/wordml" xmlns:w15="http://schemas.microsoft.com/office/word/2012/wordml" xmlns:w16cex="http://schemas.microsoft.com/office/word/2018/wordml/cex" xmlns:w16cid="http://schemas.microsoft.com/office/word/2016/wordml/cid" xmlns:w16="http://schemas.microsoft.com/office/word/2018/wordml" xmlns:w16sdtdh="http://schemas.microsoft.com/office/word/2020/wordml/sdtdatahash" xmlns:w16se="http://schemas.microsoft.com/office/word/2015/wordml/symex" xmlns:wpg="http://schemas.microsoft.com/office/word/2010/wordprocessingGroup" xmlns:wpi="http://schemas.microsoft.com/office/word/2010/wordprocessingInk" xmlns:wne="http://schemas.microsoft.com/office/word/2006/wordml" xmlns:wps="http://schemas.microsoft.com/office/word/2010/wordprocessingShape" mc:Ignorable="w14 w15 w16se w16cid w16 w16cex w16sdtdh wp14">
+  <w:p>
+    <w:pPr>
+      <w:pStyle w:val="Header"/>
+    </w:pPr>
   </w:p>
 </w:hdr>
 </file>

</xml_diff>

<commit_message>
docs(update): update logo on the soumission template
</commit_message>
<xml_diff>
--- a/templates/template-standard-v2.docx
+++ b/templates/template-standard-v2.docx
@@ -4,122 +4,153 @@
   <w:body>
     <w:p>
       <w:pPr>
-        <w:spacing w:before="3000" w:after="0" w:line="240" w:lineRule="auto"/>
+        <w:spacing w:before="3000" w:line="240" w:lineRule="auto"/>
+        <w:rPr>
+          <w:lang w:val="fr-CA"/>
+        </w:rPr>
       </w:pPr>
       <w:r>
         <w:rPr>
           <w:caps/>
           <w:color w:val="C9A96E"/>
-          <w:sz w:val="20"/>
           <w:spacing w:val="120"/>
+          <w:lang w:val="fr-CA"/>
         </w:rPr>
         <w:t>Offre de services</w:t>
       </w:r>
     </w:p>
     <w:p>
       <w:pPr>
-        <w:spacing w:before="200" w:after="0" w:line="240" w:lineRule="auto"/>
+        <w:spacing w:before="200" w:line="240" w:lineRule="auto"/>
+        <w:rPr>
+          <w:lang w:val="fr-CA"/>
+        </w:rPr>
       </w:pPr>
       <w:r>
         <w:rPr>
           <w:b/>
           <w:color w:val="1A2E1E"/>
+          <w:spacing w:val="-20"/>
           <w:sz w:val="64"/>
-          <w:spacing w:val="-20"/>
+          <w:lang w:val="fr-CA"/>
         </w:rPr>
         <w:t>BTH Expert</w:t>
       </w:r>
     </w:p>
     <w:p>
       <w:pPr>
-        <w:spacing w:before="60" w:after="0" w:line="240" w:lineRule="auto"/>
         <w:pBdr>
           <w:bottom w:val="single" w:sz="4" w:space="6" w:color="C9A96E"/>
         </w:pBdr>
+        <w:spacing w:before="60" w:line="240" w:lineRule="auto"/>
+        <w:rPr>
+          <w:lang w:val="fr-CA"/>
+        </w:rPr>
       </w:pPr>
       <w:r>
         <w:rPr>
           <w:color w:val="2B2B2B"/>
-          <w:sz w:val="20"/>
-        </w:rPr>
-        <w:t xml:space="preserve">Environnement  ·  Ingénierie</w:t>
-      </w:r>
-    </w:p>
-    <w:p>
-      <w:pPr>
-        <w:spacing w:before="1800" w:after="0" w:line="240" w:lineRule="auto"/>
+          <w:lang w:val="fr-CA"/>
+        </w:rPr>
+        <w:t>Environnement  ·  Ingénierie</w:t>
+      </w:r>
+    </w:p>
+    <w:p>
+      <w:pPr>
+        <w:spacing w:before="1800" w:line="240" w:lineRule="auto"/>
+        <w:rPr>
+          <w:lang w:val="fr-CA"/>
+        </w:rPr>
       </w:pPr>
       <w:r>
         <w:rPr>
           <w:caps/>
           <w:color w:val="C9A96E"/>
+          <w:spacing w:val="80"/>
           <w:sz w:val="16"/>
-          <w:spacing w:val="80"/>
+          <w:lang w:val="fr-CA"/>
         </w:rPr>
         <w:t>Objet</w:t>
       </w:r>
     </w:p>
     <w:p>
       <w:pPr>
-        <w:spacing w:before="100" w:after="0" w:line="320" w:lineRule="auto"/>
+        <w:spacing w:before="100" w:line="320" w:lineRule="auto"/>
+        <w:rPr>
+          <w:lang w:val="fr-CA"/>
+        </w:rPr>
       </w:pPr>
       <w:r>
         <w:rPr>
           <w:b/>
           <w:color w:val="1A2E1E"/>
           <w:sz w:val="28"/>
+          <w:lang w:val="fr-CA"/>
         </w:rPr>
         <w:t>{objet_ligne1}</w:t>
       </w:r>
     </w:p>
     <w:p>
       <w:pPr>
-        <w:spacing w:before="1200" w:after="0" w:line="240" w:lineRule="auto"/>
+        <w:spacing w:before="1200" w:line="240" w:lineRule="auto"/>
+        <w:rPr>
+          <w:lang w:val="fr-CA"/>
+        </w:rPr>
       </w:pPr>
       <w:r>
         <w:rPr>
           <w:caps/>
           <w:color w:val="C9A96E"/>
+          <w:spacing w:val="80"/>
           <w:sz w:val="16"/>
-          <w:spacing w:val="80"/>
+          <w:lang w:val="fr-CA"/>
         </w:rPr>
         <w:t>Préparée pour</w:t>
       </w:r>
     </w:p>
     <w:p>
       <w:pPr>
-        <w:spacing w:before="80" w:after="0" w:line="280" w:lineRule="auto"/>
+        <w:spacing w:before="80" w:line="280" w:lineRule="auto"/>
+        <w:rPr>
+          <w:lang w:val="fr-CA"/>
+        </w:rPr>
       </w:pPr>
       <w:r>
         <w:rPr>
           <w:b/>
           <w:color w:val="1A2E1E"/>
           <w:sz w:val="28"/>
+          <w:lang w:val="fr-CA"/>
         </w:rPr>
         <w:t>{nom_client}</w:t>
       </w:r>
     </w:p>
     <w:p>
       <w:pPr>
-        <w:spacing w:before="20" w:after="0" w:line="240" w:lineRule="auto"/>
+        <w:spacing w:before="20" w:line="240" w:lineRule="auto"/>
+        <w:rPr>
+          <w:lang w:val="fr-CA"/>
+        </w:rPr>
       </w:pPr>
       <w:r>
         <w:rPr>
           <w:color w:val="2B2B2B"/>
           <w:sz w:val="22"/>
+          <w:lang w:val="fr-CA"/>
         </w:rPr>
         <w:t>{entreprise}</w:t>
       </w:r>
     </w:p>
     <w:p>
       <w:pPr>
-        <w:spacing w:before="1600" w:after="0" w:line="240" w:lineRule="auto"/>
         <w:pBdr>
           <w:top w:val="single" w:sz="4" w:space="6" w:color="C9A96E"/>
         </w:pBdr>
+        <w:spacing w:before="1600" w:line="240" w:lineRule="auto"/>
+        <w:rPr>
+          <w:lang w:val="fr-CA"/>
+        </w:rPr>
         <w:sectPr>
-          <w:headerReference w:type="default" r:id="rId11"/>
-          <w:footerReference w:type="default" r:id="rId12"/>
           <w:pgSz w:w="11906" w:h="16838"/>
           <w:pgMar w:top="1928" w:right="1134" w:bottom="1134" w:left="1247" w:header="454" w:footer="680" w:gutter="0"/>
           <w:pgNumType w:start="0"/>
@@ -130,8 +161,9 @@
         <w:rPr>
           <w:color w:val="887F74"/>
           <w:sz w:val="18"/>
-        </w:rPr>
-        <w:t xml:space="preserve">Réf. {numero_offre}  ·  {date_offre}</w:t>
+          <w:lang w:val="fr-CA"/>
+        </w:rPr>
+        <w:t>Réf. {numero_offre}  ·  {date_offre}</w:t>
       </w:r>
     </w:p>
     <w:tbl>
@@ -156,12 +188,6 @@
         <w:gridCol w:w="3425"/>
       </w:tblGrid>
       <w:tr>
-        <w:tblPrEx>
-          <w:tblCellMar>
-            <w:top w:w="0" w:type="dxa"/>
-            <w:bottom w:w="0" w:type="dxa"/>
-          </w:tblCellMar>
-        </w:tblPrEx>
         <w:tc>
           <w:tcPr>
             <w:tcW w:w="6100" w:type="dxa"/>
@@ -192,6 +218,7 @@
                 <w:szCs w:val="19"/>
                 <w:lang w:val="fr-CA"/>
               </w:rPr>
+              <w:lastRenderedPageBreak/>
               <w:t xml:space="preserve">{titre} </w:t>
             </w:r>
             <w:r>
@@ -395,12 +422,6 @@
         <w:gridCol w:w="7824"/>
       </w:tblGrid>
       <w:tr>
-        <w:tblPrEx>
-          <w:tblCellMar>
-            <w:top w:w="0" w:type="dxa"/>
-            <w:bottom w:w="0" w:type="dxa"/>
-          </w:tblCellMar>
-        </w:tblPrEx>
         <w:tc>
           <w:tcPr>
             <w:tcW w:w="1701" w:type="dxa"/>
@@ -550,12 +571,6 @@
               <w:gridCol w:w="7370"/>
             </w:tblGrid>
             <w:tr>
-              <w:tblPrEx>
-                <w:tblCellMar>
-                  <w:top w:w="0" w:type="dxa"/>
-                  <w:bottom w:w="0" w:type="dxa"/>
-                </w:tblCellMar>
-              </w:tblPrEx>
               <w:trPr>
                 <w:cantSplit/>
               </w:trPr>
@@ -594,7 +609,7 @@
     <w:p>
       <w:pPr>
         <w:widowControl w:val="0"/>
-        <w:spacing w:before="400" w:line="240" w:lineRule="auto" w:after="240"/>
+        <w:spacing w:before="400" w:after="240" w:line="240" w:lineRule="auto"/>
       </w:pPr>
       <w:r>
         <w:t xml:space="preserve"> </w:t>
@@ -610,7 +625,6 @@
         <w:rPr>
           <w:color w:val="C9A96E"/>
         </w:rPr>
-        <w:lastRenderedPageBreak/>
         <w:t xml:space="preserve">1.1  </w:t>
       </w:r>
       <w:r>
@@ -735,6 +749,7 @@
         <w:rPr>
           <w:color w:val="C9A96E"/>
         </w:rPr>
+        <w:lastRenderedPageBreak/>
         <w:t xml:space="preserve">1.3  </w:t>
       </w:r>
       <w:r>
@@ -806,7 +821,6 @@
         <w:spacing w:before="0"/>
       </w:pPr>
       <w:r>
-        <w:lastRenderedPageBreak/>
         <w:t>2.  Livrables</w:t>
       </w:r>
     </w:p>
@@ -868,7 +882,6 @@
     <w:p>
       <w:pPr>
         <w:pStyle w:val="Titre1BTH"/>
-        <w:pageBreakBefore w:val="0"/>
         <w:widowControl w:val="0"/>
         <w:pBdr>
           <w:bottom w:val="single" w:sz="6" w:space="6" w:color="C9A96E"/>
@@ -944,14 +957,6 @@
     <w:tbl>
       <w:tblPr>
         <w:tblW w:w="9525" w:type="dxa"/>
-        <w:tblBorders>
-          <w:top w:val="none" w:sz="0" w:space="0" w:color="auto"/>
-          <w:left w:val="none" w:sz="0" w:space="0" w:color="auto"/>
-          <w:bottom w:val="none" w:sz="0" w:space="0" w:color="auto"/>
-          <w:right w:val="none" w:sz="0" w:space="0" w:color="auto"/>
-          <w:insideH w:val="none" w:sz="0" w:space="0" w:color="auto"/>
-          <w:insideV w:val="none" w:sz="0" w:space="0" w:color="auto"/>
-        </w:tblBorders>
         <w:tblCellMar>
           <w:left w:w="10" w:type="dxa"/>
           <w:right w:w="10" w:type="dxa"/>
@@ -959,18 +964,12 @@
         <w:tblLook w:val="04A0" w:firstRow="1" w:lastRow="0" w:firstColumn="1" w:lastColumn="0" w:noHBand="0" w:noVBand="1"/>
       </w:tblPr>
       <w:tblGrid>
-        <w:gridCol w:w="650"/>
-        <w:gridCol w:w="5900"/>
-        <w:gridCol w:w="775"/>
-        <w:gridCol w:w="2200"/>
+        <w:gridCol w:w="2674"/>
+        <w:gridCol w:w="2803"/>
+        <w:gridCol w:w="1268"/>
+        <w:gridCol w:w="2780"/>
       </w:tblGrid>
       <w:tr>
-        <w:tblPrEx>
-          <w:tblCellMar>
-            <w:top w:w="0" w:type="dxa"/>
-            <w:bottom w:w="0" w:type="dxa"/>
-          </w:tblCellMar>
-        </w:tblPrEx>
         <w:trPr>
           <w:cantSplit/>
           <w:tblHeader/>
@@ -978,12 +977,6 @@
         <w:tc>
           <w:tcPr>
             <w:tcW w:w="650" w:type="dxa"/>
-            <w:tcBorders>
-              <w:top w:val="none" w:sz="0" w:space="0" w:color="auto"/>
-              <w:left w:val="none" w:sz="0" w:space="0" w:color="auto"/>
-              <w:bottom w:val="none" w:sz="0" w:space="0" w:color="auto"/>
-              <w:right w:val="none" w:sz="0" w:space="0" w:color="auto"/>
-            </w:tcBorders>
             <w:shd w:val="clear" w:color="auto" w:fill="1A2E1E"/>
             <w:tcMar>
               <w:top w:w="120" w:type="dxa"/>
@@ -1011,12 +1004,6 @@
         <w:tc>
           <w:tcPr>
             <w:tcW w:w="5900" w:type="dxa"/>
-            <w:tcBorders>
-              <w:top w:val="none" w:sz="0" w:space="0" w:color="auto"/>
-              <w:left w:val="none" w:sz="0" w:space="0" w:color="auto"/>
-              <w:bottom w:val="none" w:sz="0" w:space="0" w:color="auto"/>
-              <w:right w:val="none" w:sz="0" w:space="0" w:color="auto"/>
-            </w:tcBorders>
             <w:shd w:val="clear" w:color="auto" w:fill="1A2E1E"/>
             <w:tcMar>
               <w:top w:w="120" w:type="dxa"/>
@@ -1043,12 +1030,6 @@
         <w:tc>
           <w:tcPr>
             <w:tcW w:w="775" w:type="dxa"/>
-            <w:tcBorders>
-              <w:top w:val="none" w:sz="0" w:space="0" w:color="auto"/>
-              <w:left w:val="none" w:sz="0" w:space="0" w:color="auto"/>
-              <w:bottom w:val="none" w:sz="0" w:space="0" w:color="auto"/>
-              <w:right w:val="none" w:sz="0" w:space="0" w:color="auto"/>
-            </w:tcBorders>
             <w:shd w:val="clear" w:color="auto" w:fill="1A2E1E"/>
             <w:tcMar>
               <w:top w:w="120" w:type="dxa"/>
@@ -1076,12 +1057,6 @@
         <w:tc>
           <w:tcPr>
             <w:tcW w:w="2200" w:type="dxa"/>
-            <w:tcBorders>
-              <w:top w:val="none" w:sz="0" w:space="0" w:color="auto"/>
-              <w:left w:val="none" w:sz="0" w:space="0" w:color="auto"/>
-              <w:bottom w:val="none" w:sz="0" w:space="0" w:color="auto"/>
-              <w:right w:val="none" w:sz="0" w:space="0" w:color="auto"/>
-            </w:tcBorders>
             <w:shd w:val="clear" w:color="auto" w:fill="1A2E1E"/>
             <w:tcMar>
               <w:top w:w="120" w:type="dxa"/>
@@ -1108,31 +1083,18 @@
         </w:tc>
       </w:tr>
       <w:tr>
-        <w:tblPrEx>
-          <w:tblCellMar>
-            <w:top w:w="0" w:type="dxa"/>
-            <w:bottom w:w="0" w:type="dxa"/>
-          </w:tblCellMar>
-        </w:tblPrEx>
         <w:trPr>
           <w:cantSplit/>
         </w:trPr>
         <w:tc>
           <w:tcPr>
             <w:tcW w:w="650" w:type="dxa"/>
-            <w:tcBorders>
-              <w:top w:val="none" w:sz="0" w:space="0" w:color="auto"/>
-              <w:left w:val="none" w:sz="0" w:space="0" w:color="auto"/>
-              <w:bottom w:val="none" w:sz="0" w:space="0" w:color="auto"/>
-              <w:right w:val="none" w:sz="0" w:space="0" w:color="auto"/>
-            </w:tcBorders>
             <w:tcMar>
               <w:top w:w="120" w:type="dxa"/>
               <w:left w:w="150" w:type="dxa"/>
               <w:bottom w:w="120" w:type="dxa"/>
               <w:right w:w="150" w:type="dxa"/>
             </w:tcMar>
-            <w:vAlign w:val="top"/>
           </w:tcPr>
           <w:p>
             <w:pPr>
@@ -1152,19 +1114,12 @@
         <w:tc>
           <w:tcPr>
             <w:tcW w:w="5900" w:type="dxa"/>
-            <w:tcBorders>
-              <w:top w:val="none" w:sz="0" w:space="0" w:color="auto"/>
-              <w:left w:val="none" w:sz="0" w:space="0" w:color="auto"/>
-              <w:bottom w:val="none" w:sz="0" w:space="0" w:color="auto"/>
-              <w:right w:val="none" w:sz="0" w:space="0" w:color="auto"/>
-            </w:tcBorders>
             <w:tcMar>
               <w:top w:w="120" w:type="dxa"/>
               <w:left w:w="150" w:type="dxa"/>
               <w:bottom w:w="120" w:type="dxa"/>
               <w:right w:w="150" w:type="dxa"/>
             </w:tcMar>
-            <w:vAlign w:val="top"/>
           </w:tcPr>
           <w:p>
             <w:pPr>
@@ -1181,19 +1136,12 @@
         <w:tc>
           <w:tcPr>
             <w:tcW w:w="775" w:type="dxa"/>
-            <w:tcBorders>
-              <w:top w:val="none" w:sz="0" w:space="0" w:color="auto"/>
-              <w:left w:val="none" w:sz="0" w:space="0" w:color="auto"/>
-              <w:bottom w:val="none" w:sz="0" w:space="0" w:color="auto"/>
-              <w:right w:val="none" w:sz="0" w:space="0" w:color="auto"/>
-            </w:tcBorders>
             <w:tcMar>
               <w:top w:w="120" w:type="dxa"/>
               <w:left w:w="150" w:type="dxa"/>
               <w:bottom w:w="120" w:type="dxa"/>
               <w:right w:w="150" w:type="dxa"/>
             </w:tcMar>
-            <w:vAlign w:val="top"/>
           </w:tcPr>
           <w:p>
             <w:pPr>
@@ -1211,19 +1159,12 @@
         <w:tc>
           <w:tcPr>
             <w:tcW w:w="2200" w:type="dxa"/>
-            <w:tcBorders>
-              <w:top w:val="none" w:sz="0" w:space="0" w:color="auto"/>
-              <w:left w:val="none" w:sz="0" w:space="0" w:color="auto"/>
-              <w:bottom w:val="none" w:sz="0" w:space="0" w:color="auto"/>
-              <w:right w:val="none" w:sz="0" w:space="0" w:color="auto"/>
-            </w:tcBorders>
             <w:tcMar>
               <w:top w:w="120" w:type="dxa"/>
               <w:left w:w="150" w:type="dxa"/>
               <w:bottom w:w="120" w:type="dxa"/>
               <w:right w:w="150" w:type="dxa"/>
             </w:tcMar>
-            <w:vAlign w:val="top"/>
           </w:tcPr>
           <w:p>
             <w:pPr>
@@ -1239,25 +1180,13 @@
           </w:p>
         </w:tc>
       </w:tr>
-      <w:tr w14:paraId="E1D63A471">
-        <w:tblPrEx>
-          <w:tblCellMar>
-            <w:top w:w="0" w:type="dxa"/>
-            <w:bottom w:w="0" w:type="dxa"/>
-          </w:tblCellMar>
-        </w:tblPrEx>
+      <w:tr>
         <w:trPr>
           <w:cantSplit/>
         </w:trPr>
         <w:tc>
           <w:tcPr>
             <w:tcW w:w="650" w:type="dxa"/>
-            <w:tcBorders>
-              <w:top w:val="none" w:sz="0" w:space="0" w:color="auto"/>
-              <w:left w:val="none" w:sz="0" w:space="0" w:color="auto"/>
-              <w:bottom w:val="none" w:sz="0" w:space="0" w:color="auto"/>
-              <w:right w:val="none" w:sz="0" w:space="0" w:color="auto"/>
-            </w:tcBorders>
             <w:shd w:val="clear" w:color="auto" w:fill="F6F8F6"/>
             <w:tcMar>
               <w:top w:w="120" w:type="dxa"/>
@@ -1265,9 +1194,8 @@
               <w:bottom w:w="120" w:type="dxa"/>
               <w:right w:w="150" w:type="dxa"/>
             </w:tcMar>
-            <w:vAlign w:val="top"/>
           </w:tcPr>
-          <w:p w14:paraId="E0358BD82">
+          <w:p>
             <w:pPr>
               <w:spacing w:before="60" w:after="60"/>
               <w:jc w:val="center"/>
@@ -1285,12 +1213,6 @@
         <w:tc>
           <w:tcPr>
             <w:tcW w:w="5900" w:type="dxa"/>
-            <w:tcBorders>
-              <w:top w:val="none" w:sz="0" w:space="0" w:color="auto"/>
-              <w:left w:val="none" w:sz="0" w:space="0" w:color="auto"/>
-              <w:bottom w:val="none" w:sz="0" w:space="0" w:color="auto"/>
-              <w:right w:val="none" w:sz="0" w:space="0" w:color="auto"/>
-            </w:tcBorders>
             <w:shd w:val="clear" w:color="auto" w:fill="F6F8F6"/>
             <w:tcMar>
               <w:top w:w="120" w:type="dxa"/>
@@ -1298,9 +1220,8 @@
               <w:bottom w:w="120" w:type="dxa"/>
               <w:right w:w="150" w:type="dxa"/>
             </w:tcMar>
-            <w:vAlign w:val="top"/>
           </w:tcPr>
-          <w:p w14:paraId="E7E6AC6EA">
+          <w:p>
             <w:pPr>
               <w:spacing w:before="60" w:after="60"/>
             </w:pPr>
@@ -1315,12 +1236,6 @@
         <w:tc>
           <w:tcPr>
             <w:tcW w:w="775" w:type="dxa"/>
-            <w:tcBorders>
-              <w:top w:val="none" w:sz="0" w:space="0" w:color="auto"/>
-              <w:left w:val="none" w:sz="0" w:space="0" w:color="auto"/>
-              <w:bottom w:val="none" w:sz="0" w:space="0" w:color="auto"/>
-              <w:right w:val="none" w:sz="0" w:space="0" w:color="auto"/>
-            </w:tcBorders>
             <w:shd w:val="clear" w:color="auto" w:fill="F6F8F6"/>
             <w:tcMar>
               <w:top w:w="120" w:type="dxa"/>
@@ -1328,9 +1243,8 @@
               <w:bottom w:w="120" w:type="dxa"/>
               <w:right w:w="150" w:type="dxa"/>
             </w:tcMar>
-            <w:vAlign w:val="top"/>
           </w:tcPr>
-          <w:p w14:paraId="E615E0308">
+          <w:p>
             <w:pPr>
               <w:spacing w:before="60" w:after="60"/>
               <w:jc w:val="center"/>
@@ -1346,12 +1260,6 @@
         <w:tc>
           <w:tcPr>
             <w:tcW w:w="2200" w:type="dxa"/>
-            <w:tcBorders>
-              <w:top w:val="none" w:sz="0" w:space="0" w:color="auto"/>
-              <w:left w:val="none" w:sz="0" w:space="0" w:color="auto"/>
-              <w:bottom w:val="none" w:sz="0" w:space="0" w:color="auto"/>
-              <w:right w:val="none" w:sz="0" w:space="0" w:color="auto"/>
-            </w:tcBorders>
             <w:shd w:val="clear" w:color="auto" w:fill="F6F8F6"/>
             <w:tcMar>
               <w:top w:w="120" w:type="dxa"/>
@@ -1359,9 +1267,8 @@
               <w:bottom w:w="120" w:type="dxa"/>
               <w:right w:w="150" w:type="dxa"/>
             </w:tcMar>
-            <w:vAlign w:val="top"/>
           </w:tcPr>
-          <w:p w14:paraId="E6EA725D7">
+          <w:p>
             <w:pPr>
               <w:spacing w:before="60" w:after="60"/>
               <w:jc w:val="right"/>
@@ -1376,12 +1283,6 @@
         </w:tc>
       </w:tr>
       <w:tr>
-        <w:tblPrEx>
-          <w:tblCellMar>
-            <w:top w:w="0" w:type="dxa"/>
-            <w:bottom w:w="0" w:type="dxa"/>
-          </w:tblCellMar>
-        </w:tblPrEx>
         <w:trPr>
           <w:cantSplit/>
         </w:trPr>
@@ -1391,9 +1292,6 @@
             <w:gridSpan w:val="3"/>
             <w:tcBorders>
               <w:top w:val="single" w:sz="6" w:space="0" w:color="DADCDA"/>
-              <w:left w:val="none" w:sz="0" w:space="0" w:color="auto"/>
-              <w:bottom w:val="none" w:sz="0" w:space="0" w:color="auto"/>
-              <w:right w:val="none" w:sz="0" w:space="0" w:color="auto"/>
             </w:tcBorders>
             <w:tcMar>
               <w:top w:w="120" w:type="dxa"/>
@@ -1423,9 +1321,6 @@
             <w:tcW w:w="1428" w:type="dxa"/>
             <w:tcBorders>
               <w:top w:val="single" w:sz="6" w:space="0" w:color="DADCDA"/>
-              <w:left w:val="none" w:sz="0" w:space="0" w:color="auto"/>
-              <w:bottom w:val="none" w:sz="0" w:space="0" w:color="auto"/>
-              <w:right w:val="none" w:sz="0" w:space="0" w:color="auto"/>
             </w:tcBorders>
             <w:tcMar>
               <w:top w:w="120" w:type="dxa"/>
@@ -1469,7 +1364,6 @@
     <w:p>
       <w:pPr>
         <w:pStyle w:val="TitreTableauBTH"/>
-        <w:keepNext/>
         <w:keepLines/>
         <w:widowControl w:val="0"/>
         <w:spacing w:before="454"/>
@@ -1487,14 +1381,6 @@
     <w:tbl>
       <w:tblPr>
         <w:tblW w:w="9525" w:type="dxa"/>
-        <w:tblBorders>
-          <w:top w:val="none" w:sz="0" w:space="0" w:color="auto"/>
-          <w:left w:val="none" w:sz="0" w:space="0" w:color="auto"/>
-          <w:bottom w:val="none" w:sz="0" w:space="0" w:color="auto"/>
-          <w:right w:val="none" w:sz="0" w:space="0" w:color="auto"/>
-          <w:insideH w:val="none" w:sz="0" w:space="0" w:color="auto"/>
-          <w:insideV w:val="none" w:sz="0" w:space="0" w:color="auto"/>
-        </w:tblBorders>
         <w:tblCellMar>
           <w:left w:w="10" w:type="dxa"/>
           <w:right w:w="10" w:type="dxa"/>
@@ -1502,18 +1388,12 @@
         <w:tblLook w:val="04A0" w:firstRow="1" w:lastRow="0" w:firstColumn="1" w:lastColumn="0" w:noHBand="0" w:noVBand="1"/>
       </w:tblPr>
       <w:tblGrid>
-        <w:gridCol w:w="650"/>
-        <w:gridCol w:w="5900"/>
-        <w:gridCol w:w="775"/>
-        <w:gridCol w:w="2200"/>
+        <w:gridCol w:w="3319"/>
+        <w:gridCol w:w="1651"/>
+        <w:gridCol w:w="1163"/>
+        <w:gridCol w:w="3392"/>
       </w:tblGrid>
       <w:tr>
-        <w:tblPrEx>
-          <w:tblCellMar>
-            <w:top w:w="0" w:type="dxa"/>
-            <w:bottom w:w="0" w:type="dxa"/>
-          </w:tblCellMar>
-        </w:tblPrEx>
         <w:trPr>
           <w:cantSplit/>
           <w:tblHeader/>
@@ -1521,12 +1401,6 @@
         <w:tc>
           <w:tcPr>
             <w:tcW w:w="650" w:type="dxa"/>
-            <w:tcBorders>
-              <w:top w:val="none" w:sz="0" w:space="0" w:color="auto"/>
-              <w:left w:val="none" w:sz="0" w:space="0" w:color="auto"/>
-              <w:bottom w:val="none" w:sz="0" w:space="0" w:color="auto"/>
-              <w:right w:val="none" w:sz="0" w:space="0" w:color="auto"/>
-            </w:tcBorders>
             <w:shd w:val="clear" w:color="auto" w:fill="1A2E1E"/>
             <w:tcMar>
               <w:top w:w="120" w:type="dxa"/>
@@ -1555,12 +1429,6 @@
         <w:tc>
           <w:tcPr>
             <w:tcW w:w="5900" w:type="dxa"/>
-            <w:tcBorders>
-              <w:top w:val="none" w:sz="0" w:space="0" w:color="auto"/>
-              <w:left w:val="none" w:sz="0" w:space="0" w:color="auto"/>
-              <w:bottom w:val="none" w:sz="0" w:space="0" w:color="auto"/>
-              <w:right w:val="none" w:sz="0" w:space="0" w:color="auto"/>
-            </w:tcBorders>
             <w:shd w:val="clear" w:color="auto" w:fill="1A2E1E"/>
             <w:tcMar>
               <w:top w:w="120" w:type="dxa"/>
@@ -1588,12 +1456,6 @@
         <w:tc>
           <w:tcPr>
             <w:tcW w:w="775" w:type="dxa"/>
-            <w:tcBorders>
-              <w:top w:val="none" w:sz="0" w:space="0" w:color="auto"/>
-              <w:left w:val="none" w:sz="0" w:space="0" w:color="auto"/>
-              <w:bottom w:val="none" w:sz="0" w:space="0" w:color="auto"/>
-              <w:right w:val="none" w:sz="0" w:space="0" w:color="auto"/>
-            </w:tcBorders>
             <w:shd w:val="clear" w:color="auto" w:fill="1A2E1E"/>
             <w:tcMar>
               <w:top w:w="120" w:type="dxa"/>
@@ -1622,12 +1484,6 @@
         <w:tc>
           <w:tcPr>
             <w:tcW w:w="2200" w:type="dxa"/>
-            <w:tcBorders>
-              <w:top w:val="none" w:sz="0" w:space="0" w:color="auto"/>
-              <w:left w:val="none" w:sz="0" w:space="0" w:color="auto"/>
-              <w:bottom w:val="none" w:sz="0" w:space="0" w:color="auto"/>
-              <w:right w:val="none" w:sz="0" w:space="0" w:color="auto"/>
-            </w:tcBorders>
             <w:shd w:val="clear" w:color="auto" w:fill="1A2E1E"/>
             <w:tcMar>
               <w:top w:w="120" w:type="dxa"/>
@@ -1655,31 +1511,18 @@
         </w:tc>
       </w:tr>
       <w:tr>
-        <w:tblPrEx>
-          <w:tblCellMar>
-            <w:top w:w="0" w:type="dxa"/>
-            <w:bottom w:w="0" w:type="dxa"/>
-          </w:tblCellMar>
-        </w:tblPrEx>
         <w:trPr>
           <w:cantSplit/>
         </w:trPr>
         <w:tc>
           <w:tcPr>
             <w:tcW w:w="650" w:type="dxa"/>
-            <w:tcBorders>
-              <w:top w:val="none" w:sz="0" w:space="0" w:color="auto"/>
-              <w:left w:val="none" w:sz="0" w:space="0" w:color="auto"/>
-              <w:bottom w:val="none" w:sz="0" w:space="0" w:color="auto"/>
-              <w:right w:val="none" w:sz="0" w:space="0" w:color="auto"/>
-            </w:tcBorders>
             <w:tcMar>
               <w:top w:w="120" w:type="dxa"/>
               <w:left w:w="150" w:type="dxa"/>
               <w:bottom w:w="120" w:type="dxa"/>
               <w:right w:w="150" w:type="dxa"/>
             </w:tcMar>
-            <w:vAlign w:val="top"/>
           </w:tcPr>
           <w:p>
             <w:pPr>
@@ -1700,19 +1543,12 @@
         <w:tc>
           <w:tcPr>
             <w:tcW w:w="5900" w:type="dxa"/>
-            <w:tcBorders>
-              <w:top w:val="none" w:sz="0" w:space="0" w:color="auto"/>
-              <w:left w:val="none" w:sz="0" w:space="0" w:color="auto"/>
-              <w:bottom w:val="none" w:sz="0" w:space="0" w:color="auto"/>
-              <w:right w:val="none" w:sz="0" w:space="0" w:color="auto"/>
-            </w:tcBorders>
             <w:tcMar>
               <w:top w:w="120" w:type="dxa"/>
               <w:left w:w="150" w:type="dxa"/>
               <w:bottom w:w="120" w:type="dxa"/>
               <w:right w:w="150" w:type="dxa"/>
             </w:tcMar>
-            <w:vAlign w:val="top"/>
           </w:tcPr>
           <w:p>
             <w:pPr>
@@ -1730,19 +1566,12 @@
         <w:tc>
           <w:tcPr>
             <w:tcW w:w="775" w:type="dxa"/>
-            <w:tcBorders>
-              <w:top w:val="none" w:sz="0" w:space="0" w:color="auto"/>
-              <w:left w:val="none" w:sz="0" w:space="0" w:color="auto"/>
-              <w:bottom w:val="none" w:sz="0" w:space="0" w:color="auto"/>
-              <w:right w:val="none" w:sz="0" w:space="0" w:color="auto"/>
-            </w:tcBorders>
             <w:tcMar>
               <w:top w:w="120" w:type="dxa"/>
               <w:left w:w="150" w:type="dxa"/>
               <w:bottom w:w="120" w:type="dxa"/>
               <w:right w:w="150" w:type="dxa"/>
             </w:tcMar>
-            <w:vAlign w:val="top"/>
           </w:tcPr>
           <w:p>
             <w:pPr>
@@ -1761,19 +1590,12 @@
         <w:tc>
           <w:tcPr>
             <w:tcW w:w="2200" w:type="dxa"/>
-            <w:tcBorders>
-              <w:top w:val="none" w:sz="0" w:space="0" w:color="auto"/>
-              <w:left w:val="none" w:sz="0" w:space="0" w:color="auto"/>
-              <w:bottom w:val="none" w:sz="0" w:space="0" w:color="auto"/>
-              <w:right w:val="none" w:sz="0" w:space="0" w:color="auto"/>
-            </w:tcBorders>
             <w:tcMar>
               <w:top w:w="120" w:type="dxa"/>
               <w:left w:w="150" w:type="dxa"/>
               <w:bottom w:w="120" w:type="dxa"/>
               <w:right w:w="150" w:type="dxa"/>
             </w:tcMar>
-            <w:vAlign w:val="top"/>
           </w:tcPr>
           <w:p>
             <w:pPr>
@@ -1790,25 +1612,13 @@
           </w:p>
         </w:tc>
       </w:tr>
-      <w:tr w14:paraId="R3B056DBD">
-        <w:tblPrEx>
-          <w:tblCellMar>
-            <w:top w:w="0" w:type="dxa"/>
-            <w:bottom w:w="0" w:type="dxa"/>
-          </w:tblCellMar>
-        </w:tblPrEx>
+      <w:tr>
         <w:trPr>
           <w:cantSplit/>
         </w:trPr>
         <w:tc>
           <w:tcPr>
             <w:tcW w:w="650" w:type="dxa"/>
-            <w:tcBorders>
-              <w:top w:val="none" w:sz="0" w:space="0" w:color="auto"/>
-              <w:left w:val="none" w:sz="0" w:space="0" w:color="auto"/>
-              <w:bottom w:val="none" w:sz="0" w:space="0" w:color="auto"/>
-              <w:right w:val="none" w:sz="0" w:space="0" w:color="auto"/>
-            </w:tcBorders>
             <w:shd w:val="clear" w:color="auto" w:fill="F6F8F6"/>
             <w:tcMar>
               <w:top w:w="120" w:type="dxa"/>
@@ -1816,9 +1626,8 @@
               <w:bottom w:w="120" w:type="dxa"/>
               <w:right w:w="150" w:type="dxa"/>
             </w:tcMar>
-            <w:vAlign w:val="top"/>
           </w:tcPr>
-          <w:p w14:paraId="R56F10528">
+          <w:p>
             <w:pPr>
               <w:keepNext/>
               <w:spacing w:before="60" w:after="60"/>
@@ -1837,12 +1646,6 @@
         <w:tc>
           <w:tcPr>
             <w:tcW w:w="5900" w:type="dxa"/>
-            <w:tcBorders>
-              <w:top w:val="none" w:sz="0" w:space="0" w:color="auto"/>
-              <w:left w:val="none" w:sz="0" w:space="0" w:color="auto"/>
-              <w:bottom w:val="none" w:sz="0" w:space="0" w:color="auto"/>
-              <w:right w:val="none" w:sz="0" w:space="0" w:color="auto"/>
-            </w:tcBorders>
             <w:shd w:val="clear" w:color="auto" w:fill="F6F8F6"/>
             <w:tcMar>
               <w:top w:w="120" w:type="dxa"/>
@@ -1850,9 +1653,8 @@
               <w:bottom w:w="120" w:type="dxa"/>
               <w:right w:w="150" w:type="dxa"/>
             </w:tcMar>
-            <w:vAlign w:val="top"/>
           </w:tcPr>
-          <w:p w14:paraId="R775FBF52">
+          <w:p>
             <w:pPr>
               <w:keepNext/>
               <w:spacing w:before="60" w:after="60"/>
@@ -1868,12 +1670,6 @@
         <w:tc>
           <w:tcPr>
             <w:tcW w:w="775" w:type="dxa"/>
-            <w:tcBorders>
-              <w:top w:val="none" w:sz="0" w:space="0" w:color="auto"/>
-              <w:left w:val="none" w:sz="0" w:space="0" w:color="auto"/>
-              <w:bottom w:val="none" w:sz="0" w:space="0" w:color="auto"/>
-              <w:right w:val="none" w:sz="0" w:space="0" w:color="auto"/>
-            </w:tcBorders>
             <w:shd w:val="clear" w:color="auto" w:fill="F6F8F6"/>
             <w:tcMar>
               <w:top w:w="120" w:type="dxa"/>
@@ -1881,9 +1677,8 @@
               <w:bottom w:w="120" w:type="dxa"/>
               <w:right w:w="150" w:type="dxa"/>
             </w:tcMar>
-            <w:vAlign w:val="top"/>
           </w:tcPr>
-          <w:p w14:paraId="R2F3BAD4B">
+          <w:p>
             <w:pPr>
               <w:keepNext/>
               <w:spacing w:before="60" w:after="60"/>
@@ -1900,12 +1695,6 @@
         <w:tc>
           <w:tcPr>
             <w:tcW w:w="2200" w:type="dxa"/>
-            <w:tcBorders>
-              <w:top w:val="none" w:sz="0" w:space="0" w:color="auto"/>
-              <w:left w:val="none" w:sz="0" w:space="0" w:color="auto"/>
-              <w:bottom w:val="none" w:sz="0" w:space="0" w:color="auto"/>
-              <w:right w:val="none" w:sz="0" w:space="0" w:color="auto"/>
-            </w:tcBorders>
             <w:shd w:val="clear" w:color="auto" w:fill="F6F8F6"/>
             <w:tcMar>
               <w:top w:w="120" w:type="dxa"/>
@@ -1913,17 +1702,20 @@
               <w:bottom w:w="120" w:type="dxa"/>
               <w:right w:w="150" w:type="dxa"/>
             </w:tcMar>
-            <w:vAlign w:val="top"/>
           </w:tcPr>
-          <w:p w14:paraId="R1F73DD81">
+          <w:p>
             <w:pPr>
               <w:keepNext/>
               <w:spacing w:before="60" w:after="60"/>
               <w:jc w:val="right"/>
+              <w:rPr>
+                <w:lang w:val="fr-CA"/>
+              </w:rPr>
             </w:pPr>
             <w:r>
               <w:rPr>
                 <w:color w:val="2B2B2B"/>
+                <w:lang w:val="fr-CA"/>
               </w:rPr>
               <w:t>{prix_formate}{/pair}{/recap_lignes}</w:t>
             </w:r>
@@ -1931,12 +1723,6 @@
         </w:tc>
       </w:tr>
       <w:tr>
-        <w:tblPrEx>
-          <w:tblCellMar>
-            <w:top w:w="0" w:type="dxa"/>
-            <w:bottom w:w="0" w:type="dxa"/>
-          </w:tblCellMar>
-        </w:tblPrEx>
         <w:trPr>
           <w:cantSplit/>
         </w:trPr>
@@ -1946,9 +1732,6 @@
             <w:gridSpan w:val="3"/>
             <w:tcBorders>
               <w:top w:val="single" w:sz="6" w:space="0" w:color="DADCDA"/>
-              <w:left w:val="none" w:sz="0" w:space="0" w:color="auto"/>
-              <w:bottom w:val="none" w:sz="0" w:space="0" w:color="auto"/>
-              <w:right w:val="none" w:sz="0" w:space="0" w:color="auto"/>
             </w:tcBorders>
             <w:tcMar>
               <w:top w:w="120" w:type="dxa"/>
@@ -1979,9 +1762,6 @@
             <w:tcW w:w="1428" w:type="dxa"/>
             <w:tcBorders>
               <w:top w:val="single" w:sz="6" w:space="0" w:color="DADCDA"/>
-              <w:left w:val="none" w:sz="0" w:space="0" w:color="auto"/>
-              <w:bottom w:val="none" w:sz="0" w:space="0" w:color="auto"/>
-              <w:right w:val="none" w:sz="0" w:space="0" w:color="auto"/>
             </w:tcBorders>
             <w:tcMar>
               <w:top w:w="120" w:type="dxa"/>
@@ -2009,12 +1789,6 @@
         </w:tc>
       </w:tr>
       <w:tr>
-        <w:tblPrEx>
-          <w:tblCellMar>
-            <w:top w:w="0" w:type="dxa"/>
-            <w:bottom w:w="0" w:type="dxa"/>
-          </w:tblCellMar>
-        </w:tblPrEx>
         <w:trPr>
           <w:cantSplit/>
         </w:trPr>
@@ -2022,12 +1796,6 @@
           <w:tcPr>
             <w:tcW w:w="8097" w:type="dxa"/>
             <w:gridSpan w:val="3"/>
-            <w:tcBorders>
-              <w:top w:val="none" w:sz="0" w:space="0" w:color="auto"/>
-              <w:left w:val="none" w:sz="0" w:space="0" w:color="auto"/>
-              <w:bottom w:val="none" w:sz="0" w:space="0" w:color="auto"/>
-              <w:right w:val="none" w:sz="0" w:space="0" w:color="auto"/>
-            </w:tcBorders>
             <w:tcMar>
               <w:top w:w="100" w:type="dxa"/>
               <w:left w:w="150" w:type="dxa"/>
@@ -2053,12 +1821,6 @@
         <w:tc>
           <w:tcPr>
             <w:tcW w:w="1428" w:type="dxa"/>
-            <w:tcBorders>
-              <w:top w:val="none" w:sz="0" w:space="0" w:color="auto"/>
-              <w:left w:val="none" w:sz="0" w:space="0" w:color="auto"/>
-              <w:bottom w:val="none" w:sz="0" w:space="0" w:color="auto"/>
-              <w:right w:val="none" w:sz="0" w:space="0" w:color="auto"/>
-            </w:tcBorders>
             <w:tcMar>
               <w:top w:w="100" w:type="dxa"/>
               <w:left w:w="150" w:type="dxa"/>
@@ -2085,12 +1847,6 @@
         </w:tc>
       </w:tr>
       <w:tr>
-        <w:tblPrEx>
-          <w:tblCellMar>
-            <w:top w:w="0" w:type="dxa"/>
-            <w:bottom w:w="0" w:type="dxa"/>
-          </w:tblCellMar>
-        </w:tblPrEx>
         <w:trPr>
           <w:cantSplit/>
         </w:trPr>
@@ -2098,12 +1854,6 @@
           <w:tcPr>
             <w:tcW w:w="8097" w:type="dxa"/>
             <w:gridSpan w:val="3"/>
-            <w:tcBorders>
-              <w:top w:val="none" w:sz="0" w:space="0" w:color="auto"/>
-              <w:left w:val="none" w:sz="0" w:space="0" w:color="auto"/>
-              <w:bottom w:val="none" w:sz="0" w:space="0" w:color="auto"/>
-              <w:right w:val="none" w:sz="0" w:space="0" w:color="auto"/>
-            </w:tcBorders>
             <w:shd w:val="clear" w:color="auto" w:fill="C9A96E"/>
             <w:tcMar>
               <w:top w:w="130" w:type="dxa"/>
@@ -2130,12 +1880,6 @@
         <w:tc>
           <w:tcPr>
             <w:tcW w:w="1428" w:type="dxa"/>
-            <w:tcBorders>
-              <w:top w:val="none" w:sz="0" w:space="0" w:color="auto"/>
-              <w:left w:val="none" w:sz="0" w:space="0" w:color="auto"/>
-              <w:bottom w:val="none" w:sz="0" w:space="0" w:color="auto"/>
-              <w:right w:val="none" w:sz="0" w:space="0" w:color="auto"/>
-            </w:tcBorders>
             <w:shd w:val="clear" w:color="auto" w:fill="C9A96E"/>
             <w:tcMar>
               <w:top w:w="130" w:type="dxa"/>
@@ -2192,12 +1936,6 @@
         <w:gridCol w:w="9525"/>
       </w:tblGrid>
       <w:tr>
-        <w:tblPrEx>
-          <w:tblCellMar>
-            <w:top w:w="0" w:type="dxa"/>
-            <w:bottom w:w="0" w:type="dxa"/>
-          </w:tblCellMar>
-        </w:tblPrEx>
         <w:trPr>
           <w:cantSplit/>
         </w:trPr>
@@ -2644,7 +2382,6 @@
     <w:tbl>
       <w:tblPr>
         <w:tblW w:w="9525" w:type="dxa"/>
-        <w:jc w:val="left"/>
         <w:tblBorders>
           <w:top w:val="single" w:sz="4" w:space="0" w:color="auto"/>
           <w:left w:val="single" w:sz="4" w:space="0" w:color="auto"/>
@@ -2665,12 +2402,6 @@
         <w:gridCol w:w="3800"/>
       </w:tblGrid>
       <w:tr>
-        <w:tblPrEx>
-          <w:tblCellMar>
-            <w:top w:w="0" w:type="dxa"/>
-            <w:bottom w:w="0" w:type="dxa"/>
-          </w:tblCellMar>
-        </w:tblPrEx>
         <w:tc>
           <w:tcPr>
             <w:tcW w:w="3800" w:type="dxa"/>
@@ -2791,7 +2522,7 @@
           </w:tcPr>
           <w:p>
             <w:pPr>
-              <w:spacing w:after="0" w:line="240" w:lineRule="auto"/>
+              <w:spacing w:line="240" w:lineRule="auto"/>
             </w:pPr>
           </w:p>
         </w:tc>
@@ -3025,16 +2756,6 @@
 </w:ftr>
 </file>
 
-<file path=word/footer2.xml><?xml version="1.0" encoding="utf-8"?>
-<w:ftr xmlns:wpc="http://schemas.microsoft.com/office/word/2010/wordprocessingCanvas" xmlns:mc="http://schemas.openxmlformats.org/markup-compatibility/2006" xmlns:o="urn:schemas-microsoft-com:office:office" xmlns:r="http://schemas.openxmlformats.org/officeDocument/2006/relationships" xmlns:m="http://schemas.openxmlformats.org/officeDocument/2006/math" xmlns:v="urn:schemas-microsoft-com:vml" xmlns:wp14="http://schemas.microsoft.com/office/word/2010/wordprocessingDrawing" xmlns:wp="http://schemas.openxmlformats.org/drawingml/2006/wordprocessingDrawing" xmlns:w10="urn:schemas-microsoft-com:office:word" xmlns:w="http://schemas.openxmlformats.org/wordprocessingml/2006/main" xmlns:w14="http://schemas.microsoft.com/office/word/2010/wordml" xmlns:w15="http://schemas.microsoft.com/office/word/2012/wordml" xmlns:w16cex="http://schemas.microsoft.com/office/word/2018/wordml/cex" xmlns:w16cid="http://schemas.microsoft.com/office/word/2016/wordml/cid" xmlns:w16="http://schemas.microsoft.com/office/word/2018/wordml" xmlns:w16sdtdh="http://schemas.microsoft.com/office/word/2020/wordml/sdtdatahash" xmlns:w16se="http://schemas.microsoft.com/office/word/2015/wordml/symex" xmlns:wpg="http://schemas.microsoft.com/office/word/2010/wordprocessingGroup" xmlns:wpi="http://schemas.microsoft.com/office/word/2010/wordprocessingInk" xmlns:wne="http://schemas.microsoft.com/office/word/2006/wordml" xmlns:wps="http://schemas.microsoft.com/office/word/2010/wordprocessingShape" mc:Ignorable="w14 w15 w16se w16cid w16 w16cex w16sdtdh wp14">
-  <w:p>
-    <w:pPr>
-      <w:pStyle w:val="Footer"/>
-    </w:pPr>
-  </w:p>
-</w:ftr>
-</file>
-
 <file path=word/footnotes.xml><?xml version="1.0" encoding="utf-8"?>
 <w:footnotes xmlns:wpc="http://schemas.microsoft.com/office/word/2010/wordprocessingCanvas" xmlns:cx="http://schemas.microsoft.com/office/drawing/2014/chartex" xmlns:cx1="http://schemas.microsoft.com/office/drawing/2015/9/8/chartex" xmlns:cx2="http://schemas.microsoft.com/office/drawing/2015/10/21/chartex" xmlns:cx3="http://schemas.microsoft.com/office/drawing/2016/5/9/chartex" xmlns:cx4="http://schemas.microsoft.com/office/drawing/2016/5/10/chartex" xmlns:cx5="http://schemas.microsoft.com/office/drawing/2016/5/11/chartex" xmlns:cx6="http://schemas.microsoft.com/office/drawing/2016/5/12/chartex" xmlns:cx7="http://schemas.microsoft.com/office/drawing/2016/5/13/chartex" xmlns:cx8="http://schemas.microsoft.com/office/drawing/2016/5/14/chartex" xmlns:mc="http://schemas.openxmlformats.org/markup-compatibility/2006" xmlns:aink="http://schemas.microsoft.com/office/drawing/2016/ink" xmlns:am3d="http://schemas.microsoft.com/office/drawing/2017/model3d" xmlns:o="urn:schemas-microsoft-com:office:office" xmlns:oel="http://schemas.microsoft.com/office/2019/extlst" xmlns:r="http://schemas.openxmlformats.org/officeDocument/2006/relationships" xmlns:m="http://schemas.openxmlformats.org/officeDocument/2006/math" xmlns:v="urn:schemas-microsoft-com:vml" xmlns:wp14="http://schemas.microsoft.com/office/word/2010/wordprocessingDrawing" xmlns:wp="http://schemas.openxmlformats.org/drawingml/2006/wordprocessingDrawing" xmlns:w10="urn:schemas-microsoft-com:office:word" xmlns:w="http://schemas.openxmlformats.org/wordprocessingml/2006/main" xmlns:w14="http://schemas.microsoft.com/office/word/2010/wordml" xmlns:w15="http://schemas.microsoft.com/office/word/2012/wordml" xmlns:w16cex="http://schemas.microsoft.com/office/word/2018/wordml/cex" xmlns:w16cid="http://schemas.microsoft.com/office/word/2016/wordml/cid" xmlns:w16="http://schemas.microsoft.com/office/word/2018/wordml" xmlns:w16sdtdh="http://schemas.microsoft.com/office/word/2020/wordml/sdtdatahash" xmlns:w16se="http://schemas.microsoft.com/office/word/2015/wordml/symex" xmlns:wpg="http://schemas.microsoft.com/office/word/2010/wordprocessingGroup" xmlns:wpi="http://schemas.microsoft.com/office/word/2010/wordprocessingInk" xmlns:wne="http://schemas.microsoft.com/office/word/2006/wordml" xmlns:wps="http://schemas.microsoft.com/office/word/2010/wordprocessingShape" mc:Ignorable="w14 w15 w16se w16cid w16 w16cex w16sdtdh wp14">
   <w:footnote w:type="separator" w:id="-1">
@@ -3076,10 +2797,10 @@
         <w:noProof/>
       </w:rPr>
       <w:drawing>
-        <wp:inline distT="0" distB="0" distL="0" distR="0" wp14:anchorId="0B64F430" wp14:editId="16E01E56">
-          <wp:extent cx="1520190" cy="434340"/>
-          <wp:effectExtent l="0" t="0" r="3810" b="3810"/>
-          <wp:docPr id="1" name="Picture 1"/>
+        <wp:inline distT="0" distB="0" distL="0" distR="0" wp14:anchorId="6423F046" wp14:editId="24F7D092">
+          <wp:extent cx="1283970" cy="360964"/>
+          <wp:effectExtent l="0" t="0" r="0" b="0"/>
+          <wp:docPr id="3" name="Graphic 3"/>
           <wp:cNvGraphicFramePr>
             <a:graphicFrameLocks xmlns:a="http://schemas.openxmlformats.org/drawingml/2006/main" noChangeAspect="1"/>
           </wp:cNvGraphicFramePr>
@@ -3087,22 +2808,25 @@
             <a:graphicData uri="http://schemas.openxmlformats.org/drawingml/2006/picture">
               <pic:pic xmlns:pic="http://schemas.openxmlformats.org/drawingml/2006/picture">
                 <pic:nvPicPr>
-                  <pic:cNvPr id="0" name=""/>
-                  <pic:cNvPicPr>
-                    <a:picLocks noChangeAspect="1" noChangeArrowheads="1"/>
-                  </pic:cNvPicPr>
+                  <pic:cNvPr id="3" name="Graphic 3"/>
+                  <pic:cNvPicPr/>
                 </pic:nvPicPr>
                 <pic:blipFill>
-                  <a:blip r:embed="rId1"/>
-                  <a:srcRect/>
+                  <a:blip r:embed="rId1">
+                    <a:extLst>
+                      <a:ext uri="{96DAC541-7B7A-43D3-8B79-37D633B846F1}">
+                        <asvg:svgBlip xmlns:asvg="http://schemas.microsoft.com/office/drawing/2016/SVG/main" r:embed="rId2"/>
+                      </a:ext>
+                    </a:extLst>
+                  </a:blip>
                   <a:stretch>
                     <a:fillRect/>
                   </a:stretch>
                 </pic:blipFill>
-                <pic:spPr bwMode="auto">
+                <pic:spPr>
                   <a:xfrm>
                     <a:off x="0" y="0"/>
-                    <a:ext cx="1522532" cy="435009"/>
+                    <a:ext cx="1340896" cy="376968"/>
                   </a:xfrm>
                   <a:prstGeom prst="rect">
                     <a:avLst/>
@@ -3114,16 +2838,6 @@
         </wp:inline>
       </w:drawing>
     </w:r>
-  </w:p>
-</w:hdr>
-</file>
-
-<file path=word/header2.xml><?xml version="1.0" encoding="utf-8"?>
-<w:hdr xmlns:wpc="http://schemas.microsoft.com/office/word/2010/wordprocessingCanvas" xmlns:mc="http://schemas.openxmlformats.org/markup-compatibility/2006" xmlns:o="urn:schemas-microsoft-com:office:office" xmlns:r="http://schemas.openxmlformats.org/officeDocument/2006/relationships" xmlns:m="http://schemas.openxmlformats.org/officeDocument/2006/math" xmlns:v="urn:schemas-microsoft-com:vml" xmlns:wp14="http://schemas.microsoft.com/office/word/2010/wordprocessingDrawing" xmlns:wp="http://schemas.openxmlformats.org/drawingml/2006/wordprocessingDrawing" xmlns:w10="urn:schemas-microsoft-com:office:word" xmlns:w="http://schemas.openxmlformats.org/wordprocessingml/2006/main" xmlns:w14="http://schemas.microsoft.com/office/word/2010/wordml" xmlns:w15="http://schemas.microsoft.com/office/word/2012/wordml" xmlns:w16cex="http://schemas.microsoft.com/office/word/2018/wordml/cex" xmlns:w16cid="http://schemas.microsoft.com/office/word/2016/wordml/cid" xmlns:w16="http://schemas.microsoft.com/office/word/2018/wordml" xmlns:w16sdtdh="http://schemas.microsoft.com/office/word/2020/wordml/sdtdatahash" xmlns:w16se="http://schemas.microsoft.com/office/word/2015/wordml/symex" xmlns:wpg="http://schemas.microsoft.com/office/word/2010/wordprocessingGroup" xmlns:wpi="http://schemas.microsoft.com/office/word/2010/wordprocessingInk" xmlns:wne="http://schemas.microsoft.com/office/word/2006/wordml" xmlns:wps="http://schemas.microsoft.com/office/word/2010/wordprocessingShape" mc:Ignorable="w14 w15 w16se w16cid w16 w16cex w16sdtdh wp14">
-  <w:p>
-    <w:pPr>
-      <w:pStyle w:val="Header"/>
-    </w:pPr>
   </w:p>
 </w:hdr>
 </file>

</xml_diff>